<commit_message>
Update preprint and paper information
</commit_message>
<xml_diff>
--- a/2026/papers/2026_cinc_template.docx
+++ b/2026/papers/2026_cinc_template.docx
@@ -1,28 +1,31 @@
 
 <file path=word/document.xml><?xml version="1.0" encoding="utf-8"?>
-<w:document xmlns:o="urn:schemas-microsoft-com:office:office" xmlns:r="http://schemas.openxmlformats.org/officeDocument/2006/relationships" xmlns:v="urn:schemas-microsoft-com:vml" xmlns:w="http://schemas.openxmlformats.org/wordprocessingml/2006/main" xmlns:w10="urn:schemas-microsoft-com:office:word" xmlns:wp="http://schemas.openxmlformats.org/drawingml/2006/wordprocessingDrawing" xmlns:pic="http://schemas.openxmlformats.org/drawingml/2006/picture" xmlns:wps="http://schemas.microsoft.com/office/word/2010/wordprocessingShape" xmlns:wpg="http://schemas.microsoft.com/office/word/2010/wordprocessingGroup" xmlns:mc="http://schemas.openxmlformats.org/markup-compatibility/2006" xmlns:wp14="http://schemas.microsoft.com/office/word/2010/wordprocessingDrawing" xmlns:w14="http://schemas.microsoft.com/office/word/2010/wordml" xmlns:w15="http://schemas.microsoft.com/office/word/2012/wordml" mc:Ignorable="w14 wp14 w15">
+<w:document xmlns:wpc="http://schemas.microsoft.com/office/word/2010/wordprocessingCanvas" xmlns:cx="http://schemas.microsoft.com/office/drawing/2014/chartex" xmlns:cx1="http://schemas.microsoft.com/office/drawing/2015/9/8/chartex" xmlns:cx2="http://schemas.microsoft.com/office/drawing/2015/10/21/chartex" xmlns:cx3="http://schemas.microsoft.com/office/drawing/2016/5/9/chartex" xmlns:cx4="http://schemas.microsoft.com/office/drawing/2016/5/10/chartex" xmlns:cx5="http://schemas.microsoft.com/office/drawing/2016/5/11/chartex" xmlns:cx6="http://schemas.microsoft.com/office/drawing/2016/5/12/chartex" xmlns:cx7="http://schemas.microsoft.com/office/drawing/2016/5/13/chartex" xmlns:cx8="http://schemas.microsoft.com/office/drawing/2016/5/14/chartex" xmlns:mc="http://schemas.openxmlformats.org/markup-compatibility/2006" xmlns:m="http://schemas.openxmlformats.org/officeDocument/2006/math" xmlns:aink="http://schemas.microsoft.com/office/drawing/2016/ink" xmlns:am3d="http://schemas.microsoft.com/office/drawing/2017/model3d" xmlns:oel="http://schemas.microsoft.com/office/2019/extlst" xmlns:r="http://schemas.openxmlformats.org/officeDocument/2006/relationships" xmlns:wp14="http://schemas.microsoft.com/office/word/2010/wordprocessingDrawing" xmlns:wp="http://schemas.openxmlformats.org/drawingml/2006/wordprocessingDrawing" xmlns:wpg="http://schemas.microsoft.com/office/word/2010/wordprocessingGroup" xmlns:wpi="http://schemas.microsoft.com/office/word/2010/wordprocessingInk" xmlns:wps="http://schemas.microsoft.com/office/word/2010/wordprocessingShape" xmlns:o="urn:schemas-microsoft-com:office:office" xmlns:v="urn:schemas-microsoft-com:vml" xmlns:w10="urn:schemas-microsoft-com:office:word" xmlns:w="http://schemas.openxmlformats.org/wordprocessingml/2006/main" xmlns:w14="http://schemas.microsoft.com/office/word/2010/wordml" xmlns:w15="http://schemas.microsoft.com/office/word/2012/wordml" xmlns:w16cex="http://schemas.microsoft.com/office/word/2018/wordml/cex" xmlns:w16cid="http://schemas.microsoft.com/office/word/2016/wordml/cid" xmlns:w16="http://schemas.microsoft.com/office/word/2018/wordml" xmlns:w16sdtdh="http://schemas.microsoft.com/office/word/2020/wordml/sdtdatahash" xmlns:w16sdtfl="http://schemas.microsoft.com/office/word/2024/wordml/sdtformatlock" xmlns:w16se="http://schemas.microsoft.com/office/word/2015/wordml/symex" xmlns:w16du="http://schemas.microsoft.com/office/word/2023/wordml/word16du" xmlns:wne="http://schemas.microsoft.com/office/word/2006/wordml" mc:Ignorable="w14 w15 w16se w16cid w16 w16cex w16sdtdh w16sdtfl w16du wp14">
   <w:body>
     <w:p>
       <w:pPr>
         <w:pStyle w:val="PaperTitle"/>
-        <w:spacing w:lineRule="exact" w:line="288" w:before="567" w:after="280"/>
-        <w:rPr>
-          <w:b/>
+        <w:spacing w:line="288" w:lineRule="exact"/>
+        <w:rPr>
           <w:bCs/>
-          <w:sz w:val="28"/>
           <w:szCs w:val="28"/>
           <w:lang w:val="en-GB"/>
         </w:rPr>
       </w:pPr>
       <w:r>
         <w:rPr>
-          <w:b/>
           <w:bCs/>
-          <w:sz w:val="28"/>
           <w:szCs w:val="28"/>
           <w:lang w:val="en-GB"/>
         </w:rPr>
         <w:t>Use the Same Title as Your Abstract or Change Your Abstract’s Title:</w:t>
+      </w:r>
+      <w:r>
+        <w:rPr>
+          <w:bCs/>
+          <w:szCs w:val="28"/>
+          <w:lang w:val="en-GB"/>
+        </w:rPr>
         <w:br/>
         <w:t>DO NOT use the terms ‘PhysioNet’, ‘Challenge’ or ‘Computing in Cardiology’ or Repeat the Title of the Challenge Verbatim. Be Specific and Unique: Subtitles are OK but Use Sentence Case Throughout</w:t>
       </w:r>
@@ -30,7 +33,6 @@
     <w:p>
       <w:pPr>
         <w:pStyle w:val="AuthorLine"/>
-        <w:rPr/>
       </w:pPr>
       <w:r>
         <w:rPr>
@@ -75,7 +77,7 @@
     <w:p>
       <w:pPr>
         <w:pStyle w:val="InstitutionLine"/>
-        <w:spacing w:before="0" w:after="0"/>
+        <w:spacing w:after="0"/>
         <w:rPr>
           <w:lang w:val="en-GB"/>
         </w:rPr>
@@ -97,7 +99,7 @@
     <w:p>
       <w:pPr>
         <w:pStyle w:val="InstitutionLine"/>
-        <w:spacing w:before="0" w:after="0"/>
+        <w:spacing w:after="0"/>
         <w:rPr>
           <w:lang w:val="en-GB"/>
         </w:rPr>
@@ -124,58 +126,103 @@
           <w:lang w:val="en-GB"/>
         </w:rPr>
       </w:pPr>
-      <w:r>
-        <w:rPr>
-          <w:lang w:val="en-GB"/>
-        </w:rPr>
-      </w:r>
     </w:p>
     <w:p>
       <w:pPr>
         <w:sectPr>
-          <w:type w:val="nextPage"/>
           <w:pgSz w:w="12240" w:h="15840"/>
-          <w:pgMar w:left="1224" w:right="1224" w:gutter="0" w:header="0" w:top="1440" w:footer="0" w:bottom="1440"/>
-          <w:pgNumType w:fmt="decimal"/>
-          <w:formProt w:val="false"/>
-          <w:textDirection w:val="lrTb"/>
-          <w:docGrid w:type="default" w:linePitch="100" w:charSpace="0"/>
+          <w:pgMar w:top="1440" w:right="1224" w:bottom="1440" w:left="1224" w:header="0" w:footer="0" w:gutter="0"/>
+          <w:cols w:space="720"/>
+          <w:formProt w:val="0"/>
+          <w:docGrid w:linePitch="100"/>
         </w:sectPr>
       </w:pPr>
     </w:p>
     <w:p>
       <w:pPr>
         <w:pStyle w:val="AbstractHeading"/>
-        <w:rPr/>
-      </w:pPr>
-      <w:r>
-        <w:rPr/>
+      </w:pPr>
+      <w:r>
         <w:t>Abstract</w:t>
       </w:r>
     </w:p>
     <w:p>
       <w:pPr>
         <w:pStyle w:val="AbstractText"/>
-        <w:ind w:hanging="0" w:start="0"/>
-        <w:rPr/>
+        <w:ind w:firstLine="0"/>
       </w:pPr>
       <w:r>
         <w:rPr>
           <w:iCs/>
         </w:rPr>
-        <w:t xml:space="preserve">Write your abstract here. Your abstract can be up to 300 words or 25 lines long. It cannot contain footnotes or a bibliography. You must define all of the abbreviations in your abstract and redefine them in your paper. </w:t>
+        <w:t xml:space="preserve">Write your abstract here. Your abstract can be up to 300 words or 25 lines long. It cannot contain footnotes or a bibliography. You must define </w:t>
+      </w:r>
+      <w:proofErr w:type="gramStart"/>
+      <w:r>
+        <w:rPr>
+          <w:iCs/>
+        </w:rPr>
+        <w:t>all of</w:t>
+      </w:r>
+      <w:proofErr w:type="gramEnd"/>
+      <w:r>
+        <w:rPr>
+          <w:iCs/>
+        </w:rPr>
+        <w:t xml:space="preserve"> the abbreviations in your abstract and redefine them in your paper. </w:t>
       </w:r>
     </w:p>
     <w:p>
       <w:pPr>
         <w:pStyle w:val="AbstractText"/>
-        <w:rPr/>
       </w:pPr>
       <w:r>
         <w:rPr>
           <w:iCs/>
         </w:rPr>
-        <w:t xml:space="preserve">Please include the following information in your abstract: your team name, your scores from cross-validation on the public training data, and your official scores and rankings on the hidden validation or test data. The scores that you receive from us before the conference use the val- idation set, and the scores that you receive from us after the conference use the test set. For your preprint, please include your official scores and rankings on the validation set. For your final paper, please replace them with your official scores and rankings on the test set. </w:t>
+        <w:t xml:space="preserve">Please include the following information in your abstract: your </w:t>
+      </w:r>
+      <w:proofErr w:type="gramStart"/>
+      <w:r>
+        <w:rPr>
+          <w:iCs/>
+        </w:rPr>
+        <w:t>team</w:t>
+      </w:r>
+      <w:proofErr w:type="gramEnd"/>
+      <w:r>
+        <w:rPr>
+          <w:iCs/>
+        </w:rPr>
+        <w:t xml:space="preserve"> name, your scores from cross-validation on the public training data, and your official scores and rankings on the hidden validation or test data. The scores that you receive from us before the conference use the </w:t>
+      </w:r>
+      <w:proofErr w:type="spellStart"/>
+      <w:r>
+        <w:rPr>
+          <w:iCs/>
+        </w:rPr>
+        <w:t>val</w:t>
+      </w:r>
+      <w:proofErr w:type="spellEnd"/>
+      <w:r>
+        <w:rPr>
+          <w:iCs/>
+        </w:rPr>
+        <w:t xml:space="preserve">- </w:t>
+      </w:r>
+      <w:proofErr w:type="spellStart"/>
+      <w:r>
+        <w:rPr>
+          <w:iCs/>
+        </w:rPr>
+        <w:t>idation</w:t>
+      </w:r>
+      <w:proofErr w:type="spellEnd"/>
+      <w:r>
+        <w:rPr>
+          <w:iCs/>
+        </w:rPr>
+        <w:t xml:space="preserve"> set, and the scores that you receive from us after the conference use the test set. For your preprint, please include your official scores and rankings on the validation set. For your final paper, please replace them with your official scores and rankings on the test set. </w:t>
       </w:r>
     </w:p>
     <w:p>
@@ -203,13 +250,26 @@
         <w:rPr>
           <w:iCs/>
         </w:rPr>
-        <w:t xml:space="preserve">As part of the George B. Moody PhysioNet Challenge 2026, we developed a computational approach based on XGBoost to predict future diagnosis of cognitive impairment from polysomnography (PSG). Our team, [team name], developed a novel approach that [insert your novel contribution to the field here beyond using something out of the box]. Our model received a Challenge score of 0.678 (ranked 20th out of 50 teams) on the hidden validation set (replace later with ‘hidden test set’).’ Please write your results in the same way as we have outlined! </w:t>
+        <w:t xml:space="preserve">As part of the George B. Moody PhysioNet Challenge 2026, we developed a computational approach based on </w:t>
+      </w:r>
+      <w:proofErr w:type="spellStart"/>
+      <w:r>
+        <w:rPr>
+          <w:iCs/>
+        </w:rPr>
+        <w:t>XGBoost</w:t>
+      </w:r>
+      <w:proofErr w:type="spellEnd"/>
+      <w:r>
+        <w:rPr>
+          <w:iCs/>
+        </w:rPr>
+        <w:t xml:space="preserve"> to predict future diagnosis of cognitive impairment from polysomnography (PSG). Our team, [team name], developed a novel approach that [insert your novel contribution to the field here beyond using something out of the box]. Our model received a Challenge score of 0.678 (ranked 20th out of 50 teams) on the hidden validation set (replace later with ‘hidden test set’).’ Please write your results in the same way as we have outlined! </w:t>
       </w:r>
     </w:p>
     <w:p>
       <w:pPr>
         <w:pStyle w:val="AbstractText"/>
-        <w:rPr/>
       </w:pPr>
       <w:r>
         <w:rPr>
@@ -221,7 +281,6 @@
     <w:p>
       <w:pPr>
         <w:pStyle w:val="AbstractText"/>
-        <w:rPr/>
       </w:pPr>
       <w:r>
         <w:rPr>
@@ -232,29 +291,17 @@
     </w:p>
     <w:p>
       <w:pPr>
-        <w:pStyle w:val="Normal"/>
-        <w:rPr>
-          <w:lang w:val="en-GB"/>
-        </w:rPr>
-      </w:pPr>
-      <w:r>
-        <w:rPr>
-          <w:lang w:val="en-GB"/>
-        </w:rPr>
-      </w:r>
-    </w:p>
-    <w:p>
-      <w:pPr>
-        <w:pStyle w:val="Normal"/>
-        <w:rPr>
-          <w:lang w:val="en-GB"/>
-        </w:rPr>
-      </w:pPr>
-      <w:r>
-        <w:rPr>
-          <w:lang w:val="en-GB"/>
-        </w:rPr>
-      </w:r>
+        <w:rPr>
+          <w:lang w:val="en-GB"/>
+        </w:rPr>
+      </w:pPr>
+    </w:p>
+    <w:p>
+      <w:pPr>
+        <w:rPr>
+          <w:lang w:val="en-GB"/>
+        </w:rPr>
+      </w:pPr>
     </w:p>
     <w:p>
       <w:pPr>
@@ -262,53 +309,48 @@
         <w:tabs>
           <w:tab w:val="clear" w:pos="720"/>
         </w:tabs>
-        <w:rPr/>
-      </w:pPr>
-      <w:r>
-        <w:rPr/>
+      </w:pPr>
+      <w:r>
         <w:t>1.</w:t>
+      </w:r>
+      <w:r>
         <w:tab/>
         <w:t>Introduction</w:t>
       </w:r>
     </w:p>
     <w:p>
       <w:pPr>
-        <w:pStyle w:val="Normal"/>
         <w:tabs>
-          <w:tab w:val="left" w:pos="-720" w:leader="none"/>
-          <w:tab w:val="left" w:pos="0" w:leader="none"/>
-          <w:tab w:val="left" w:pos="224" w:leader="none"/>
-          <w:tab w:val="left" w:pos="720" w:leader="none"/>
-          <w:tab w:val="left" w:pos="1440" w:leader="none"/>
-          <w:tab w:val="left" w:pos="2160" w:leader="none"/>
-          <w:tab w:val="left" w:pos="2880" w:leader="none"/>
-          <w:tab w:val="left" w:pos="3600" w:leader="none"/>
-          <w:tab w:val="left" w:pos="4320" w:leader="none"/>
+          <w:tab w:val="left" w:pos="-720"/>
+          <w:tab w:val="left" w:pos="0"/>
+          <w:tab w:val="left" w:pos="224"/>
+          <w:tab w:val="left" w:pos="720"/>
+          <w:tab w:val="left" w:pos="1440"/>
+          <w:tab w:val="left" w:pos="2160"/>
+          <w:tab w:val="left" w:pos="2880"/>
+          <w:tab w:val="left" w:pos="3600"/>
+          <w:tab w:val="left" w:pos="4320"/>
         </w:tabs>
         <w:ind w:firstLine="224"/>
-        <w:rPr/>
-      </w:pPr>
-      <w:r>
-        <w:rPr/>
+      </w:pPr>
+      <w:r>
         <w:t>Please read this entire article and treat it as a checklist. If you fail to follow the instructions, your paper will be rejected, you will not qualify for a prize, and you will not be published in the proceedings.</w:t>
       </w:r>
     </w:p>
     <w:p>
       <w:pPr>
-        <w:pStyle w:val="Normal"/>
         <w:tabs>
-          <w:tab w:val="left" w:pos="-720" w:leader="none"/>
-          <w:tab w:val="left" w:pos="0" w:leader="none"/>
-          <w:tab w:val="left" w:pos="224" w:leader="none"/>
-          <w:tab w:val="left" w:pos="720" w:leader="none"/>
-          <w:tab w:val="left" w:pos="1440" w:leader="none"/>
-          <w:tab w:val="left" w:pos="2160" w:leader="none"/>
-          <w:tab w:val="left" w:pos="2880" w:leader="none"/>
-          <w:tab w:val="left" w:pos="3600" w:leader="none"/>
-          <w:tab w:val="left" w:pos="4320" w:leader="none"/>
+          <w:tab w:val="left" w:pos="-720"/>
+          <w:tab w:val="left" w:pos="0"/>
+          <w:tab w:val="left" w:pos="224"/>
+          <w:tab w:val="left" w:pos="720"/>
+          <w:tab w:val="left" w:pos="1440"/>
+          <w:tab w:val="left" w:pos="2160"/>
+          <w:tab w:val="left" w:pos="2880"/>
+          <w:tab w:val="left" w:pos="3600"/>
+          <w:tab w:val="left" w:pos="4320"/>
         </w:tabs>
         <w:ind w:firstLine="224"/>
-        <w:rPr/>
       </w:pPr>
       <w:r>
         <w:rPr>
@@ -326,23 +368,21 @@
         <w:t>. Do not motivate the problem</w:t>
       </w:r>
       <w:r>
-        <w:rPr/>
         <w:t xml:space="preserve"> like you would do in a normal article. We have already done this for you in the main reference (see below). Save space for the Methods section. You can write something like the following text, but do not use the following text verbatim: </w:t>
       </w:r>
     </w:p>
     <w:p>
       <w:pPr>
-        <w:pStyle w:val="Normal"/>
         <w:tabs>
-          <w:tab w:val="left" w:pos="-720" w:leader="none"/>
-          <w:tab w:val="left" w:pos="0" w:leader="none"/>
-          <w:tab w:val="left" w:pos="224" w:leader="none"/>
-          <w:tab w:val="left" w:pos="720" w:leader="none"/>
-          <w:tab w:val="left" w:pos="1440" w:leader="none"/>
-          <w:tab w:val="left" w:pos="2160" w:leader="none"/>
-          <w:tab w:val="left" w:pos="2880" w:leader="none"/>
-          <w:tab w:val="left" w:pos="3600" w:leader="none"/>
-          <w:tab w:val="left" w:pos="4320" w:leader="none"/>
+          <w:tab w:val="left" w:pos="-720"/>
+          <w:tab w:val="left" w:pos="0"/>
+          <w:tab w:val="left" w:pos="224"/>
+          <w:tab w:val="left" w:pos="720"/>
+          <w:tab w:val="left" w:pos="1440"/>
+          <w:tab w:val="left" w:pos="2160"/>
+          <w:tab w:val="left" w:pos="2880"/>
+          <w:tab w:val="left" w:pos="3600"/>
+          <w:tab w:val="left" w:pos="4320"/>
         </w:tabs>
         <w:ind w:firstLine="224"/>
         <w:rPr>
@@ -355,25 +395,55 @@
           <w:i/>
           <w:iCs/>
         </w:rPr>
-        <w:t>We participated in the 2026 George B. Moody PhysioNet Challenge, which invited teams to develop algorithmic approaches for using polysomnography (PSG), which records various physiological signals during sleep studies, to predict future diagnoses of cognitive impairment [1, 2]. Our Challenge entry addresses this problem by applying high-order Runge-Kutta discontinuous Galerkin (RKDG) methods to. . .</w:t>
-      </w:r>
-    </w:p>
-    <w:p>
-      <w:pPr>
-        <w:pStyle w:val="Normal"/>
+        <w:t>We participated in the 2026 George B. Moody PhysioNet Challenge, which invited teams to develop algorithmic approaches for using polysomnography (PSG), which records various physiological signals during sleep studies, to predict future diagnoses of cognitive impairment [1, 2]. Our Challenge entry addresses this problem by applying high-order Runge-</w:t>
+      </w:r>
+      <w:proofErr w:type="spellStart"/>
+      <w:r>
+        <w:rPr>
+          <w:i/>
+          <w:iCs/>
+        </w:rPr>
+        <w:t>Kutta</w:t>
+      </w:r>
+      <w:proofErr w:type="spellEnd"/>
+      <w:r>
+        <w:rPr>
+          <w:i/>
+          <w:iCs/>
+        </w:rPr>
+        <w:t xml:space="preserve"> discontinuous </w:t>
+      </w:r>
+      <w:proofErr w:type="spellStart"/>
+      <w:r>
+        <w:rPr>
+          <w:i/>
+          <w:iCs/>
+        </w:rPr>
+        <w:t>Galerkin</w:t>
+      </w:r>
+      <w:proofErr w:type="spellEnd"/>
+      <w:r>
+        <w:rPr>
+          <w:i/>
+          <w:iCs/>
+        </w:rPr>
+        <w:t xml:space="preserve"> (RKDG) methods to. . .</w:t>
+      </w:r>
+    </w:p>
+    <w:p>
+      <w:pPr>
         <w:tabs>
-          <w:tab w:val="left" w:pos="-720" w:leader="none"/>
-          <w:tab w:val="left" w:pos="0" w:leader="none"/>
-          <w:tab w:val="left" w:pos="224" w:leader="none"/>
-          <w:tab w:val="left" w:pos="720" w:leader="none"/>
-          <w:tab w:val="left" w:pos="1440" w:leader="none"/>
-          <w:tab w:val="left" w:pos="2160" w:leader="none"/>
-          <w:tab w:val="left" w:pos="2880" w:leader="none"/>
-          <w:tab w:val="left" w:pos="3600" w:leader="none"/>
-          <w:tab w:val="left" w:pos="4320" w:leader="none"/>
+          <w:tab w:val="left" w:pos="-720"/>
+          <w:tab w:val="left" w:pos="0"/>
+          <w:tab w:val="left" w:pos="224"/>
+          <w:tab w:val="left" w:pos="720"/>
+          <w:tab w:val="left" w:pos="1440"/>
+          <w:tab w:val="left" w:pos="2160"/>
+          <w:tab w:val="left" w:pos="2880"/>
+          <w:tab w:val="left" w:pos="3600"/>
+          <w:tab w:val="left" w:pos="4320"/>
         </w:tabs>
         <w:ind w:firstLine="224"/>
-        <w:rPr/>
       </w:pPr>
       <w:r>
         <w:rPr>
@@ -383,7 +453,6 @@
         <w:t>Do not</w:t>
       </w:r>
       <w:r>
-        <w:rPr/>
         <w:t xml:space="preserve"> describe the Challenge beyond the detail found in the above paragraph. </w:t>
       </w:r>
       <w:r>
@@ -394,7 +463,6 @@
         <w:t>Do not</w:t>
       </w:r>
       <w:r>
-        <w:rPr/>
         <w:t xml:space="preserve"> provide details about your method in the introduction. Save them for methods section! </w:t>
       </w:r>
       <w:r>
@@ -405,26 +473,23 @@
         <w:t>Do not</w:t>
       </w:r>
       <w:r>
-        <w:rPr/>
         <w:t xml:space="preserve"> include results for your method in the introduction. Those goes in the results section! </w:t>
       </w:r>
     </w:p>
     <w:p>
       <w:pPr>
-        <w:pStyle w:val="Normal"/>
         <w:tabs>
-          <w:tab w:val="left" w:pos="-720" w:leader="none"/>
-          <w:tab w:val="left" w:pos="0" w:leader="none"/>
-          <w:tab w:val="left" w:pos="224" w:leader="none"/>
-          <w:tab w:val="left" w:pos="720" w:leader="none"/>
-          <w:tab w:val="left" w:pos="1440" w:leader="none"/>
-          <w:tab w:val="left" w:pos="2160" w:leader="none"/>
-          <w:tab w:val="left" w:pos="2880" w:leader="none"/>
-          <w:tab w:val="left" w:pos="3600" w:leader="none"/>
-          <w:tab w:val="left" w:pos="4320" w:leader="none"/>
+          <w:tab w:val="left" w:pos="-720"/>
+          <w:tab w:val="left" w:pos="0"/>
+          <w:tab w:val="left" w:pos="224"/>
+          <w:tab w:val="left" w:pos="720"/>
+          <w:tab w:val="left" w:pos="1440"/>
+          <w:tab w:val="left" w:pos="2160"/>
+          <w:tab w:val="left" w:pos="2880"/>
+          <w:tab w:val="left" w:pos="3600"/>
+          <w:tab w:val="left" w:pos="4320"/>
         </w:tabs>
         <w:ind w:firstLine="224"/>
-        <w:rPr/>
       </w:pPr>
       <w:r>
         <w:rPr>
@@ -434,7 +499,6 @@
         <w:t>Be sure to cite [2] for the Challenge description.</w:t>
       </w:r>
       <w:r>
-        <w:rPr/>
         <w:t xml:space="preserve"> This reference is the definitive description of the Challenge, and you should refer to [2] instead of describing the Challenge itself, thus leaving you more room to focus on </w:t>
       </w:r>
       <w:r>
@@ -445,26 +509,23 @@
         <w:t xml:space="preserve">your </w:t>
       </w:r>
       <w:r>
-        <w:rPr/>
         <w:t xml:space="preserve">approach. </w:t>
       </w:r>
     </w:p>
     <w:p>
       <w:pPr>
-        <w:pStyle w:val="Normal"/>
         <w:tabs>
-          <w:tab w:val="left" w:pos="-720" w:leader="none"/>
-          <w:tab w:val="left" w:pos="0" w:leader="none"/>
-          <w:tab w:val="left" w:pos="224" w:leader="none"/>
-          <w:tab w:val="left" w:pos="720" w:leader="none"/>
-          <w:tab w:val="left" w:pos="1440" w:leader="none"/>
-          <w:tab w:val="left" w:pos="2160" w:leader="none"/>
-          <w:tab w:val="left" w:pos="2880" w:leader="none"/>
-          <w:tab w:val="left" w:pos="3600" w:leader="none"/>
-          <w:tab w:val="left" w:pos="4320" w:leader="none"/>
+          <w:tab w:val="left" w:pos="-720"/>
+          <w:tab w:val="left" w:pos="0"/>
+          <w:tab w:val="left" w:pos="224"/>
+          <w:tab w:val="left" w:pos="720"/>
+          <w:tab w:val="left" w:pos="1440"/>
+          <w:tab w:val="left" w:pos="2160"/>
+          <w:tab w:val="left" w:pos="2880"/>
+          <w:tab w:val="left" w:pos="3600"/>
+          <w:tab w:val="left" w:pos="4320"/>
         </w:tabs>
         <w:ind w:firstLine="224"/>
-        <w:rPr/>
       </w:pPr>
       <w:r>
         <w:rPr>
@@ -474,23 +535,21 @@
         <w:t>Be sure to cite the Challenge data.</w:t>
       </w:r>
       <w:r>
-        <w:rPr/>
         <w:t xml:space="preserve"> The availability of this database made the Challenge possible, and you should refer to [3] instead of describing the Challenge data so that you can focus on your methods. </w:t>
       </w:r>
     </w:p>
     <w:p>
       <w:pPr>
-        <w:pStyle w:val="Normal"/>
         <w:tabs>
-          <w:tab w:val="left" w:pos="-720" w:leader="none"/>
-          <w:tab w:val="left" w:pos="0" w:leader="none"/>
-          <w:tab w:val="left" w:pos="224" w:leader="none"/>
-          <w:tab w:val="left" w:pos="720" w:leader="none"/>
-          <w:tab w:val="left" w:pos="1440" w:leader="none"/>
-          <w:tab w:val="left" w:pos="2160" w:leader="none"/>
-          <w:tab w:val="left" w:pos="2880" w:leader="none"/>
-          <w:tab w:val="left" w:pos="3600" w:leader="none"/>
-          <w:tab w:val="left" w:pos="4320" w:leader="none"/>
+          <w:tab w:val="left" w:pos="-720"/>
+          <w:tab w:val="left" w:pos="0"/>
+          <w:tab w:val="left" w:pos="224"/>
+          <w:tab w:val="left" w:pos="720"/>
+          <w:tab w:val="left" w:pos="1440"/>
+          <w:tab w:val="left" w:pos="2160"/>
+          <w:tab w:val="left" w:pos="2880"/>
+          <w:tab w:val="left" w:pos="3600"/>
+          <w:tab w:val="left" w:pos="4320"/>
         </w:tabs>
         <w:ind w:firstLine="224"/>
         <w:rPr>
@@ -505,35 +564,39 @@
         <w:t>Do not cite a URL, a website, or any other reference to describe the Challenge.</w:t>
       </w:r>
       <w:r>
-        <w:rPr/>
         <w:t xml:space="preserve"> It is better to refer to a single, consistent description of the Challenge and focus on describing your approach than to have many slightly different descriptions of the Challenge and leave out the details of your approach. </w:t>
       </w:r>
     </w:p>
     <w:p>
       <w:pPr>
-        <w:pStyle w:val="Normal"/>
         <w:tabs>
-          <w:tab w:val="left" w:pos="-720" w:leader="none"/>
-          <w:tab w:val="left" w:pos="0" w:leader="none"/>
-          <w:tab w:val="left" w:pos="224" w:leader="none"/>
-          <w:tab w:val="left" w:pos="720" w:leader="none"/>
-          <w:tab w:val="left" w:pos="1440" w:leader="none"/>
-          <w:tab w:val="left" w:pos="2160" w:leader="none"/>
-          <w:tab w:val="left" w:pos="2880" w:leader="none"/>
-          <w:tab w:val="left" w:pos="3600" w:leader="none"/>
-          <w:tab w:val="left" w:pos="4320" w:leader="none"/>
+          <w:tab w:val="left" w:pos="-720"/>
+          <w:tab w:val="left" w:pos="0"/>
+          <w:tab w:val="left" w:pos="224"/>
+          <w:tab w:val="left" w:pos="720"/>
+          <w:tab w:val="left" w:pos="1440"/>
+          <w:tab w:val="left" w:pos="2160"/>
+          <w:tab w:val="left" w:pos="2880"/>
+          <w:tab w:val="left" w:pos="3600"/>
+          <w:tab w:val="left" w:pos="4320"/>
         </w:tabs>
         <w:ind w:firstLine="224"/>
-        <w:jc w:val="both"/>
-        <w:rPr>
-          <w:lang w:val="en-GB"/>
-        </w:rPr>
-      </w:pPr>
-      <w:r>
-        <w:rPr>
-          <w:lang w:val="en-GB"/>
-        </w:rPr>
-        <w:t xml:space="preserve">Please do not survey the literature in this field: we have already done this in the main article describing the Challenge [2]. </w:t>
+        <w:rPr>
+          <w:lang w:val="en-GB"/>
+        </w:rPr>
+      </w:pPr>
+      <w:r>
+        <w:rPr>
+          <w:lang w:val="en-GB"/>
+        </w:rPr>
+        <w:t xml:space="preserve">Please do not survey the literature in this field: we have </w:t>
+      </w:r>
+      <w:r>
+        <w:rPr>
+          <w:lang w:val="en-GB"/>
+        </w:rPr>
+        <w:lastRenderedPageBreak/>
+        <w:t xml:space="preserve">already done this in the main article describing the Challenge [2]. </w:t>
       </w:r>
       <w:r>
         <w:rPr>
@@ -546,29 +609,23 @@
     </w:p>
     <w:p>
       <w:pPr>
-        <w:pStyle w:val="Normal"/>
         <w:tabs>
-          <w:tab w:val="left" w:pos="-720" w:leader="none"/>
-          <w:tab w:val="left" w:pos="0" w:leader="none"/>
-          <w:tab w:val="left" w:pos="224" w:leader="none"/>
-          <w:tab w:val="left" w:pos="720" w:leader="none"/>
-          <w:tab w:val="left" w:pos="1440" w:leader="none"/>
-          <w:tab w:val="left" w:pos="2160" w:leader="none"/>
-          <w:tab w:val="left" w:pos="2880" w:leader="none"/>
-          <w:tab w:val="left" w:pos="3600" w:leader="none"/>
-          <w:tab w:val="left" w:pos="4320" w:leader="none"/>
+          <w:tab w:val="left" w:pos="-720"/>
+          <w:tab w:val="left" w:pos="0"/>
+          <w:tab w:val="left" w:pos="224"/>
+          <w:tab w:val="left" w:pos="720"/>
+          <w:tab w:val="left" w:pos="1440"/>
+          <w:tab w:val="left" w:pos="2160"/>
+          <w:tab w:val="left" w:pos="2880"/>
+          <w:tab w:val="left" w:pos="3600"/>
+          <w:tab w:val="left" w:pos="4320"/>
         </w:tabs>
         <w:ind w:firstLine="224"/>
-        <w:jc w:val="start"/>
-        <w:rPr>
-          <w:lang w:val="en-GB"/>
-        </w:rPr>
-      </w:pPr>
-      <w:r>
-        <w:rPr>
-          <w:lang w:val="en-GB"/>
-        </w:rPr>
-      </w:r>
+        <w:jc w:val="left"/>
+        <w:rPr>
+          <w:lang w:val="en-GB"/>
+        </w:rPr>
+      </w:pPr>
     </w:p>
     <w:p>
       <w:pPr>
@@ -576,28 +633,27 @@
         <w:tabs>
           <w:tab w:val="clear" w:pos="720"/>
         </w:tabs>
-        <w:rPr/>
-      </w:pPr>
-      <w:r>
-        <w:rPr/>
+      </w:pPr>
+      <w:r>
         <w:t>2.</w:t>
+      </w:r>
+      <w:r>
         <w:tab/>
         <w:t>Method</w:t>
       </w:r>
     </w:p>
     <w:p>
       <w:pPr>
-        <w:pStyle w:val="Normal"/>
         <w:tabs>
-          <w:tab w:val="left" w:pos="-720" w:leader="none"/>
-          <w:tab w:val="left" w:pos="0" w:leader="none"/>
-          <w:tab w:val="left" w:pos="224" w:leader="none"/>
-          <w:tab w:val="left" w:pos="720" w:leader="none"/>
-          <w:tab w:val="left" w:pos="1440" w:leader="none"/>
-          <w:tab w:val="left" w:pos="2160" w:leader="none"/>
-          <w:tab w:val="left" w:pos="2880" w:leader="none"/>
-          <w:tab w:val="left" w:pos="3600" w:leader="none"/>
-          <w:tab w:val="left" w:pos="4320" w:leader="none"/>
+          <w:tab w:val="left" w:pos="-720"/>
+          <w:tab w:val="left" w:pos="0"/>
+          <w:tab w:val="left" w:pos="224"/>
+          <w:tab w:val="left" w:pos="720"/>
+          <w:tab w:val="left" w:pos="1440"/>
+          <w:tab w:val="left" w:pos="2160"/>
+          <w:tab w:val="left" w:pos="2880"/>
+          <w:tab w:val="left" w:pos="3600"/>
+          <w:tab w:val="left" w:pos="4320"/>
         </w:tabs>
         <w:ind w:firstLine="224"/>
         <w:rPr>
@@ -644,17 +700,16 @@
     </w:p>
     <w:p>
       <w:pPr>
-        <w:pStyle w:val="Normal"/>
         <w:tabs>
-          <w:tab w:val="left" w:pos="-720" w:leader="none"/>
-          <w:tab w:val="left" w:pos="0" w:leader="none"/>
-          <w:tab w:val="left" w:pos="224" w:leader="none"/>
-          <w:tab w:val="left" w:pos="720" w:leader="none"/>
-          <w:tab w:val="left" w:pos="1440" w:leader="none"/>
-          <w:tab w:val="left" w:pos="2160" w:leader="none"/>
-          <w:tab w:val="left" w:pos="2880" w:leader="none"/>
-          <w:tab w:val="left" w:pos="3600" w:leader="none"/>
-          <w:tab w:val="left" w:pos="4320" w:leader="none"/>
+          <w:tab w:val="left" w:pos="-720"/>
+          <w:tab w:val="left" w:pos="0"/>
+          <w:tab w:val="left" w:pos="224"/>
+          <w:tab w:val="left" w:pos="720"/>
+          <w:tab w:val="left" w:pos="1440"/>
+          <w:tab w:val="left" w:pos="2160"/>
+          <w:tab w:val="left" w:pos="2880"/>
+          <w:tab w:val="left" w:pos="3600"/>
+          <w:tab w:val="left" w:pos="4320"/>
         </w:tabs>
         <w:ind w:firstLine="224"/>
         <w:rPr>
@@ -673,82 +728,139 @@
           <w:bCs/>
           <w:lang w:val="en-GB"/>
         </w:rPr>
-        <w:t>If we reject your CinC article you will be disqualified from the Challenge and removed from the official rankings.</w:t>
-      </w:r>
-      <w:r>
-        <w:rPr>
-          <w:lang w:val="en-GB"/>
-        </w:rPr>
-        <w:t xml:space="preserve"> Accurate dissemination of the results of the Challenge are the most important product. Misleading or confusing articles detract from the impact. So please read these instructions carefully. </w:t>
-      </w:r>
-    </w:p>
-    <w:p>
-      <w:pPr>
-        <w:pStyle w:val="Normal"/>
+        <w:t xml:space="preserve">If we reject your </w:t>
+      </w:r>
+      <w:proofErr w:type="spellStart"/>
+      <w:r>
+        <w:rPr>
+          <w:b/>
+          <w:bCs/>
+          <w:lang w:val="en-GB"/>
+        </w:rPr>
+        <w:t>CinC</w:t>
+      </w:r>
+      <w:proofErr w:type="spellEnd"/>
+      <w:r>
+        <w:rPr>
+          <w:b/>
+          <w:bCs/>
+          <w:lang w:val="en-GB"/>
+        </w:rPr>
+        <w:t xml:space="preserve"> article you will be disqualified from the Challenge and removed from the official rankings.</w:t>
+      </w:r>
+      <w:r>
+        <w:rPr>
+          <w:lang w:val="en-GB"/>
+        </w:rPr>
+        <w:t xml:space="preserve"> Accurate dissemination of the results of the Challenge </w:t>
+      </w:r>
+      <w:proofErr w:type="gramStart"/>
+      <w:r>
+        <w:rPr>
+          <w:lang w:val="en-GB"/>
+        </w:rPr>
+        <w:t>are</w:t>
+      </w:r>
+      <w:proofErr w:type="gramEnd"/>
+      <w:r>
+        <w:rPr>
+          <w:lang w:val="en-GB"/>
+        </w:rPr>
+        <w:t xml:space="preserve"> the most important product. Misleading or confusing articles detract from the impact. So please read these instructions carefully. </w:t>
+      </w:r>
+    </w:p>
+    <w:p>
+      <w:pPr>
         <w:tabs>
-          <w:tab w:val="left" w:pos="-720" w:leader="none"/>
-          <w:tab w:val="left" w:pos="0" w:leader="none"/>
-          <w:tab w:val="left" w:pos="224" w:leader="none"/>
-          <w:tab w:val="left" w:pos="720" w:leader="none"/>
-          <w:tab w:val="left" w:pos="1440" w:leader="none"/>
-          <w:tab w:val="left" w:pos="2160" w:leader="none"/>
-          <w:tab w:val="left" w:pos="2880" w:leader="none"/>
-          <w:tab w:val="left" w:pos="3600" w:leader="none"/>
-          <w:tab w:val="left" w:pos="4320" w:leader="none"/>
+          <w:tab w:val="left" w:pos="-720"/>
+          <w:tab w:val="left" w:pos="0"/>
+          <w:tab w:val="left" w:pos="224"/>
+          <w:tab w:val="left" w:pos="720"/>
+          <w:tab w:val="left" w:pos="1440"/>
+          <w:tab w:val="left" w:pos="2160"/>
+          <w:tab w:val="left" w:pos="2880"/>
+          <w:tab w:val="left" w:pos="3600"/>
+          <w:tab w:val="left" w:pos="4320"/>
         </w:tabs>
-        <w:ind w:hanging="0"/>
-        <w:rPr>
-          <w:lang w:val="en-GB"/>
-        </w:rPr>
-      </w:pPr>
-      <w:r>
-        <w:rPr>
-          <w:lang w:val="en-GB"/>
-        </w:rPr>
-        <w:t>1. Include any data processing steps that you performed, including any exclusion criteria or relabeling of the training data.</w:t>
-      </w:r>
-    </w:p>
-    <w:p>
-      <w:pPr>
-        <w:pStyle w:val="Normal"/>
+        <w:ind w:firstLine="0"/>
+        <w:rPr>
+          <w:lang w:val="en-GB"/>
+        </w:rPr>
+      </w:pPr>
+      <w:r>
+        <w:rPr>
+          <w:lang w:val="en-GB"/>
+        </w:rPr>
+        <w:t xml:space="preserve">1. Include any data processing steps that you performed, including any exclusion criteria or </w:t>
+      </w:r>
+      <w:proofErr w:type="spellStart"/>
+      <w:r>
+        <w:rPr>
+          <w:lang w:val="en-GB"/>
+        </w:rPr>
+        <w:t>relabeling</w:t>
+      </w:r>
+      <w:proofErr w:type="spellEnd"/>
+      <w:r>
+        <w:rPr>
+          <w:lang w:val="en-GB"/>
+        </w:rPr>
+        <w:t xml:space="preserve"> of the training data.</w:t>
+      </w:r>
+    </w:p>
+    <w:p>
+      <w:pPr>
         <w:tabs>
-          <w:tab w:val="left" w:pos="-720" w:leader="none"/>
-          <w:tab w:val="left" w:pos="0" w:leader="none"/>
-          <w:tab w:val="left" w:pos="224" w:leader="none"/>
-          <w:tab w:val="left" w:pos="720" w:leader="none"/>
-          <w:tab w:val="left" w:pos="1440" w:leader="none"/>
-          <w:tab w:val="left" w:pos="2160" w:leader="none"/>
-          <w:tab w:val="left" w:pos="2880" w:leader="none"/>
-          <w:tab w:val="left" w:pos="3600" w:leader="none"/>
-          <w:tab w:val="left" w:pos="4320" w:leader="none"/>
+          <w:tab w:val="left" w:pos="-720"/>
+          <w:tab w:val="left" w:pos="0"/>
+          <w:tab w:val="left" w:pos="224"/>
+          <w:tab w:val="left" w:pos="720"/>
+          <w:tab w:val="left" w:pos="1440"/>
+          <w:tab w:val="left" w:pos="2160"/>
+          <w:tab w:val="left" w:pos="2880"/>
+          <w:tab w:val="left" w:pos="3600"/>
+          <w:tab w:val="left" w:pos="4320"/>
         </w:tabs>
-        <w:ind w:hanging="0"/>
-        <w:rPr>
-          <w:lang w:val="en-GB"/>
-        </w:rPr>
-      </w:pPr>
-      <w:r>
-        <w:rPr>
-          <w:lang w:val="en-GB"/>
-        </w:rPr>
-        <w:t xml:space="preserve">2. Include a description of all of the parameters that you optimized and how you optimized them, including any data and methods that you used for optimization. If you picked a parameter without optimizing, then report that, too. A table of parameters and their optimized/chosen value would be very useful. </w:t>
-      </w:r>
-    </w:p>
-    <w:p>
-      <w:pPr>
-        <w:pStyle w:val="Normal"/>
+        <w:ind w:firstLine="0"/>
+        <w:rPr>
+          <w:lang w:val="en-GB"/>
+        </w:rPr>
+      </w:pPr>
+      <w:r>
+        <w:rPr>
+          <w:lang w:val="en-GB"/>
+        </w:rPr>
+        <w:t xml:space="preserve">2. Include a description of </w:t>
+      </w:r>
+      <w:proofErr w:type="gramStart"/>
+      <w:r>
+        <w:rPr>
+          <w:lang w:val="en-GB"/>
+        </w:rPr>
+        <w:t>all of</w:t>
+      </w:r>
+      <w:proofErr w:type="gramEnd"/>
+      <w:r>
+        <w:rPr>
+          <w:lang w:val="en-GB"/>
+        </w:rPr>
+        <w:t xml:space="preserve"> the parameters that you optimized and how you optimized them, including any data and methods that you used for optimization. If you picked a parameter without optimizing, then report that, too. A table of parameters and their optimized/chosen value would be very useful. </w:t>
+      </w:r>
+    </w:p>
+    <w:p>
+      <w:pPr>
         <w:tabs>
-          <w:tab w:val="left" w:pos="-720" w:leader="none"/>
-          <w:tab w:val="left" w:pos="0" w:leader="none"/>
-          <w:tab w:val="left" w:pos="224" w:leader="none"/>
-          <w:tab w:val="left" w:pos="720" w:leader="none"/>
-          <w:tab w:val="left" w:pos="1440" w:leader="none"/>
-          <w:tab w:val="left" w:pos="2160" w:leader="none"/>
-          <w:tab w:val="left" w:pos="2880" w:leader="none"/>
-          <w:tab w:val="left" w:pos="3600" w:leader="none"/>
-          <w:tab w:val="left" w:pos="4320" w:leader="none"/>
+          <w:tab w:val="left" w:pos="-720"/>
+          <w:tab w:val="left" w:pos="0"/>
+          <w:tab w:val="left" w:pos="224"/>
+          <w:tab w:val="left" w:pos="720"/>
+          <w:tab w:val="left" w:pos="1440"/>
+          <w:tab w:val="left" w:pos="2160"/>
+          <w:tab w:val="left" w:pos="2880"/>
+          <w:tab w:val="left" w:pos="3600"/>
+          <w:tab w:val="left" w:pos="4320"/>
         </w:tabs>
-        <w:ind w:hanging="0"/>
+        <w:ind w:firstLine="0"/>
         <w:rPr>
           <w:lang w:val="en-GB"/>
         </w:rPr>
@@ -762,23 +874,35 @@
     </w:p>
     <w:p>
       <w:pPr>
-        <w:pStyle w:val="Normal"/>
-        <w:ind w:hanging="0"/>
-        <w:rPr>
-          <w:lang w:val="en-GB"/>
-        </w:rPr>
-      </w:pPr>
-      <w:r>
-        <w:rPr>
-          <w:lang w:val="en-GB"/>
-        </w:rPr>
-        <w:t>4. Be sure to highlight any similarities or differences be- tween your approaches and that of others (i.e. read their preprints after CinC and compare your approach to other teams.</w:t>
-      </w:r>
-    </w:p>
-    <w:p>
-      <w:pPr>
-        <w:pStyle w:val="Normal"/>
-        <w:ind w:hanging="0"/>
+        <w:ind w:firstLine="0"/>
+        <w:rPr>
+          <w:lang w:val="en-GB"/>
+        </w:rPr>
+      </w:pPr>
+      <w:r>
+        <w:rPr>
+          <w:lang w:val="en-GB"/>
+        </w:rPr>
+        <w:t xml:space="preserve">4. Be sure to highlight any similarities or differences be- tween your approaches and that of others (i.e. read their preprints after </w:t>
+      </w:r>
+      <w:proofErr w:type="spellStart"/>
+      <w:r>
+        <w:rPr>
+          <w:lang w:val="en-GB"/>
+        </w:rPr>
+        <w:t>CinC</w:t>
+      </w:r>
+      <w:proofErr w:type="spellEnd"/>
+      <w:r>
+        <w:rPr>
+          <w:lang w:val="en-GB"/>
+        </w:rPr>
+        <w:t xml:space="preserve"> and compare your approach to other teams.</w:t>
+      </w:r>
+    </w:p>
+    <w:p>
+      <w:pPr>
+        <w:ind w:firstLine="0"/>
         <w:rPr>
           <w:lang w:val="en-GB"/>
         </w:rPr>
@@ -792,40 +916,56 @@
     </w:p>
     <w:p>
       <w:pPr>
-        <w:pStyle w:val="Normal"/>
-        <w:ind w:hanging="0"/>
-        <w:jc w:val="end"/>
-        <w:rPr>
-          <w:lang w:val="en-GB"/>
-        </w:rPr>
-      </w:pPr>
-      <w:r>
-        <w:rPr/>
-      </w:r>
-      <m:oMathPara xmlns:m="http://schemas.openxmlformats.org/officeDocument/2006/math">
+        <w:ind w:firstLine="0"/>
+        <w:jc w:val="right"/>
+        <w:rPr>
+          <w:lang w:val="en-GB"/>
+        </w:rPr>
+      </w:pPr>
+      <m:oMathPara>
         <m:oMathParaPr>
           <m:jc m:val="right"/>
         </m:oMathParaPr>
         <m:oMath>
           <m:nary>
             <m:naryPr>
-              <m:chr m:val="∫"/>
+              <m:ctrlPr>
+                <w:rPr>
+                  <w:rFonts w:ascii="Cambria Math" w:hAnsi="Cambria Math"/>
+                </w:rPr>
+              </m:ctrlPr>
             </m:naryPr>
             <m:sub>
               <m:r>
-                <m:t xml:space="preserve">0</m:t>
+                <w:rPr>
+                  <w:rFonts w:ascii="Cambria Math" w:hAnsi="Cambria Math"/>
+                </w:rPr>
+                <m:t>0</m:t>
               </m:r>
             </m:sub>
             <m:sup>
               <m:r>
-                <m:t xml:space="preserve">∞</m:t>
+                <w:rPr>
+                  <w:rFonts w:ascii="Cambria Math" w:hAnsi="Cambria Math"/>
+                </w:rPr>
+                <m:t>∞</m:t>
               </m:r>
             </m:sup>
             <m:e>
               <m:sSup>
+                <m:sSupPr>
+                  <m:ctrlPr>
+                    <w:rPr>
+                      <w:rFonts w:ascii="Cambria Math" w:hAnsi="Cambria Math"/>
+                    </w:rPr>
+                  </m:ctrlPr>
+                </m:sSupPr>
                 <m:e>
                   <m:r>
-                    <m:t xml:space="preserve">e</m:t>
+                    <w:rPr>
+                      <w:rFonts w:ascii="Cambria Math" w:hAnsi="Cambria Math"/>
+                    </w:rPr>
+                    <m:t>e</m:t>
                   </m:r>
                 </m:e>
                 <m:sup>
@@ -834,252 +974,104 @@
                       <m:lit/>
                       <m:nor/>
                     </m:rPr>
-                    <m:t xml:space="preserve">-</m:t>
+                    <m:t>-</m:t>
                   </m:r>
                   <m:sSup>
+                    <m:sSupPr>
+                      <m:ctrlPr>
+                        <w:rPr>
+                          <w:rFonts w:ascii="Cambria Math" w:hAnsi="Cambria Math"/>
+                        </w:rPr>
+                      </m:ctrlPr>
+                    </m:sSupPr>
                     <m:e>
                       <m:r>
-                        <m:t xml:space="preserve">x</m:t>
+                        <w:rPr>
+                          <w:rFonts w:ascii="Cambria Math" w:hAnsi="Cambria Math"/>
+                        </w:rPr>
+                        <m:t>x</m:t>
                       </m:r>
                     </m:e>
                     <m:sup>
                       <m:r>
-                        <m:t xml:space="preserve">2</m:t>
+                        <w:rPr>
+                          <w:rFonts w:ascii="Cambria Math" w:hAnsi="Cambria Math"/>
+                        </w:rPr>
+                        <m:t>2</m:t>
                       </m:r>
                     </m:sup>
                   </m:sSup>
                 </m:sup>
               </m:sSup>
               <m:r>
-                <m:t xml:space="preserve">dx</m:t>
+                <w:rPr>
+                  <w:rFonts w:ascii="Cambria Math" w:hAnsi="Cambria Math"/>
+                </w:rPr>
+                <m:t>dx</m:t>
               </m:r>
               <m:r>
                 <m:rPr>
                   <m:lit/>
                   <m:nor/>
                 </m:rPr>
-                <m:t xml:space="preserve">=</m:t>
+                <m:t>=</m:t>
               </m:r>
               <m:f>
+                <m:fPr>
+                  <m:ctrlPr>
+                    <w:rPr>
+                      <w:rFonts w:ascii="Cambria Math" w:hAnsi="Cambria Math"/>
+                    </w:rPr>
+                  </m:ctrlPr>
+                </m:fPr>
                 <m:num>
                   <m:rad>
                     <m:radPr>
                       <m:degHide m:val="1"/>
+                      <m:ctrlPr>
+                        <w:rPr>
+                          <w:rFonts w:ascii="Cambria Math" w:hAnsi="Cambria Math"/>
+                        </w:rPr>
+                      </m:ctrlPr>
                     </m:radPr>
                     <m:deg/>
                     <m:e>
                       <m:r>
-                        <m:t xml:space="preserve">π</m:t>
+                        <w:rPr>
+                          <w:rFonts w:ascii="Cambria Math" w:hAnsi="Cambria Math"/>
+                        </w:rPr>
+                        <m:t>π</m:t>
                       </m:r>
                     </m:e>
                   </m:rad>
                 </m:num>
                 <m:den>
                   <m:r>
-                    <m:t xml:space="preserve">2</m:t>
+                    <w:rPr>
+                      <w:rFonts w:ascii="Cambria Math" w:hAnsi="Cambria Math"/>
+                    </w:rPr>
+                    <m:t>2</m:t>
                   </m:r>
                 </m:den>
               </m:f>
               <m:r>
-                <m:t xml:space="preserve">.</m:t>
+                <w:rPr>
+                  <w:rFonts w:ascii="Cambria Math" w:hAnsi="Cambria Math"/>
+                </w:rPr>
+                <m:t>.</m:t>
               </m:r>
               <m:r>
                 <m:rPr>
                   <m:lit/>
                   <m:nor/>
                 </m:rPr>
-                <m:t xml:space="preserve"> </m:t>
+                <m:t xml:space="preserve">                           </m:t>
               </m:r>
               <m:r>
-                <m:rPr>
-                  <m:lit/>
-                  <m:nor/>
-                </m:rPr>
-                <m:t xml:space="preserve"> </m:t>
-              </m:r>
-              <m:r>
-                <m:rPr>
-                  <m:lit/>
-                  <m:nor/>
-                </m:rPr>
-                <m:t xml:space="preserve"> </m:t>
-              </m:r>
-              <m:r>
-                <m:rPr>
-                  <m:lit/>
-                  <m:nor/>
-                </m:rPr>
-                <m:t xml:space="preserve"> </m:t>
-              </m:r>
-              <m:r>
-                <m:rPr>
-                  <m:lit/>
-                  <m:nor/>
-                </m:rPr>
-                <m:t xml:space="preserve"> </m:t>
-              </m:r>
-              <m:r>
-                <m:rPr>
-                  <m:lit/>
-                  <m:nor/>
-                </m:rPr>
-                <m:t xml:space="preserve"> </m:t>
-              </m:r>
-              <m:r>
-                <m:rPr>
-                  <m:lit/>
-                  <m:nor/>
-                </m:rPr>
-                <m:t xml:space="preserve"> </m:t>
-              </m:r>
-              <m:r>
-                <m:rPr>
-                  <m:lit/>
-                  <m:nor/>
-                </m:rPr>
-                <m:t xml:space="preserve"> </m:t>
-              </m:r>
-              <m:r>
-                <m:rPr>
-                  <m:lit/>
-                  <m:nor/>
-                </m:rPr>
-                <m:t xml:space="preserve"> </m:t>
-              </m:r>
-              <m:r>
-                <m:rPr>
-                  <m:lit/>
-                  <m:nor/>
-                </m:rPr>
-                <m:t xml:space="preserve"> </m:t>
-              </m:r>
-              <m:r>
-                <m:rPr>
-                  <m:lit/>
-                  <m:nor/>
-                </m:rPr>
-                <m:t xml:space="preserve"> </m:t>
-              </m:r>
-              <m:r>
-                <m:rPr>
-                  <m:lit/>
-                  <m:nor/>
-                </m:rPr>
-                <m:t xml:space="preserve"> </m:t>
-              </m:r>
-              <m:r>
-                <m:rPr>
-                  <m:lit/>
-                  <m:nor/>
-                </m:rPr>
-                <m:t xml:space="preserve"> </m:t>
-              </m:r>
-              <m:r>
-                <m:rPr>
-                  <m:lit/>
-                  <m:nor/>
-                </m:rPr>
-                <m:t xml:space="preserve"> </m:t>
-              </m:r>
-              <m:r>
-                <m:rPr>
-                  <m:lit/>
-                  <m:nor/>
-                </m:rPr>
-                <m:t xml:space="preserve"> </m:t>
-              </m:r>
-              <m:r>
-                <m:rPr>
-                  <m:lit/>
-                  <m:nor/>
-                </m:rPr>
-                <m:t xml:space="preserve"> </m:t>
-              </m:r>
-              <m:r>
-                <m:rPr>
-                  <m:lit/>
-                  <m:nor/>
-                </m:rPr>
-                <m:t xml:space="preserve"> </m:t>
-              </m:r>
-              <m:r>
-                <m:rPr>
-                  <m:lit/>
-                  <m:nor/>
-                </m:rPr>
-                <m:t xml:space="preserve"> </m:t>
-              </m:r>
-              <m:r>
-                <m:rPr>
-                  <m:lit/>
-                  <m:nor/>
-                </m:rPr>
-                <m:t xml:space="preserve"> </m:t>
-              </m:r>
-              <m:r>
-                <m:rPr>
-                  <m:lit/>
-                  <m:nor/>
-                </m:rPr>
-                <m:t xml:space="preserve"> </m:t>
-              </m:r>
-              <m:r>
-                <m:rPr>
-                  <m:lit/>
-                  <m:nor/>
-                </m:rPr>
-                <m:t xml:space="preserve"> </m:t>
-              </m:r>
-              <m:r>
-                <m:rPr>
-                  <m:lit/>
-                  <m:nor/>
-                </m:rPr>
-                <m:t xml:space="preserve"> </m:t>
-              </m:r>
-              <m:r>
-                <m:rPr>
-                  <m:lit/>
-                  <m:nor/>
-                </m:rPr>
-                <m:t xml:space="preserve"> </m:t>
-              </m:r>
-              <m:r>
-                <m:rPr>
-                  <m:lit/>
-                  <m:nor/>
-                </m:rPr>
-                <m:t xml:space="preserve"> </m:t>
-              </m:r>
-              <m:r>
-                <m:rPr>
-                  <m:lit/>
-                  <m:nor/>
-                </m:rPr>
-                <m:t xml:space="preserve"> </m:t>
-              </m:r>
-              <m:r>
-                <m:rPr>
-                  <m:lit/>
-                  <m:nor/>
-                </m:rPr>
-                <m:t xml:space="preserve"> </m:t>
-              </m:r>
-              <m:r>
-                <m:rPr>
-                  <m:lit/>
-                  <m:nor/>
-                </m:rPr>
-                <m:t xml:space="preserve"> </m:t>
-              </m:r>
-              <m:r>
-                <m:t xml:space="preserve">(</m:t>
-              </m:r>
-              <m:r>
-                <m:t xml:space="preserve">1</m:t>
-              </m:r>
-              <m:r>
-                <m:t xml:space="preserve">)</m:t>
+                <w:rPr>
+                  <w:rFonts w:ascii="Cambria Math" w:hAnsi="Cambria Math"/>
+                </w:rPr>
+                <m:t>(1)</m:t>
               </m:r>
             </m:e>
           </m:nary>
@@ -1088,8 +1080,7 @@
     </w:p>
     <w:p>
       <w:pPr>
-        <w:pStyle w:val="Normal"/>
-        <w:ind w:hanging="0"/>
+        <w:ind w:firstLine="0"/>
         <w:rPr>
           <w:lang w:val="en-GB"/>
         </w:rPr>
@@ -1103,8 +1094,7 @@
     </w:p>
     <w:p>
       <w:pPr>
-        <w:pStyle w:val="Normal"/>
-        <w:ind w:hanging="0"/>
+        <w:ind w:firstLine="0"/>
         <w:rPr>
           <w:lang w:val="en-GB"/>
         </w:rPr>
@@ -1118,8 +1108,7 @@
     </w:p>
     <w:p>
       <w:pPr>
-        <w:pStyle w:val="Normal"/>
-        <w:ind w:hanging="0"/>
+        <w:ind w:firstLine="0"/>
         <w:rPr>
           <w:lang w:val="en-GB"/>
         </w:rPr>
@@ -1133,38 +1122,33 @@
     </w:p>
     <w:p>
       <w:pPr>
-        <w:pStyle w:val="Normal"/>
-        <w:ind w:hanging="0"/>
-        <w:rPr>
-          <w:lang w:val="en-GB"/>
-        </w:rPr>
-      </w:pPr>
-      <w:r>
-        <w:rPr>
-          <w:lang w:val="en-GB"/>
-        </w:rPr>
-        <w:t xml:space="preserve"> </w:t>
-      </w:r>
-      <w:r>
-        <w:rPr>
-          <w:lang w:val="en-GB"/>
-        </w:rPr>
-        <w:t>9. Use appropriate significant figures, i.e., number of decimal places.</w:t>
-      </w:r>
-    </w:p>
-    <w:p>
-      <w:pPr>
-        <w:pStyle w:val="Normal"/>
-        <w:ind w:hanging="0"/>
-        <w:rPr>
-          <w:lang w:val="en-GB"/>
-        </w:rPr>
-      </w:pPr>
-      <w:r>
+        <w:ind w:firstLine="0"/>
+        <w:rPr>
+          <w:lang w:val="en-GB"/>
+        </w:rPr>
+      </w:pPr>
+      <w:r>
+        <w:rPr>
+          <w:lang w:val="en-GB"/>
+        </w:rPr>
+        <w:t xml:space="preserve"> 9. Use appropriate significant figures, i.e., number of decimal places.</w:t>
+      </w:r>
+    </w:p>
+    <w:p>
+      <w:pPr>
+        <w:ind w:firstLine="0"/>
+        <w:rPr>
+          <w:lang w:val="en-GB"/>
+        </w:rPr>
+      </w:pPr>
+      <w:r>
+        <w:rPr>
+          <w:noProof/>
+        </w:rPr>
         <mc:AlternateContent>
           <mc:Choice Requires="wpg">
             <w:drawing>
-              <wp:anchor distT="0" distB="0" distL="114300" distR="114300" simplePos="0" relativeHeight="2" behindDoc="0" locked="0" layoutInCell="0" allowOverlap="1" wp14:anchorId="1DDC4378">
+              <wp:anchor distT="0" distB="0" distL="114300" distR="114300" simplePos="0" relativeHeight="2" behindDoc="0" locked="0" layoutInCell="0" allowOverlap="1" wp14:anchorId="1DDC4378" wp14:editId="727AA8F5">
                 <wp:simplePos x="0" y="0"/>
                 <wp:positionH relativeFrom="column">
                   <wp:posOffset>24130</wp:posOffset>
@@ -1176,6 +1160,7 @@
                 <wp:effectExtent l="0" t="0" r="0" b="0"/>
                 <wp:wrapTopAndBottom/>
                 <wp:docPr id="1" name="Group 3"/>
+                <wp:cNvGraphicFramePr/>
                 <a:graphic xmlns:a="http://schemas.openxmlformats.org/drawingml/2006/main">
                   <a:graphicData uri="http://schemas.microsoft.com/office/word/2010/wordprocessingGroup">
                     <wpg:wgp>
@@ -1194,7 +1179,7 @@
                           <pic:cNvPicPr/>
                         </pic:nvPicPr>
                         <pic:blipFill>
-                          <a:blip r:embed="rId2"/>
+                          <a:blip r:embed="rId7"/>
                           <a:stretch/>
                         </pic:blipFill>
                         <pic:spPr>
@@ -1223,16 +1208,22 @@
                             <a:avLst/>
                           </a:prstGeom>
                           <a:solidFill>
-                            <a:srgbClr val="ffffff"/>
+                            <a:srgbClr val="FFFFFF"/>
                           </a:solidFill>
                           <a:ln w="0">
                             <a:noFill/>
                           </a:ln>
                         </wps:spPr>
                         <wps:style>
-                          <a:lnRef idx="0"/>
-                          <a:fillRef idx="0"/>
-                          <a:effectRef idx="0"/>
+                          <a:lnRef idx="0">
+                            <a:scrgbClr r="0" g="0" b="0"/>
+                          </a:lnRef>
+                          <a:fillRef idx="0">
+                            <a:scrgbClr r="0" g="0" b="0"/>
+                          </a:fillRef>
+                          <a:effectRef idx="0">
+                            <a:scrgbClr r="0" g="0" b="0"/>
+                          </a:effectRef>
                           <a:fontRef idx="minor"/>
                         </wps:style>
                         <wps:txbx>
@@ -1240,11 +1231,10 @@
                             <w:p>
                               <w:pPr>
                                 <w:pStyle w:val="Caption"/>
-                                <w:spacing w:before="0" w:after="200"/>
-                                <w:ind w:hanging="0"/>
+                                <w:ind w:firstLine="0"/>
                                 <w:rPr>
-                                  <w:i w:val="false"/>
-                                  <w:iCs w:val="false"/>
+                                  <w:i w:val="0"/>
+                                  <w:iCs w:val="0"/>
                                   <w:color w:val="auto"/>
                                   <w:sz w:val="20"/>
                                   <w:szCs w:val="20"/>
@@ -1253,8 +1243,8 @@
                               </w:pPr>
                               <w:r>
                                 <w:rPr>
-                                  <w:i w:val="false"/>
-                                  <w:iCs w:val="false"/>
+                                  <w:i w:val="0"/>
+                                  <w:iCs w:val="0"/>
                                   <w:color w:val="auto"/>
                                   <w:sz w:val="20"/>
                                   <w:szCs w:val="20"/>
@@ -1263,8 +1253,8 @@
                               </w:r>
                               <w:r>
                                 <w:rPr>
-                                  <w:i w:val="false"/>
-                                  <w:iCs w:val="false"/>
+                                  <w:i w:val="0"/>
+                                  <w:iCs w:val="0"/>
                                   <w:color w:val="auto"/>
                                   <w:sz w:val="20"/>
                                   <w:szCs w:val="20"/>
@@ -1273,8 +1263,8 @@
                               </w:r>
                               <w:r>
                                 <w:rPr>
-                                  <w:i w:val="false"/>
-                                  <w:iCs w:val="false"/>
+                                  <w:i w:val="0"/>
+                                  <w:iCs w:val="0"/>
                                   <w:color w:val="auto"/>
                                   <w:sz w:val="20"/>
                                   <w:szCs w:val="20"/>
@@ -1283,8 +1273,8 @@
                               </w:r>
                               <w:r>
                                 <w:rPr>
-                                  <w:i w:val="false"/>
-                                  <w:iCs w:val="false"/>
+                                  <w:i w:val="0"/>
+                                  <w:iCs w:val="0"/>
                                   <w:color w:val="auto"/>
                                   <w:sz w:val="20"/>
                                   <w:szCs w:val="20"/>
@@ -1293,8 +1283,8 @@
                               </w:r>
                               <w:r>
                                 <w:rPr>
-                                  <w:i w:val="false"/>
-                                  <w:iCs w:val="false"/>
+                                  <w:i w:val="0"/>
+                                  <w:iCs w:val="0"/>
                                   <w:color w:val="auto"/>
                                   <w:sz w:val="20"/>
                                   <w:szCs w:val="20"/>
@@ -1303,8 +1293,8 @@
                               </w:r>
                               <w:r>
                                 <w:rPr>
-                                  <w:i w:val="false"/>
-                                  <w:iCs w:val="false"/>
+                                  <w:i w:val="0"/>
+                                  <w:iCs w:val="0"/>
                                   <w:color w:val="auto"/>
                                   <w:sz w:val="20"/>
                                   <w:szCs w:val="20"/>
@@ -1313,8 +1303,8 @@
                               </w:r>
                               <w:r>
                                 <w:rPr>
-                                  <w:i w:val="false"/>
-                                  <w:iCs w:val="false"/>
+                                  <w:i w:val="0"/>
+                                  <w:iCs w:val="0"/>
                                   <w:color w:val="auto"/>
                                   <w:sz w:val="20"/>
                                   <w:szCs w:val="20"/>
@@ -1324,7 +1314,7 @@
                             </w:p>
                           </w:txbxContent>
                         </wps:txbx>
-                        <wps:bodyPr lIns="0" rIns="0" tIns="0" bIns="0" anchor="t">
+                        <wps:bodyPr lIns="0" tIns="0" rIns="0" bIns="0" anchor="t">
                           <a:noAutofit/>
                         </wps:bodyPr>
                       </wps:wsp>
@@ -1334,7 +1324,7 @@
               </wp:anchor>
             </w:drawing>
           </mc:Choice>
-          <mc:Fallback>
+          <mc:Fallback xmlns:pic="http://schemas.openxmlformats.org/drawingml/2006/picture">
             <w:pict>
               <v:group id="shape_0" alt="Group 3" style="position:absolute;margin-left:1.9pt;margin-top:10.4pt;width:231.4pt;height:290.45pt" coordorigin="38,208" coordsize="4628,5809">
                 <v:shapetype id="_x0000_t75" coordsize="21600,21600" o:spt="75" o:preferrelative="t" path="m@4@5l@4@11@9@11@9@5xe" filled="f" stroked="f">
@@ -1357,7 +1347,7 @@
                   <o:lock v:ext="edit" aspectratio="t"/>
                 </v:shapetype>
                 <v:shape id="shape_0" stroked="f" o:allowincell="f" style="position:absolute;left:38;top:208;width:4353;height:3056;mso-wrap-style:none;v-text-anchor:middle" type="_x0000_t75">
-                  <v:imagedata r:id="rId3" o:detectmouseclick="t"/>
+                  <v:imagedata r:id="rId8" o:detectmouseclick="t"/>
                   <v:stroke color="#3465a4" joinstyle="round" endcap="flat"/>
                   <w10:wrap type="topAndBottom"/>
                 </v:shape>
@@ -1469,8 +1459,7 @@
     </w:p>
     <w:p>
       <w:pPr>
-        <w:pStyle w:val="Normal"/>
-        <w:ind w:hanging="0"/>
+        <w:ind w:firstLine="0"/>
         <w:rPr>
           <w:lang w:val="en-GB"/>
         </w:rPr>
@@ -1484,30 +1473,56 @@
     </w:p>
     <w:p>
       <w:pPr>
-        <w:pStyle w:val="Normal"/>
-        <w:ind w:hanging="0"/>
-        <w:rPr>
-          <w:lang w:val="en-GB"/>
-        </w:rPr>
-      </w:pPr>
-      <w:r>
-        <w:rPr>
-          <w:lang w:val="en-GB"/>
-        </w:rPr>
-        <w:t>12. Note that a significant portion of the population has color perception issues and/or your article may be viewed in black and white. Color your figures accordingly.</w:t>
+        <w:ind w:firstLine="0"/>
+        <w:rPr>
+          <w:lang w:val="en-GB"/>
+        </w:rPr>
+      </w:pPr>
+      <w:r>
+        <w:rPr>
+          <w:lang w:val="en-GB"/>
+        </w:rPr>
+        <w:t xml:space="preserve">12. Note that a significant portion of the population has </w:t>
+      </w:r>
+      <w:proofErr w:type="spellStart"/>
+      <w:r>
+        <w:rPr>
+          <w:lang w:val="en-GB"/>
+        </w:rPr>
+        <w:t>color</w:t>
+      </w:r>
+      <w:proofErr w:type="spellEnd"/>
+      <w:r>
+        <w:rPr>
+          <w:lang w:val="en-GB"/>
+        </w:rPr>
+        <w:t xml:space="preserve"> perception issues and/or your article may be viewed in black and white. </w:t>
+      </w:r>
+      <w:proofErr w:type="spellStart"/>
+      <w:r>
+        <w:rPr>
+          <w:lang w:val="en-GB"/>
+        </w:rPr>
+        <w:t>Color</w:t>
+      </w:r>
+      <w:proofErr w:type="spellEnd"/>
+      <w:r>
+        <w:rPr>
+          <w:lang w:val="en-GB"/>
+        </w:rPr>
+        <w:t xml:space="preserve"> your figures accordingly.</w:t>
       </w:r>
       <w:r>
         <w:rPr>
           <w:rStyle w:val="FootnoteReference"/>
           <w:lang w:val="en-GB"/>
         </w:rPr>
-        <w:footnoteReference w:id="2"/>
-      </w:r>
-    </w:p>
-    <w:p>
-      <w:pPr>
-        <w:pStyle w:val="Normal"/>
-        <w:ind w:hanging="0"/>
+        <w:footnoteReference w:id="1"/>
+      </w:r>
+    </w:p>
+    <w:p>
+      <w:pPr>
+        <w:ind w:firstLine="0"/>
         <w:rPr>
           <w:lang w:val="en-GB"/>
         </w:rPr>
@@ -1521,8 +1536,7 @@
     </w:p>
     <w:p>
       <w:pPr>
-        <w:pStyle w:val="Normal"/>
-        <w:ind w:hanging="0"/>
+        <w:ind w:firstLine="0"/>
         <w:rPr>
           <w:lang w:val="en-GB"/>
         </w:rPr>
@@ -1536,8 +1550,7 @@
     </w:p>
     <w:p>
       <w:pPr>
-        <w:pStyle w:val="Normal"/>
-        <w:ind w:hanging="0"/>
+        <w:ind w:firstLine="0"/>
         <w:rPr>
           <w:lang w:val="en-GB"/>
         </w:rPr>
@@ -1551,9 +1564,8 @@
     </w:p>
     <w:p>
       <w:pPr>
-        <w:pStyle w:val="Normal"/>
-        <w:spacing w:before="0" w:after="240"/>
-        <w:ind w:hanging="0"/>
+        <w:spacing w:after="240"/>
+        <w:ind w:firstLine="0"/>
         <w:rPr>
           <w:lang w:val="en-GB"/>
         </w:rPr>
@@ -1569,15 +1581,8 @@
       <w:tblPr>
         <w:tblW w:w="4106" w:type="dxa"/>
         <w:jc w:val="center"/>
-        <w:tblInd w:w="0" w:type="dxa"/>
         <w:tblLayout w:type="fixed"/>
-        <w:tblCellMar>
-          <w:top w:w="0" w:type="dxa"/>
-          <w:start w:w="108" w:type="dxa"/>
-          <w:bottom w:w="0" w:type="dxa"/>
-          <w:end w:w="108" w:type="dxa"/>
-        </w:tblCellMar>
-        <w:tblLook w:val="0020" w:noHBand="0" w:noVBand="0" w:firstColumn="0" w:lastRow="0" w:lastColumn="0" w:firstRow="1"/>
+        <w:tblLook w:val="0020" w:firstRow="1" w:lastRow="0" w:firstColumn="0" w:lastColumn="0" w:noHBand="0" w:noVBand="0"/>
       </w:tblPr>
       <w:tblGrid>
         <w:gridCol w:w="2268"/>
@@ -1585,7 +1590,9 @@
         <w:gridCol w:w="706"/>
       </w:tblGrid>
       <w:tr>
-        <w:trPr/>
+        <w:trPr>
+          <w:jc w:val="center"/>
+        </w:trPr>
         <w:tc>
           <w:tcPr>
             <w:tcW w:w="2268" w:type="dxa"/>
@@ -1657,7 +1664,9 @@
         </w:tc>
       </w:tr>
       <w:tr>
-        <w:trPr/>
+        <w:trPr>
+          <w:jc w:val="center"/>
+        </w:trPr>
         <w:tc>
           <w:tcPr>
             <w:tcW w:w="2268" w:type="dxa"/>
@@ -1698,8 +1707,16 @@
               <w:rPr>
                 <w:lang w:val="en-GB"/>
               </w:rPr>
-              <w:t>14 point</w:t>
+              <w:t xml:space="preserve">14 </w:t>
             </w:r>
+            <w:proofErr w:type="gramStart"/>
+            <w:r>
+              <w:rPr>
+                <w:lang w:val="en-GB"/>
+              </w:rPr>
+              <w:t>point</w:t>
+            </w:r>
+            <w:proofErr w:type="gramEnd"/>
           </w:p>
         </w:tc>
         <w:tc>
@@ -1726,11 +1743,12 @@
         </w:tc>
       </w:tr>
       <w:tr>
-        <w:trPr/>
+        <w:trPr>
+          <w:jc w:val="center"/>
+        </w:trPr>
         <w:tc>
           <w:tcPr>
             <w:tcW w:w="2268" w:type="dxa"/>
-            <w:tcBorders/>
           </w:tcPr>
           <w:p>
             <w:pPr>
@@ -1750,7 +1768,6 @@
         <w:tc>
           <w:tcPr>
             <w:tcW w:w="1132" w:type="dxa"/>
-            <w:tcBorders/>
           </w:tcPr>
           <w:p>
             <w:pPr>
@@ -1763,14 +1780,21 @@
               <w:rPr>
                 <w:lang w:val="en-GB"/>
               </w:rPr>
-              <w:t>12 point</w:t>
+              <w:t xml:space="preserve">12 </w:t>
             </w:r>
+            <w:proofErr w:type="gramStart"/>
+            <w:r>
+              <w:rPr>
+                <w:lang w:val="en-GB"/>
+              </w:rPr>
+              <w:t>point</w:t>
+            </w:r>
+            <w:proofErr w:type="gramEnd"/>
           </w:p>
         </w:tc>
         <w:tc>
           <w:tcPr>
             <w:tcW w:w="706" w:type="dxa"/>
-            <w:tcBorders/>
           </w:tcPr>
           <w:p>
             <w:pPr>
@@ -1779,20 +1803,16 @@
                 <w:lang w:val="en-GB"/>
               </w:rPr>
             </w:pPr>
-            <w:r>
-              <w:rPr>
-                <w:lang w:val="en-GB"/>
-              </w:rPr>
-            </w:r>
           </w:p>
         </w:tc>
       </w:tr>
       <w:tr>
-        <w:trPr/>
+        <w:trPr>
+          <w:jc w:val="center"/>
+        </w:trPr>
         <w:tc>
           <w:tcPr>
             <w:tcW w:w="2268" w:type="dxa"/>
-            <w:tcBorders/>
           </w:tcPr>
           <w:p>
             <w:pPr>
@@ -1812,7 +1832,6 @@
         <w:tc>
           <w:tcPr>
             <w:tcW w:w="1132" w:type="dxa"/>
-            <w:tcBorders/>
           </w:tcPr>
           <w:p>
             <w:pPr>
@@ -1825,14 +1844,21 @@
               <w:rPr>
                 <w:lang w:val="en-GB"/>
               </w:rPr>
-              <w:t>11 point</w:t>
+              <w:t xml:space="preserve">11 </w:t>
             </w:r>
+            <w:proofErr w:type="gramStart"/>
+            <w:r>
+              <w:rPr>
+                <w:lang w:val="en-GB"/>
+              </w:rPr>
+              <w:t>point</w:t>
+            </w:r>
+            <w:proofErr w:type="gramEnd"/>
           </w:p>
         </w:tc>
         <w:tc>
           <w:tcPr>
             <w:tcW w:w="706" w:type="dxa"/>
-            <w:tcBorders/>
           </w:tcPr>
           <w:p>
             <w:pPr>
@@ -1851,11 +1877,12 @@
         </w:tc>
       </w:tr>
       <w:tr>
-        <w:trPr/>
+        <w:trPr>
+          <w:jc w:val="center"/>
+        </w:trPr>
         <w:tc>
           <w:tcPr>
             <w:tcW w:w="2268" w:type="dxa"/>
-            <w:tcBorders/>
           </w:tcPr>
           <w:p>
             <w:pPr>
@@ -1875,7 +1902,6 @@
         <w:tc>
           <w:tcPr>
             <w:tcW w:w="1132" w:type="dxa"/>
-            <w:tcBorders/>
           </w:tcPr>
           <w:p>
             <w:pPr>
@@ -1888,14 +1914,21 @@
               <w:rPr>
                 <w:lang w:val="en-GB"/>
               </w:rPr>
-              <w:t>12 point</w:t>
+              <w:t xml:space="preserve">12 </w:t>
             </w:r>
+            <w:proofErr w:type="gramStart"/>
+            <w:r>
+              <w:rPr>
+                <w:lang w:val="en-GB"/>
+              </w:rPr>
+              <w:t>point</w:t>
+            </w:r>
+            <w:proofErr w:type="gramEnd"/>
           </w:p>
         </w:tc>
         <w:tc>
           <w:tcPr>
             <w:tcW w:w="706" w:type="dxa"/>
-            <w:tcBorders/>
           </w:tcPr>
           <w:p>
             <w:pPr>
@@ -1914,11 +1947,12 @@
         </w:tc>
       </w:tr>
       <w:tr>
-        <w:trPr/>
+        <w:trPr>
+          <w:jc w:val="center"/>
+        </w:trPr>
         <w:tc>
           <w:tcPr>
             <w:tcW w:w="2268" w:type="dxa"/>
-            <w:tcBorders/>
           </w:tcPr>
           <w:p>
             <w:pPr>
@@ -1938,7 +1972,6 @@
         <w:tc>
           <w:tcPr>
             <w:tcW w:w="1132" w:type="dxa"/>
-            <w:tcBorders/>
           </w:tcPr>
           <w:p>
             <w:pPr>
@@ -1951,14 +1984,21 @@
               <w:rPr>
                 <w:lang w:val="en-GB"/>
               </w:rPr>
-              <w:t>10 point</w:t>
+              <w:t xml:space="preserve">10 </w:t>
             </w:r>
+            <w:proofErr w:type="gramStart"/>
+            <w:r>
+              <w:rPr>
+                <w:lang w:val="en-GB"/>
+              </w:rPr>
+              <w:t>point</w:t>
+            </w:r>
+            <w:proofErr w:type="gramEnd"/>
           </w:p>
         </w:tc>
         <w:tc>
           <w:tcPr>
             <w:tcW w:w="706" w:type="dxa"/>
-            <w:tcBorders/>
           </w:tcPr>
           <w:p>
             <w:pPr>
@@ -1977,11 +2017,12 @@
         </w:tc>
       </w:tr>
       <w:tr>
-        <w:trPr/>
+        <w:trPr>
+          <w:jc w:val="center"/>
+        </w:trPr>
         <w:tc>
           <w:tcPr>
             <w:tcW w:w="2268" w:type="dxa"/>
-            <w:tcBorders/>
           </w:tcPr>
           <w:p>
             <w:pPr>
@@ -2001,7 +2042,6 @@
         <w:tc>
           <w:tcPr>
             <w:tcW w:w="1132" w:type="dxa"/>
-            <w:tcBorders/>
           </w:tcPr>
           <w:p>
             <w:pPr>
@@ -2014,14 +2054,21 @@
               <w:rPr>
                 <w:lang w:val="en-GB"/>
               </w:rPr>
-              <w:t>9 point</w:t>
+              <w:t xml:space="preserve">9 </w:t>
             </w:r>
+            <w:proofErr w:type="gramStart"/>
+            <w:r>
+              <w:rPr>
+                <w:lang w:val="en-GB"/>
+              </w:rPr>
+              <w:t>point</w:t>
+            </w:r>
+            <w:proofErr w:type="gramEnd"/>
           </w:p>
         </w:tc>
         <w:tc>
           <w:tcPr>
             <w:tcW w:w="706" w:type="dxa"/>
-            <w:tcBorders/>
           </w:tcPr>
           <w:p>
             <w:pPr>
@@ -2040,7 +2087,9 @@
         </w:tc>
       </w:tr>
       <w:tr>
-        <w:trPr/>
+        <w:trPr>
+          <w:jc w:val="center"/>
+        </w:trPr>
         <w:tc>
           <w:tcPr>
             <w:tcW w:w="2268" w:type="dxa"/>
@@ -2059,6 +2108,7 @@
               <w:rPr>
                 <w:lang w:val="en-GB"/>
               </w:rPr>
+              <w:lastRenderedPageBreak/>
               <w:t>All other text</w:t>
             </w:r>
           </w:p>
@@ -2073,14 +2123,21 @@
           <w:p>
             <w:pPr>
               <w:pStyle w:val="Table"/>
-              <w:rPr/>
             </w:pPr>
             <w:r>
               <w:rPr>
                 <w:lang w:val="en-GB"/>
               </w:rPr>
-              <w:t>10 point</w:t>
+              <w:t xml:space="preserve">10 </w:t>
             </w:r>
+            <w:proofErr w:type="gramStart"/>
+            <w:r>
+              <w:rPr>
+                <w:lang w:val="en-GB"/>
+              </w:rPr>
+              <w:t>point</w:t>
+            </w:r>
+            <w:proofErr w:type="gramEnd"/>
           </w:p>
         </w:tc>
         <w:tc>
@@ -2093,50 +2150,28 @@
           <w:p>
             <w:pPr>
               <w:pStyle w:val="Table"/>
-              <w:keepNext w:val="true"/>
-              <w:rPr/>
+              <w:keepNext/>
             </w:pPr>
-            <w:r>
-              <w:rPr/>
-            </w:r>
           </w:p>
         </w:tc>
       </w:tr>
     </w:tbl>
     <w:p>
       <w:pPr>
-        <w:pStyle w:val="Normal"/>
         <w:jc w:val="center"/>
         <w:rPr>
           <w:lang w:val="en-GB"/>
         </w:rPr>
       </w:pPr>
       <w:r>
-        <w:rPr/>
         <w:t xml:space="preserve">Table </w:t>
       </w:r>
-      <w:r>
-        <w:rPr/>
-        <w:fldChar w:fldCharType="begin"/>
-      </w:r>
-      <w:r>
-        <w:rPr/>
-        <w:instrText xml:space="preserve"> SEQ Table \* ARABIC </w:instrText>
-      </w:r>
-      <w:r>
-        <w:rPr/>
-        <w:fldChar w:fldCharType="separate"/>
-      </w:r>
-      <w:r>
-        <w:rPr/>
-        <w:t>1</w:t>
-      </w:r>
-      <w:r>
-        <w:rPr/>
-        <w:fldChar w:fldCharType="end"/>
-      </w:r>
-      <w:r>
-        <w:rPr/>
+      <w:fldSimple w:instr=" SEQ Table \* ARABIC ">
+        <w:r>
+          <w:t>1</w:t>
+        </w:r>
+      </w:fldSimple>
+      <w:r>
         <w:t xml:space="preserve">.  </w:t>
       </w:r>
       <w:r>
@@ -2148,13 +2183,8 @@
     </w:p>
     <w:p>
       <w:pPr>
-        <w:pStyle w:val="Normal"/>
-        <w:ind w:hanging="0"/>
-        <w:rPr/>
-      </w:pPr>
-      <w:r>
-        <w:rPr/>
-      </w:r>
+        <w:ind w:firstLine="0"/>
+      </w:pPr>
     </w:p>
     <w:p>
       <w:pPr>
@@ -2162,45 +2192,36 @@
         <w:tabs>
           <w:tab w:val="clear" w:pos="720"/>
         </w:tabs>
-        <w:rPr/>
-      </w:pPr>
-      <w:r>
-        <w:rPr/>
+      </w:pPr>
+      <w:r>
         <w:t>3.</w:t>
+      </w:r>
+      <w:r>
         <w:tab/>
         <w:t>Results</w:t>
       </w:r>
     </w:p>
     <w:p>
       <w:pPr>
-        <w:pStyle w:val="Normal"/>
         <w:ind w:firstLine="224"/>
-        <w:rPr/>
-      </w:pPr>
-      <w:r>
-        <w:rPr/>
+      </w:pPr>
+      <w:r>
         <w:t xml:space="preserve">Present your results here. We expect this to take approximately one half to one page. Remember to report the Challenge scores (weighted accuracy metric for the murmur detection task, and cost for the clinical outcome identification task) on the training, validation, and test sets. The scores that you receive from us before the conference use the hid- den validation set, and the scores that you receive from us after the conference use the hidden test set. You can use other metrics to provide insight into your method, but you should clearly report the Challenge scores. </w:t>
       </w:r>
     </w:p>
     <w:p>
       <w:pPr>
-        <w:pStyle w:val="Normal"/>
         <w:ind w:firstLine="224"/>
-        <w:rPr/>
-      </w:pPr>
-      <w:r>
-        <w:rPr/>
+      </w:pPr>
+      <w:r>
         <w:t xml:space="preserve">You should include a table (see Tables 2) to summarize your results. Follow the guidelines detailed in the methods. Comparing your results to others in the field is important, and this should be updated after the final scores are released. Please do not change the format of the table, which allows your readers to easily compare your results with other papers. </w:t>
       </w:r>
     </w:p>
     <w:p>
       <w:pPr>
-        <w:pStyle w:val="Normal"/>
         <w:ind w:firstLine="224"/>
-        <w:rPr/>
-      </w:pPr>
-      <w:r>
-        <w:rPr/>
+      </w:pPr>
+      <w:r>
         <w:t xml:space="preserve">Do not discuss your results here – save interpretation for the next section. </w:t>
       </w:r>
     </w:p>
@@ -2208,15 +2229,8 @@
       <w:tblPr>
         <w:tblW w:w="4140" w:type="dxa"/>
         <w:jc w:val="center"/>
-        <w:tblInd w:w="0" w:type="dxa"/>
         <w:tblLayout w:type="fixed"/>
-        <w:tblCellMar>
-          <w:top w:w="0" w:type="dxa"/>
-          <w:start w:w="108" w:type="dxa"/>
-          <w:bottom w:w="0" w:type="dxa"/>
-          <w:end w:w="108" w:type="dxa"/>
-        </w:tblCellMar>
-        <w:tblLook w:val="0020" w:noHBand="0" w:noVBand="0" w:firstColumn="0" w:lastRow="0" w:lastColumn="0" w:firstRow="1"/>
+        <w:tblLook w:val="0020" w:firstRow="1" w:lastRow="0" w:firstColumn="0" w:lastColumn="0" w:noHBand="0" w:noVBand="0"/>
       </w:tblPr>
       <w:tblGrid>
         <w:gridCol w:w="1350"/>
@@ -2225,19 +2239,21 @@
         <w:gridCol w:w="898"/>
       </w:tblGrid>
       <w:tr>
-        <w:trPr/>
+        <w:trPr>
+          <w:jc w:val="center"/>
+        </w:trPr>
         <w:tc>
           <w:tcPr>
             <w:tcW w:w="1350" w:type="dxa"/>
             <w:tcBorders>
               <w:bottom w:val="single" w:sz="6" w:space="0" w:color="808080"/>
-              <w:end w:val="single" w:sz="4" w:space="0" w:color="000000"/>
+              <w:right w:val="single" w:sz="4" w:space="0" w:color="000000"/>
             </w:tcBorders>
           </w:tcPr>
           <w:p>
             <w:pPr>
               <w:pStyle w:val="Table"/>
-              <w:jc w:val="end"/>
+              <w:jc w:val="right"/>
               <w:rPr>
                 <w:lang w:val="en-GB"/>
               </w:rPr>
@@ -2254,15 +2270,15 @@
           <w:tcPr>
             <w:tcW w:w="1085" w:type="dxa"/>
             <w:tcBorders>
-              <w:start w:val="single" w:sz="4" w:space="0" w:color="000000"/>
+              <w:left w:val="single" w:sz="4" w:space="0" w:color="000000"/>
               <w:bottom w:val="single" w:sz="6" w:space="0" w:color="808080"/>
-              <w:end w:val="single" w:sz="4" w:space="0" w:color="000000"/>
+              <w:right w:val="single" w:sz="4" w:space="0" w:color="000000"/>
             </w:tcBorders>
           </w:tcPr>
           <w:p>
             <w:pPr>
               <w:pStyle w:val="Table"/>
-              <w:jc w:val="end"/>
+              <w:jc w:val="right"/>
               <w:rPr>
                 <w:lang w:val="en-GB"/>
               </w:rPr>
@@ -2279,15 +2295,15 @@
           <w:tcPr>
             <w:tcW w:w="807" w:type="dxa"/>
             <w:tcBorders>
-              <w:start w:val="single" w:sz="4" w:space="0" w:color="000000"/>
+              <w:left w:val="single" w:sz="4" w:space="0" w:color="000000"/>
               <w:bottom w:val="single" w:sz="6" w:space="0" w:color="808080"/>
-              <w:end w:val="single" w:sz="4" w:space="0" w:color="000000"/>
+              <w:right w:val="single" w:sz="4" w:space="0" w:color="000000"/>
             </w:tcBorders>
           </w:tcPr>
           <w:p>
             <w:pPr>
               <w:pStyle w:val="Table"/>
-              <w:jc w:val="end"/>
+              <w:jc w:val="right"/>
               <w:rPr>
                 <w:lang w:val="en-GB"/>
               </w:rPr>
@@ -2304,14 +2320,14 @@
           <w:tcPr>
             <w:tcW w:w="898" w:type="dxa"/>
             <w:tcBorders>
-              <w:start w:val="single" w:sz="4" w:space="0" w:color="000000"/>
+              <w:left w:val="single" w:sz="4" w:space="0" w:color="000000"/>
               <w:bottom w:val="single" w:sz="6" w:space="0" w:color="808080"/>
             </w:tcBorders>
           </w:tcPr>
           <w:p>
             <w:pPr>
               <w:pStyle w:val="Table"/>
-              <w:jc w:val="end"/>
+              <w:jc w:val="right"/>
               <w:rPr>
                 <w:lang w:val="en-GB"/>
               </w:rPr>
@@ -2326,19 +2342,21 @@
         </w:tc>
       </w:tr>
       <w:tr>
-        <w:trPr/>
+        <w:trPr>
+          <w:jc w:val="center"/>
+        </w:trPr>
         <w:tc>
           <w:tcPr>
             <w:tcW w:w="1350" w:type="dxa"/>
             <w:tcBorders>
               <w:bottom w:val="single" w:sz="12" w:space="0" w:color="808080"/>
-              <w:end w:val="single" w:sz="4" w:space="0" w:color="000000"/>
+              <w:right w:val="single" w:sz="4" w:space="0" w:color="000000"/>
             </w:tcBorders>
           </w:tcPr>
           <w:p>
             <w:pPr>
               <w:pStyle w:val="Table"/>
-              <w:jc w:val="end"/>
+              <w:jc w:val="right"/>
               <w:rPr>
                 <w:lang w:val="en-GB"/>
               </w:rPr>
@@ -2355,15 +2373,15 @@
           <w:tcPr>
             <w:tcW w:w="1085" w:type="dxa"/>
             <w:tcBorders>
-              <w:start w:val="single" w:sz="4" w:space="0" w:color="000000"/>
+              <w:left w:val="single" w:sz="4" w:space="0" w:color="000000"/>
               <w:bottom w:val="single" w:sz="12" w:space="0" w:color="808080"/>
-              <w:end w:val="single" w:sz="4" w:space="0" w:color="000000"/>
+              <w:right w:val="single" w:sz="4" w:space="0" w:color="000000"/>
             </w:tcBorders>
           </w:tcPr>
           <w:p>
             <w:pPr>
               <w:pStyle w:val="Table"/>
-              <w:jc w:val="end"/>
+              <w:jc w:val="right"/>
               <w:rPr>
                 <w:lang w:val="en-GB"/>
               </w:rPr>
@@ -2380,15 +2398,15 @@
           <w:tcPr>
             <w:tcW w:w="807" w:type="dxa"/>
             <w:tcBorders>
-              <w:start w:val="single" w:sz="4" w:space="0" w:color="000000"/>
+              <w:left w:val="single" w:sz="4" w:space="0" w:color="000000"/>
               <w:bottom w:val="single" w:sz="12" w:space="0" w:color="808080"/>
-              <w:end w:val="single" w:sz="4" w:space="0" w:color="000000"/>
+              <w:right w:val="single" w:sz="4" w:space="0" w:color="000000"/>
             </w:tcBorders>
           </w:tcPr>
           <w:p>
             <w:pPr>
               <w:pStyle w:val="Table"/>
-              <w:jc w:val="end"/>
+              <w:jc w:val="right"/>
               <w:rPr>
                 <w:lang w:val="en-GB"/>
               </w:rPr>
@@ -2405,15 +2423,15 @@
           <w:tcPr>
             <w:tcW w:w="898" w:type="dxa"/>
             <w:tcBorders>
-              <w:start w:val="single" w:sz="4" w:space="0" w:color="000000"/>
+              <w:left w:val="single" w:sz="4" w:space="0" w:color="000000"/>
               <w:bottom w:val="single" w:sz="12" w:space="0" w:color="808080"/>
             </w:tcBorders>
           </w:tcPr>
           <w:p>
             <w:pPr>
               <w:pStyle w:val="Table"/>
-              <w:keepNext w:val="true"/>
-              <w:jc w:val="end"/>
+              <w:keepNext/>
+              <w:jc w:val="right"/>
               <w:rPr>
                 <w:lang w:val="en-GB"/>
               </w:rPr>
@@ -2431,11 +2449,11 @@
     <w:p>
       <w:pPr>
         <w:pStyle w:val="Caption"/>
-        <w:ind w:hanging="0"/>
-        <w:rPr>
-          <w:i w:val="false"/>
-          <w:iCs w:val="false"/>
-          <w:color w:themeColor="text1" w:val="000000"/>
+        <w:ind w:firstLine="0"/>
+        <w:rPr>
+          <w:i w:val="0"/>
+          <w:iCs w:val="0"/>
+          <w:color w:val="000000" w:themeColor="text1"/>
           <w:sz w:val="20"/>
           <w:szCs w:val="20"/>
           <w:lang w:val="en-GB"/>
@@ -2443,9 +2461,9 @@
       </w:pPr>
       <w:r>
         <w:rPr>
-          <w:i w:val="false"/>
-          <w:iCs w:val="false"/>
-          <w:color w:themeColor="text1" w:val="000000"/>
+          <w:i w:val="0"/>
+          <w:iCs w:val="0"/>
+          <w:color w:val="000000" w:themeColor="text1"/>
           <w:sz w:val="20"/>
           <w:szCs w:val="20"/>
         </w:rPr>
@@ -2453,9 +2471,9 @@
       </w:r>
       <w:r>
         <w:rPr>
-          <w:i w:val="false"/>
-          <w:iCs w:val="false"/>
-          <w:color w:themeColor="text1" w:val="000000"/>
+          <w:i w:val="0"/>
+          <w:iCs w:val="0"/>
+          <w:color w:val="000000" w:themeColor="text1"/>
           <w:sz w:val="20"/>
           <w:szCs w:val="20"/>
           <w:lang w:val="en-GB"/>
@@ -2466,29 +2484,25 @@
     <w:p>
       <w:pPr>
         <w:pStyle w:val="Heading"/>
-        <w:rPr/>
-      </w:pPr>
-      <w:r>
-        <w:rPr/>
+      </w:pPr>
+      <w:r>
         <w:t>4.</w:t>
+      </w:r>
+      <w:r>
         <w:tab/>
         <w:t>Discussion and Conclusions</w:t>
       </w:r>
     </w:p>
     <w:p>
       <w:pPr>
-        <w:pStyle w:val="Normal"/>
         <w:ind w:firstLine="224"/>
-        <w:rPr/>
-      </w:pPr>
-      <w:r>
-        <w:rPr/>
+      </w:pPr>
+      <w:r>
         <w:t xml:space="preserve">This section can be two separate sections or one combined section. We expect this to take up one half to one page, with the references taking the remainder of the article’s four-page limit. </w:t>
       </w:r>
     </w:p>
     <w:p>
       <w:pPr>
-        <w:pStyle w:val="Normal"/>
         <w:ind w:firstLine="224"/>
         <w:rPr>
           <w:lang w:val="en-GB"/>
@@ -2503,7 +2517,6 @@
     </w:p>
     <w:p>
       <w:pPr>
-        <w:pStyle w:val="Normal"/>
         <w:ind w:firstLine="224"/>
         <w:rPr>
           <w:lang w:val="en-GB"/>
@@ -2518,7 +2531,6 @@
     </w:p>
     <w:p>
       <w:pPr>
-        <w:pStyle w:val="Normal"/>
         <w:ind w:firstLine="224"/>
         <w:rPr>
           <w:lang w:val="en-GB"/>
@@ -2533,7 +2545,6 @@
     </w:p>
     <w:p>
       <w:pPr>
-        <w:pStyle w:val="Normal"/>
         <w:ind w:firstLine="224"/>
         <w:rPr>
           <w:lang w:val="en-GB"/>
@@ -2543,12 +2554,17 @@
         <w:rPr>
           <w:lang w:val="en-GB"/>
         </w:rPr>
-        <w:t>This article has a limit of 4 pages, including the title, authors, abstract, acknowledgments, references, and an address for correspondence. If you have extra space, then we recommend that you add more detail to your methods. It should be easy to write more than 3 pages and difficult to write less than 4 pages.</w:t>
-      </w:r>
-    </w:p>
-    <w:p>
-      <w:pPr>
-        <w:pStyle w:val="Normal"/>
+        <w:t xml:space="preserve">This article has a limit of 4 pages, including the title, authors, abstract, acknowledgments, references, and an address for correspondence. If you have extra space, then </w:t>
+      </w:r>
+      <w:r>
+        <w:rPr>
+          <w:lang w:val="en-GB"/>
+        </w:rPr>
+        <w:t>we recommend that you add more detail to your methods. It should be easy to write more than 3 pages and difficult to write less than 4 pages.</w:t>
+      </w:r>
+    </w:p>
+    <w:p>
+      <w:pPr>
         <w:ind w:firstLine="224"/>
         <w:rPr>
           <w:lang w:val="en-GB"/>
@@ -2563,8 +2579,7 @@
     </w:p>
     <w:p>
       <w:pPr>
-        <w:pStyle w:val="Normal"/>
-        <w:spacing w:before="0" w:after="240"/>
+        <w:spacing w:after="240"/>
         <w:ind w:firstLine="224"/>
         <w:rPr>
           <w:lang w:val="en-GB"/>
@@ -2588,7 +2603,21 @@
         <w:rPr>
           <w:lang w:val="en-GB"/>
         </w:rPr>
-        <w:t xml:space="preserve"> carefully. Look for repetitions of the same article and capitalize all Journal Names Like This. (This is called ‘title case’.) Be sure that all abbreviations and names are capitalized. Be sure you have included the full references, including volume, issue, pages, etc. Look for errors in accents that have been introduced by copy and paste. Sloppy references make the reader think that your research is sloppy and will be rejected. Acceptance of your article is not guaranteed – it will be reviewed for all of the criteria specified in this document.</w:t>
+        <w:t xml:space="preserve"> carefully. Look for repetitions of the same article and capitalize all Journal Names Like This. (This is called ‘title case’.) Be sure that all abbreviations and names are capitalized. Be sure you have included the full references, including volume, issue, pages, etc. Look for errors in accents that have been introduced by copy and paste. Sloppy references make the reader think that your research is sloppy and will be rejected. Acceptance of your article is not guaranteed – it will be reviewed for </w:t>
+      </w:r>
+      <w:proofErr w:type="gramStart"/>
+      <w:r>
+        <w:rPr>
+          <w:lang w:val="en-GB"/>
+        </w:rPr>
+        <w:t>all of</w:t>
+      </w:r>
+      <w:proofErr w:type="gramEnd"/>
+      <w:r>
+        <w:rPr>
+          <w:lang w:val="en-GB"/>
+        </w:rPr>
+        <w:t xml:space="preserve"> the criteria specified in this document.</w:t>
       </w:r>
     </w:p>
     <w:p>
@@ -2597,44 +2626,31 @@
         <w:tabs>
           <w:tab w:val="clear" w:pos="720"/>
         </w:tabs>
-        <w:rPr/>
-      </w:pPr>
-      <w:r>
-        <w:rPr/>
+      </w:pPr>
+      <w:r>
         <w:t>Acknowledgments</w:t>
       </w:r>
     </w:p>
     <w:p>
       <w:pPr>
-        <w:pStyle w:val="Normal"/>
         <w:ind w:firstLine="224"/>
-        <w:rPr/>
-      </w:pPr>
-      <w:r>
-        <w:rPr/>
+      </w:pPr>
+      <w:r>
         <w:t xml:space="preserve">Provide any acknowledgments and conflicts of interest here. This section should include the official organization that funded you, if relevant, and anyone who contributed but not enough to gain authorship (e.g., those that provided advice, code, and non-Challenge data). </w:t>
       </w:r>
     </w:p>
     <w:p>
       <w:pPr>
-        <w:pStyle w:val="Normal"/>
         <w:ind w:firstLine="224"/>
-        <w:rPr/>
-      </w:pPr>
-      <w:r>
-        <w:rPr/>
+      </w:pPr>
+      <w:r>
         <w:t>Please do not thank the organizers of the Challenge or the providers of the Challenge data. A good paper is appreciation enough. We would rather that you added one useful line to the methods than thanked us!</w:t>
       </w:r>
     </w:p>
     <w:p>
       <w:pPr>
-        <w:pStyle w:val="Normal"/>
         <w:ind w:firstLine="224"/>
-        <w:rPr/>
-      </w:pPr>
-      <w:r>
-        <w:rPr/>
-      </w:r>
+      </w:pPr>
     </w:p>
     <w:p>
       <w:pPr>
@@ -2642,24 +2658,46 @@
         <w:tabs>
           <w:tab w:val="clear" w:pos="720"/>
         </w:tabs>
-        <w:rPr/>
-      </w:pPr>
-      <w:r>
-        <w:rPr/>
+      </w:pPr>
+      <w:r>
         <w:t>References</w:t>
       </w:r>
     </w:p>
     <w:p>
       <w:pPr>
         <w:pStyle w:val="Reference"/>
-        <w:jc w:val="start"/>
-        <w:rPr/>
-      </w:pPr>
-      <w:r>
-        <w:rPr/>
-        <w:t>[1] Goldberger AL, Amaral LA, Glass L, Hausdorff JM, Ivanov</w:t>
+        <w:jc w:val="left"/>
+      </w:pPr>
+      <w:r>
+        <w:t xml:space="preserve">[1] Goldberger AL, Amaral LA, Glass L, </w:t>
+      </w:r>
+      <w:proofErr w:type="spellStart"/>
+      <w:r>
+        <w:t>Hausdorff</w:t>
+      </w:r>
+      <w:proofErr w:type="spellEnd"/>
+      <w:r>
+        <w:t xml:space="preserve"> JM, Ivanov</w:t>
+      </w:r>
+      <w:r>
         <w:br/>
-        <w:t xml:space="preserve">PC, Mark RG, et al. PhysioBank, PhysioToolkit, and PhysioNet: Components of a New Research Resource for Complex Physiologic Signals. </w:t>
+        <w:t xml:space="preserve">PC, Mark RG, et al. </w:t>
+      </w:r>
+      <w:proofErr w:type="spellStart"/>
+      <w:r>
+        <w:t>PhysioBank</w:t>
+      </w:r>
+      <w:proofErr w:type="spellEnd"/>
+      <w:r>
+        <w:t xml:space="preserve">, </w:t>
+      </w:r>
+      <w:proofErr w:type="spellStart"/>
+      <w:r>
+        <w:t>PhysioToolkit</w:t>
+      </w:r>
+      <w:proofErr w:type="spellEnd"/>
+      <w:r>
+        <w:t xml:space="preserve">, and PhysioNet: Components of a New Research Resource for Complex Physiologic Signals. </w:t>
       </w:r>
       <w:r>
         <w:rPr>
@@ -2669,19 +2707,32 @@
         <w:t>Circulation</w:t>
       </w:r>
       <w:r>
-        <w:rPr/>
-        <w:t xml:space="preserve"> 2000;101(23):e215–e220.</w:t>
+        <w:t xml:space="preserve"> 2000;101(23</w:t>
+      </w:r>
+      <w:proofErr w:type="gramStart"/>
+      <w:r>
+        <w:t>):e</w:t>
+      </w:r>
+      <w:proofErr w:type="gramEnd"/>
+      <w:r>
+        <w:t>215–e220.</w:t>
       </w:r>
     </w:p>
     <w:p>
       <w:pPr>
         <w:pStyle w:val="Reference"/>
-        <w:jc w:val="start"/>
-        <w:rPr/>
-      </w:pPr>
-      <w:r>
-        <w:rPr/>
-        <w:t xml:space="preserve">[2] Reyna MA, Weigle A, Li Q, Koscova Z, Sun HS, Wen S, et al. Screening for Cognitive Impairment During Sleep Studies: The George B. Moody PhysioNet Challenge 2026. In </w:t>
+        <w:jc w:val="left"/>
+      </w:pPr>
+      <w:r>
+        <w:t xml:space="preserve">[2] Reyna MA, Weigle A, Li Q, </w:t>
+      </w:r>
+      <w:proofErr w:type="spellStart"/>
+      <w:r>
+        <w:t>Koscova</w:t>
+      </w:r>
+      <w:proofErr w:type="spellEnd"/>
+      <w:r>
+        <w:t xml:space="preserve"> Z, Sun HS, Wen S, et al. Screening for Cognitive Impairment During Sleep Studies: The George B. Moody PhysioNet Challenge 2026. In </w:t>
       </w:r>
       <w:r>
         <w:rPr>
@@ -2691,27 +2742,30 @@
         <w:t>Computing in Cardiology</w:t>
       </w:r>
       <w:r>
-        <w:rPr/>
         <w:t xml:space="preserve"> 2026, volume 53. 2026; 1–</w:t>
       </w:r>
       <w:r>
-        <w:rPr/>
-        <w:t>3</w:t>
-      </w:r>
-      <w:r>
-        <w:rPr/>
+        <w:t>4</w:t>
+      </w:r>
+      <w:r>
         <w:t>.</w:t>
       </w:r>
     </w:p>
     <w:p>
       <w:pPr>
         <w:pStyle w:val="Reference"/>
-        <w:jc w:val="start"/>
-        <w:rPr/>
-      </w:pPr>
-      <w:r>
-        <w:rPr/>
-        <w:t xml:space="preserve">[3] Li Q, Wen S, Sun H, Ganglberger W, Tripathi A, Turley N, et al. The Human Sleep Project: A multi-center clinical polysomnography dataset across the human lifespan. </w:t>
+        <w:jc w:val="left"/>
+      </w:pPr>
+      <w:r>
+        <w:t xml:space="preserve">[3] Li Q, Wen S, Sun H, </w:t>
+      </w:r>
+      <w:proofErr w:type="spellStart"/>
+      <w:r>
+        <w:t>Ganglberger</w:t>
+      </w:r>
+      <w:proofErr w:type="spellEnd"/>
+      <w:r>
+        <w:t xml:space="preserve"> W, Tripathi A, Turley N, et al. The Human Sleep Project: A multi-center clinical polysomnography dataset across the human lifespan. </w:t>
       </w:r>
       <w:r>
         <w:rPr>
@@ -2721,10 +2775,9 @@
         <w:t>Sleep</w:t>
       </w:r>
       <w:r>
-        <w:rPr/>
         <w:t xml:space="preserve"> 08 2026; zsag215. ISSN 0161-8105. URL </w:t>
       </w:r>
-      <w:hyperlink r:id="rId4">
+      <w:hyperlink r:id="rId9">
         <w:r>
           <w:rPr>
             <w:rStyle w:val="Hyperlink"/>
@@ -2733,17 +2786,14 @@
         </w:r>
       </w:hyperlink>
       <w:r>
-        <w:rPr/>
         <w:t>.</w:t>
       </w:r>
     </w:p>
     <w:p>
       <w:pPr>
         <w:pStyle w:val="Reference"/>
-        <w:rPr/>
-      </w:pPr>
-      <w:r>
-        <w:rPr/>
+      </w:pPr>
+      <w:r>
         <w:t xml:space="preserve">. </w:t>
       </w:r>
     </w:p>
@@ -2768,75 +2818,79 @@
           <w:lang w:val="en-US"/>
         </w:rPr>
       </w:pPr>
-      <w:r>
-        <w:rPr>
-          <w:lang w:val="en-US"/>
-        </w:rPr>
-      </w:r>
     </w:p>
     <w:p>
       <w:pPr>
         <w:pStyle w:val="AddressforCorrespondence"/>
-        <w:rPr/>
-      </w:pPr>
-      <w:r>
-        <w:rPr/>
+      </w:pPr>
+      <w:r>
         <w:t>Eve L Knievel</w:t>
       </w:r>
     </w:p>
     <w:p>
       <w:pPr>
         <w:pStyle w:val="AddressforCorrespondence"/>
-        <w:rPr/>
-      </w:pPr>
-      <w:r>
-        <w:rPr/>
+      </w:pPr>
+      <w:r>
         <w:t>123 Main Street, Any Town, Any State/Province, Any Country</w:t>
       </w:r>
     </w:p>
     <w:p>
       <w:pPr>
         <w:pStyle w:val="AddressforCorrespondence"/>
-        <w:rPr/>
-      </w:pPr>
-      <w:r>
-        <w:rPr/>
+      </w:pPr>
+      <w:r>
         <w:t>eve@example.com</w:t>
       </w:r>
     </w:p>
     <w:sectPr>
-      <w:footnotePr>
-        <w:numFmt w:val="decimal"/>
-      </w:footnotePr>
       <w:type w:val="continuous"/>
       <w:pgSz w:w="12240" w:h="15840"/>
-      <w:pgMar w:left="1224" w:right="1224" w:gutter="0" w:header="0" w:top="1440" w:footer="0" w:bottom="1440"/>
-      <w:cols w:num="2" w:space="460" w:equalWidth="true" w:sep="false"/>
-      <w:formProt w:val="false"/>
-      <w:textDirection w:val="lrTb"/>
-      <w:docGrid w:type="default" w:linePitch="100" w:charSpace="0"/>
+      <w:pgMar w:top="1440" w:right="1224" w:bottom="1440" w:left="1224" w:header="0" w:footer="0" w:gutter="0"/>
+      <w:cols w:num="2" w:space="460"/>
+      <w:formProt w:val="0"/>
+      <w:docGrid w:linePitch="100"/>
     </w:sectPr>
   </w:body>
 </w:document>
 </file>
 
+<file path=word/endnotes.xml><?xml version="1.0" encoding="utf-8"?>
+<w:endnotes xmlns:wpc="http://schemas.microsoft.com/office/word/2010/wordprocessingCanvas" xmlns:cx="http://schemas.microsoft.com/office/drawing/2014/chartex" xmlns:cx1="http://schemas.microsoft.com/office/drawing/2015/9/8/chartex" xmlns:cx2="http://schemas.microsoft.com/office/drawing/2015/10/21/chartex" xmlns:cx3="http://schemas.microsoft.com/office/drawing/2016/5/9/chartex" xmlns:cx4="http://schemas.microsoft.com/office/drawing/2016/5/10/chartex" xmlns:cx5="http://schemas.microsoft.com/office/drawing/2016/5/11/chartex" xmlns:cx6="http://schemas.microsoft.com/office/drawing/2016/5/12/chartex" xmlns:cx7="http://schemas.microsoft.com/office/drawing/2016/5/13/chartex" xmlns:cx8="http://schemas.microsoft.com/office/drawing/2016/5/14/chartex" xmlns:mc="http://schemas.openxmlformats.org/markup-compatibility/2006" xmlns:m="http://schemas.openxmlformats.org/officeDocument/2006/math" xmlns:aink="http://schemas.microsoft.com/office/drawing/2016/ink" xmlns:am3d="http://schemas.microsoft.com/office/drawing/2017/model3d" xmlns:oel="http://schemas.microsoft.com/office/2019/extlst" xmlns:r="http://schemas.openxmlformats.org/officeDocument/2006/relationships" xmlns:wp14="http://schemas.microsoft.com/office/word/2010/wordprocessingDrawing" xmlns:wp="http://schemas.openxmlformats.org/drawingml/2006/wordprocessingDrawing" xmlns:wpg="http://schemas.microsoft.com/office/word/2010/wordprocessingGroup" xmlns:wpi="http://schemas.microsoft.com/office/word/2010/wordprocessingInk" xmlns:wps="http://schemas.microsoft.com/office/word/2010/wordprocessingShape" xmlns:o="urn:schemas-microsoft-com:office:office" xmlns:v="urn:schemas-microsoft-com:vml" xmlns:w10="urn:schemas-microsoft-com:office:word" xmlns:w="http://schemas.openxmlformats.org/wordprocessingml/2006/main" xmlns:w14="http://schemas.microsoft.com/office/word/2010/wordml" xmlns:w15="http://schemas.microsoft.com/office/word/2012/wordml" xmlns:w16cex="http://schemas.microsoft.com/office/word/2018/wordml/cex" xmlns:w16cid="http://schemas.microsoft.com/office/word/2016/wordml/cid" xmlns:w16="http://schemas.microsoft.com/office/word/2018/wordml" xmlns:w16sdtdh="http://schemas.microsoft.com/office/word/2020/wordml/sdtdatahash" xmlns:w16sdtfl="http://schemas.microsoft.com/office/word/2024/wordml/sdtformatlock" xmlns:w16se="http://schemas.microsoft.com/office/word/2015/wordml/symex" xmlns:w16du="http://schemas.microsoft.com/office/word/2023/wordml/word16du" xmlns:wne="http://schemas.microsoft.com/office/word/2006/wordml" mc:Ignorable="w14 w15 w16se w16cid w16 w16cex w16sdtdh w16sdtfl w16du wp14">
+  <w:endnote w:type="separator" w:id="-1">
+    <w:p>
+      <w:r>
+        <w:separator/>
+      </w:r>
+    </w:p>
+  </w:endnote>
+  <w:endnote w:type="continuationSeparator" w:id="0">
+    <w:p>
+      <w:r>
+        <w:continuationSeparator/>
+      </w:r>
+    </w:p>
+  </w:endnote>
+</w:endnotes>
+</file>
+
 <file path=word/footnotes.xml><?xml version="1.0" encoding="utf-8"?>
-<w:footnotes xmlns:o="urn:schemas-microsoft-com:office:office" xmlns:r="http://schemas.openxmlformats.org/officeDocument/2006/relationships" xmlns:v="urn:schemas-microsoft-com:vml" xmlns:w="http://schemas.openxmlformats.org/wordprocessingml/2006/main" xmlns:w10="urn:schemas-microsoft-com:office:word" xmlns:wp="http://schemas.openxmlformats.org/drawingml/2006/wordprocessingDrawing" xmlns:pic="http://schemas.openxmlformats.org/drawingml/2006/picture" xmlns:wps="http://schemas.microsoft.com/office/word/2010/wordprocessingShape" xmlns:wpg="http://schemas.microsoft.com/office/word/2010/wordprocessingGroup" xmlns:mc="http://schemas.openxmlformats.org/markup-compatibility/2006" xmlns:wp14="http://schemas.microsoft.com/office/word/2010/wordprocessingDrawing" xmlns:w14="http://schemas.microsoft.com/office/word/2010/wordml" xmlns:w15="http://schemas.microsoft.com/office/word/2012/wordml" mc:Ignorable="w14 wp14 w15">
-  <w:footnote w:id="0" w:type="separator">
+<w:footnotes xmlns:wpc="http://schemas.microsoft.com/office/word/2010/wordprocessingCanvas" xmlns:cx="http://schemas.microsoft.com/office/drawing/2014/chartex" xmlns:cx1="http://schemas.microsoft.com/office/drawing/2015/9/8/chartex" xmlns:cx2="http://schemas.microsoft.com/office/drawing/2015/10/21/chartex" xmlns:cx3="http://schemas.microsoft.com/office/drawing/2016/5/9/chartex" xmlns:cx4="http://schemas.microsoft.com/office/drawing/2016/5/10/chartex" xmlns:cx5="http://schemas.microsoft.com/office/drawing/2016/5/11/chartex" xmlns:cx6="http://schemas.microsoft.com/office/drawing/2016/5/12/chartex" xmlns:cx7="http://schemas.microsoft.com/office/drawing/2016/5/13/chartex" xmlns:cx8="http://schemas.microsoft.com/office/drawing/2016/5/14/chartex" xmlns:mc="http://schemas.openxmlformats.org/markup-compatibility/2006" xmlns:m="http://schemas.openxmlformats.org/officeDocument/2006/math" xmlns:aink="http://schemas.microsoft.com/office/drawing/2016/ink" xmlns:am3d="http://schemas.microsoft.com/office/drawing/2017/model3d" xmlns:oel="http://schemas.microsoft.com/office/2019/extlst" xmlns:r="http://schemas.openxmlformats.org/officeDocument/2006/relationships" xmlns:wp14="http://schemas.microsoft.com/office/word/2010/wordprocessingDrawing" xmlns:wp="http://schemas.openxmlformats.org/drawingml/2006/wordprocessingDrawing" xmlns:wpg="http://schemas.microsoft.com/office/word/2010/wordprocessingGroup" xmlns:wpi="http://schemas.microsoft.com/office/word/2010/wordprocessingInk" xmlns:wps="http://schemas.microsoft.com/office/word/2010/wordprocessingShape" xmlns:o="urn:schemas-microsoft-com:office:office" xmlns:v="urn:schemas-microsoft-com:vml" xmlns:w10="urn:schemas-microsoft-com:office:word" xmlns:w="http://schemas.openxmlformats.org/wordprocessingml/2006/main" xmlns:w14="http://schemas.microsoft.com/office/word/2010/wordml" xmlns:w15="http://schemas.microsoft.com/office/word/2012/wordml" xmlns:w16cex="http://schemas.microsoft.com/office/word/2018/wordml/cex" xmlns:w16cid="http://schemas.microsoft.com/office/word/2016/wordml/cid" xmlns:w16="http://schemas.microsoft.com/office/word/2018/wordml" xmlns:w16sdtdh="http://schemas.microsoft.com/office/word/2020/wordml/sdtdatahash" xmlns:w16sdtfl="http://schemas.microsoft.com/office/word/2024/wordml/sdtformatlock" xmlns:w16se="http://schemas.microsoft.com/office/word/2015/wordml/symex" xmlns:w16du="http://schemas.microsoft.com/office/word/2023/wordml/word16du" xmlns:wne="http://schemas.microsoft.com/office/word/2006/wordml" mc:Ignorable="w14 w15 w16se w16cid w16 w16cex w16sdtdh w16sdtfl w16du wp14">
+  <w:footnote w:type="separator" w:id="-1">
     <w:p>
       <w:r>
         <w:separator/>
       </w:r>
     </w:p>
   </w:footnote>
-  <w:footnote w:id="1" w:type="continuationSeparator">
+  <w:footnote w:type="continuationSeparator" w:id="0">
     <w:p>
       <w:r>
         <w:continuationSeparator/>
       </w:r>
     </w:p>
   </w:footnote>
-  <w:footnote w:id="2">
+  <w:footnote w:id="1">
     <w:p>
       <w:pPr>
         <w:pStyle w:val="FootnoteText"/>
@@ -2853,7 +2907,6 @@
         <w:footnoteRef/>
       </w:r>
       <w:r>
-        <w:rPr/>
         <w:t xml:space="preserve"> </w:t>
       </w:r>
       <w:r>
@@ -2879,45 +2932,42 @@
     <w:p>
       <w:pPr>
         <w:pStyle w:val="FootnoteText"/>
-        <w:ind w:hanging="0"/>
+        <w:ind w:firstLine="0"/>
         <w:rPr>
           <w:lang w:val="en-AU"/>
         </w:rPr>
       </w:pPr>
-      <w:r>
-        <w:rPr/>
-      </w:r>
     </w:p>
   </w:footnote>
 </w:footnotes>
 </file>
 
 <file path=word/styles.xml><?xml version="1.0" encoding="utf-8"?>
-<w:styles xmlns:w="http://schemas.openxmlformats.org/wordprocessingml/2006/main" xmlns:w14="http://schemas.microsoft.com/office/word/2010/wordml" xmlns:mc="http://schemas.openxmlformats.org/markup-compatibility/2006" mc:Ignorable="w14">
+<w:styles xmlns:mc="http://schemas.openxmlformats.org/markup-compatibility/2006" xmlns:r="http://schemas.openxmlformats.org/officeDocument/2006/relationships" xmlns:w="http://schemas.openxmlformats.org/wordprocessingml/2006/main" xmlns:w14="http://schemas.microsoft.com/office/word/2010/wordml" xmlns:w15="http://schemas.microsoft.com/office/word/2012/wordml" xmlns:w16cex="http://schemas.microsoft.com/office/word/2018/wordml/cex" xmlns:w16cid="http://schemas.microsoft.com/office/word/2016/wordml/cid" xmlns:w16="http://schemas.microsoft.com/office/word/2018/wordml" xmlns:w16sdtdh="http://schemas.microsoft.com/office/word/2020/wordml/sdtdatahash" xmlns:w16sdtfl="http://schemas.microsoft.com/office/word/2024/wordml/sdtformatlock" xmlns:w16se="http://schemas.microsoft.com/office/word/2015/wordml/symex" xmlns:w16du="http://schemas.microsoft.com/office/word/2023/wordml/word16du" mc:Ignorable="w14 w15 w16se w16cid w16 w16cex w16sdtdh w16sdtfl w16du">
   <w:docDefaults>
     <w:rPrDefault>
       <w:rPr>
-        <w:rFonts w:ascii="Times New Roman" w:hAnsi="Times New Roman" w:eastAsia="Times New Roman" w:cs="Times New Roman"/>
+        <w:rFonts w:ascii="Times New Roman" w:eastAsia="Times New Roman" w:hAnsi="Times New Roman" w:cs="Times New Roman"/>
         <w:lang w:val="en-US" w:eastAsia="en-US" w:bidi="ar-SA"/>
       </w:rPr>
     </w:rPrDefault>
     <w:pPrDefault>
       <w:pPr>
-        <w:suppressAutoHyphens w:val="true"/>
+        <w:suppressAutoHyphens/>
       </w:pPr>
     </w:pPrDefault>
   </w:docDefaults>
   <w:latentStyles w:defLockedState="0" w:defUIPriority="99" w:defSemiHidden="0" w:defUnhideWhenUsed="0" w:defQFormat="0" w:count="376">
     <w:lsdException w:name="Normal" w:uiPriority="0" w:qFormat="1"/>
     <w:lsdException w:name="heading 1" w:uiPriority="9" w:qFormat="1"/>
-    <w:lsdException w:name="heading 2" w:uiPriority="9" w:semiHidden="1" w:unhideWhenUsed="1" w:qFormat="1"/>
-    <w:lsdException w:name="heading 3" w:uiPriority="9" w:semiHidden="1" w:unhideWhenUsed="1" w:qFormat="1"/>
-    <w:lsdException w:name="heading 4" w:uiPriority="9" w:semiHidden="1" w:unhideWhenUsed="1" w:qFormat="1"/>
-    <w:lsdException w:name="heading 5" w:uiPriority="9" w:semiHidden="1" w:unhideWhenUsed="1" w:qFormat="1"/>
-    <w:lsdException w:name="heading 6" w:uiPriority="9" w:semiHidden="1" w:unhideWhenUsed="1" w:qFormat="1"/>
-    <w:lsdException w:name="heading 7" w:uiPriority="9" w:semiHidden="1" w:unhideWhenUsed="1" w:qFormat="1"/>
-    <w:lsdException w:name="heading 8" w:uiPriority="9" w:semiHidden="1" w:unhideWhenUsed="1" w:qFormat="1"/>
-    <w:lsdException w:name="heading 9" w:uiPriority="9" w:semiHidden="1" w:unhideWhenUsed="1" w:qFormat="1"/>
+    <w:lsdException w:name="heading 2" w:semiHidden="1" w:uiPriority="9" w:unhideWhenUsed="1" w:qFormat="1"/>
+    <w:lsdException w:name="heading 3" w:semiHidden="1" w:uiPriority="9" w:unhideWhenUsed="1" w:qFormat="1"/>
+    <w:lsdException w:name="heading 4" w:semiHidden="1" w:uiPriority="9" w:unhideWhenUsed="1" w:qFormat="1"/>
+    <w:lsdException w:name="heading 5" w:semiHidden="1" w:uiPriority="9" w:unhideWhenUsed="1" w:qFormat="1"/>
+    <w:lsdException w:name="heading 6" w:semiHidden="1" w:uiPriority="9" w:unhideWhenUsed="1" w:qFormat="1"/>
+    <w:lsdException w:name="heading 7" w:semiHidden="1" w:uiPriority="9" w:unhideWhenUsed="1" w:qFormat="1"/>
+    <w:lsdException w:name="heading 8" w:semiHidden="1" w:uiPriority="9" w:unhideWhenUsed="1" w:qFormat="1"/>
+    <w:lsdException w:name="heading 9" w:semiHidden="1" w:uiPriority="9" w:unhideWhenUsed="1" w:qFormat="1"/>
     <w:lsdException w:name="index 1" w:semiHidden="1" w:unhideWhenUsed="1"/>
     <w:lsdException w:name="index 2" w:semiHidden="1" w:unhideWhenUsed="1"/>
     <w:lsdException w:name="index 3" w:semiHidden="1" w:unhideWhenUsed="1"/>
@@ -2927,22 +2977,22 @@
     <w:lsdException w:name="index 7" w:semiHidden="1" w:unhideWhenUsed="1"/>
     <w:lsdException w:name="index 8" w:semiHidden="1" w:unhideWhenUsed="1"/>
     <w:lsdException w:name="index 9" w:semiHidden="1" w:unhideWhenUsed="1"/>
-    <w:lsdException w:name="toc 1" w:uiPriority="39" w:semiHidden="1" w:unhideWhenUsed="1"/>
-    <w:lsdException w:name="toc 2" w:uiPriority="39" w:semiHidden="1" w:unhideWhenUsed="1"/>
-    <w:lsdException w:name="toc 3" w:uiPriority="39" w:semiHidden="1" w:unhideWhenUsed="1"/>
-    <w:lsdException w:name="toc 4" w:uiPriority="39" w:semiHidden="1" w:unhideWhenUsed="1"/>
-    <w:lsdException w:name="toc 5" w:uiPriority="39" w:semiHidden="1" w:unhideWhenUsed="1"/>
-    <w:lsdException w:name="toc 6" w:uiPriority="39" w:semiHidden="1" w:unhideWhenUsed="1"/>
-    <w:lsdException w:name="toc 7" w:uiPriority="39" w:semiHidden="1" w:unhideWhenUsed="1"/>
-    <w:lsdException w:name="toc 8" w:uiPriority="39" w:semiHidden="1" w:unhideWhenUsed="1"/>
-    <w:lsdException w:name="toc 9" w:uiPriority="39" w:semiHidden="1" w:unhideWhenUsed="1"/>
+    <w:lsdException w:name="toc 1" w:semiHidden="1" w:uiPriority="39" w:unhideWhenUsed="1"/>
+    <w:lsdException w:name="toc 2" w:semiHidden="1" w:uiPriority="39" w:unhideWhenUsed="1"/>
+    <w:lsdException w:name="toc 3" w:semiHidden="1" w:uiPriority="39" w:unhideWhenUsed="1"/>
+    <w:lsdException w:name="toc 4" w:semiHidden="1" w:uiPriority="39" w:unhideWhenUsed="1"/>
+    <w:lsdException w:name="toc 5" w:semiHidden="1" w:uiPriority="39" w:unhideWhenUsed="1"/>
+    <w:lsdException w:name="toc 6" w:semiHidden="1" w:uiPriority="39" w:unhideWhenUsed="1"/>
+    <w:lsdException w:name="toc 7" w:semiHidden="1" w:uiPriority="39" w:unhideWhenUsed="1"/>
+    <w:lsdException w:name="toc 8" w:semiHidden="1" w:uiPriority="39" w:unhideWhenUsed="1"/>
+    <w:lsdException w:name="toc 9" w:semiHidden="1" w:uiPriority="39" w:unhideWhenUsed="1"/>
     <w:lsdException w:name="Normal Indent" w:semiHidden="1" w:unhideWhenUsed="1"/>
     <w:lsdException w:name="footnote text" w:semiHidden="1" w:unhideWhenUsed="1"/>
     <w:lsdException w:name="annotation text" w:semiHidden="1" w:unhideWhenUsed="1"/>
     <w:lsdException w:name="header" w:semiHidden="1" w:unhideWhenUsed="1"/>
     <w:lsdException w:name="footer" w:semiHidden="1" w:unhideWhenUsed="1"/>
     <w:lsdException w:name="index heading" w:semiHidden="1" w:unhideWhenUsed="1"/>
-    <w:lsdException w:name="caption" w:uiPriority="35" w:semiHidden="1" w:unhideWhenUsed="1" w:qFormat="1"/>
+    <w:lsdException w:name="caption" w:semiHidden="1" w:uiPriority="35" w:unhideWhenUsed="1" w:qFormat="1"/>
     <w:lsdException w:name="table of figures" w:semiHidden="1" w:unhideWhenUsed="1"/>
     <w:lsdException w:name="envelope address" w:semiHidden="1" w:unhideWhenUsed="1"/>
     <w:lsdException w:name="envelope return" w:semiHidden="1" w:unhideWhenUsed="1"/>
@@ -2973,7 +3023,7 @@
     <w:lsdException w:name="Title" w:uiPriority="10" w:qFormat="1"/>
     <w:lsdException w:name="Closing" w:semiHidden="1" w:unhideWhenUsed="1"/>
     <w:lsdException w:name="Signature" w:semiHidden="1" w:unhideWhenUsed="1"/>
-    <w:lsdException w:name="Default Paragraph Font" w:uiPriority="1" w:semiHidden="1" w:unhideWhenUsed="1"/>
+    <w:lsdException w:name="Default Paragraph Font" w:semiHidden="1" w:uiPriority="1" w:unhideWhenUsed="1"/>
     <w:lsdException w:name="Body Text" w:semiHidden="1" w:unhideWhenUsed="1"/>
     <w:lsdException w:name="Body Text Indent" w:semiHidden="1" w:unhideWhenUsed="1"/>
     <w:lsdException w:name="List Continue" w:semiHidden="1" w:unhideWhenUsed="1"/>
@@ -3173,8 +3223,8 @@
     <w:lsdException w:name="Subtle Reference" w:uiPriority="31" w:qFormat="1"/>
     <w:lsdException w:name="Intense Reference" w:uiPriority="32" w:qFormat="1"/>
     <w:lsdException w:name="Book Title" w:uiPriority="33" w:qFormat="1"/>
-    <w:lsdException w:name="Bibliography" w:uiPriority="37" w:semiHidden="1" w:unhideWhenUsed="1"/>
-    <w:lsdException w:name="TOC Heading" w:uiPriority="39" w:semiHidden="1" w:unhideWhenUsed="1" w:qFormat="1"/>
+    <w:lsdException w:name="Bibliography" w:semiHidden="1" w:uiPriority="37" w:unhideWhenUsed="1"/>
+    <w:lsdException w:name="TOC Heading" w:semiHidden="1" w:uiPriority="39" w:unhideWhenUsed="1" w:qFormat="1"/>
     <w:lsdException w:name="Grid Table 4" w:uiPriority="49"/>
     <w:lsdException w:name="Grid Table 5 Dark" w:uiPriority="50"/>
     <w:lsdException w:name="Grid Table 6 Colorful" w:uiPriority="51"/>
@@ -3276,35 +3326,24 @@
     <w:lsdException w:name="Unresolved Mention" w:semiHidden="1" w:unhideWhenUsed="1"/>
     <w:lsdException w:name="Smart Link" w:semiHidden="1" w:unhideWhenUsed="1"/>
   </w:latentStyles>
-  <w:style w:type="paragraph" w:styleId="Normal" w:default="1">
+  <w:style w:type="paragraph" w:default="1" w:styleId="Normal">
     <w:name w:val="Normal"/>
     <w:qFormat/>
-    <w:rsid w:val="007a5360"/>
+    <w:rsid w:val="007A5360"/>
     <w:pPr>
-      <w:widowControl w:val="false"/>
-      <w:suppressAutoHyphens w:val="true"/>
-      <w:bidi w:val="0"/>
-      <w:spacing w:before="0" w:after="0"/>
+      <w:widowControl w:val="0"/>
       <w:ind w:firstLine="230"/>
       <w:jc w:val="both"/>
     </w:pPr>
-    <w:rPr>
-      <w:rFonts w:ascii="Times New Roman" w:hAnsi="Times New Roman" w:eastAsia="Times New Roman" w:cs="Times New Roman"/>
-      <w:color w:val="auto"/>
-      <w:kern w:val="0"/>
-      <w:sz w:val="20"/>
-      <w:szCs w:val="20"/>
-      <w:lang w:val="en-US" w:eastAsia="en-US" w:bidi="ar-SA"/>
-    </w:rPr>
   </w:style>
   <w:style w:type="paragraph" w:styleId="Heading1">
     <w:name w:val="heading 1"/>
     <w:basedOn w:val="Normal"/>
     <w:next w:val="Normal"/>
     <w:qFormat/>
-    <w:rsid w:val="007a5360"/>
+    <w:rsid w:val="007A5360"/>
     <w:pPr>
-      <w:keepNext w:val="true"/>
+      <w:keepNext/>
       <w:spacing w:before="240" w:after="60"/>
       <w:outlineLvl w:val="0"/>
     </w:pPr>
@@ -3315,21 +3354,41 @@
       <w:sz w:val="28"/>
     </w:rPr>
   </w:style>
-  <w:style w:type="character" w:styleId="DefaultParagraphFont" w:default="1">
+  <w:style w:type="character" w:default="1" w:styleId="DefaultParagraphFont">
     <w:name w:val="Default Paragraph Font"/>
     <w:uiPriority w:val="1"/>
+    <w:semiHidden/>
     <w:unhideWhenUsed/>
-    <w:qFormat/>
-    <w:rPr/>
-  </w:style>
-  <w:style w:type="character" w:styleId="BalloonTextChar" w:customStyle="1">
+  </w:style>
+  <w:style w:type="table" w:default="1" w:styleId="TableNormal">
+    <w:name w:val="Normal Table"/>
+    <w:uiPriority w:val="99"/>
+    <w:semiHidden/>
+    <w:unhideWhenUsed/>
+    <w:tblPr>
+      <w:tblInd w:w="0" w:type="dxa"/>
+      <w:tblCellMar>
+        <w:top w:w="0" w:type="dxa"/>
+        <w:left w:w="108" w:type="dxa"/>
+        <w:bottom w:w="0" w:type="dxa"/>
+        <w:right w:w="108" w:type="dxa"/>
+      </w:tblCellMar>
+    </w:tblPr>
+  </w:style>
+  <w:style w:type="numbering" w:default="1" w:styleId="NoList">
+    <w:name w:val="No List"/>
+    <w:uiPriority w:val="99"/>
+    <w:semiHidden/>
+    <w:unhideWhenUsed/>
+  </w:style>
+  <w:style w:type="character" w:customStyle="1" w:styleId="BalloonTextChar">
     <w:name w:val="Balloon Text Char"/>
     <w:basedOn w:val="DefaultParagraphFont"/>
     <w:link w:val="BalloonText"/>
     <w:uiPriority w:val="99"/>
     <w:semiHidden/>
     <w:qFormat/>
-    <w:rsid w:val="008c5c71"/>
+    <w:rsid w:val="008C5C71"/>
     <w:rPr>
       <w:rFonts w:ascii="Lucida Grande" w:hAnsi="Lucida Grande"/>
       <w:sz w:val="18"/>
@@ -3343,33 +3402,33 @@
     <w:semiHidden/>
     <w:unhideWhenUsed/>
     <w:qFormat/>
-    <w:rsid w:val="008c5c71"/>
+    <w:rsid w:val="008C5C71"/>
     <w:rPr>
       <w:sz w:val="18"/>
       <w:szCs w:val="18"/>
     </w:rPr>
   </w:style>
-  <w:style w:type="character" w:styleId="CommentTextChar" w:customStyle="1">
+  <w:style w:type="character" w:customStyle="1" w:styleId="CommentTextChar">
     <w:name w:val="Comment Text Char"/>
     <w:basedOn w:val="DefaultParagraphFont"/>
     <w:link w:val="CommentText"/>
     <w:uiPriority w:val="99"/>
     <w:semiHidden/>
     <w:qFormat/>
-    <w:rsid w:val="008c5c71"/>
+    <w:rsid w:val="008C5C71"/>
     <w:rPr>
       <w:sz w:val="24"/>
       <w:szCs w:val="24"/>
     </w:rPr>
   </w:style>
-  <w:style w:type="character" w:styleId="CommentSubjectChar" w:customStyle="1">
+  <w:style w:type="character" w:customStyle="1" w:styleId="CommentSubjectChar">
     <w:name w:val="Comment Subject Char"/>
     <w:basedOn w:val="CommentTextChar"/>
-    <w:link w:val="annotationsubject"/>
+    <w:link w:val="CommentSubject"/>
     <w:uiPriority w:val="99"/>
     <w:semiHidden/>
     <w:qFormat/>
-    <w:rsid w:val="008c5c71"/>
+    <w:rsid w:val="008C5C71"/>
     <w:rPr>
       <w:b/>
       <w:bCs/>
@@ -3377,25 +3436,23 @@
       <w:szCs w:val="24"/>
     </w:rPr>
   </w:style>
-  <w:style w:type="character" w:styleId="HeaderChar" w:customStyle="1">
+  <w:style w:type="character" w:customStyle="1" w:styleId="HeaderChar">
     <w:name w:val="Header Char"/>
     <w:basedOn w:val="DefaultParagraphFont"/>
     <w:link w:val="Header"/>
     <w:uiPriority w:val="99"/>
     <w:qFormat/>
     <w:rsid w:val="00982849"/>
-    <w:rPr/>
-  </w:style>
-  <w:style w:type="character" w:styleId="FooterChar" w:customStyle="1">
+  </w:style>
+  <w:style w:type="character" w:customStyle="1" w:styleId="FooterChar">
     <w:name w:val="Footer Char"/>
     <w:basedOn w:val="DefaultParagraphFont"/>
     <w:link w:val="Footer"/>
     <w:uiPriority w:val="99"/>
     <w:qFormat/>
     <w:rsid w:val="00982849"/>
-    <w:rPr/>
-  </w:style>
-  <w:style w:type="character" w:styleId="FootnoteTextChar" w:customStyle="1">
+  </w:style>
+  <w:style w:type="character" w:customStyle="1" w:styleId="FootnoteTextChar">
     <w:name w:val="Footnote Text Char"/>
     <w:basedOn w:val="DefaultParagraphFont"/>
     <w:link w:val="FootnoteText"/>
@@ -3403,9 +3460,8 @@
     <w:semiHidden/>
     <w:qFormat/>
     <w:rsid w:val="00982849"/>
-    <w:rPr/>
-  </w:style>
-  <w:style w:type="character" w:styleId="FootnoteCharacters">
+  </w:style>
+  <w:style w:type="character" w:customStyle="1" w:styleId="FootnoteCharacters">
     <w:name w:val="Footnote Characters"/>
     <w:uiPriority w:val="99"/>
     <w:semiHidden/>
@@ -3416,7 +3472,7 @@
       <w:vertAlign w:val="superscript"/>
     </w:rPr>
   </w:style>
-  <w:style w:type="character" w:styleId="FootnoteCharactersuser">
+  <w:style w:type="character" w:customStyle="1" w:styleId="FootnoteCharactersuser">
     <w:name w:val="Footnote Characters (user)"/>
     <w:qFormat/>
     <w:rPr>
@@ -3434,7 +3490,7 @@
     <w:basedOn w:val="DefaultParagraphFont"/>
     <w:uiPriority w:val="67"/>
     <w:qFormat/>
-    <w:rsid w:val="00d3461a"/>
+    <w:rsid w:val="00D3461A"/>
     <w:rPr>
       <w:color w:val="808080"/>
     </w:rPr>
@@ -3444,9 +3500,9 @@
     <w:basedOn w:val="DefaultParagraphFont"/>
     <w:uiPriority w:val="99"/>
     <w:unhideWhenUsed/>
-    <w:rsid w:val="001345d3"/>
+    <w:rsid w:val="001345D3"/>
     <w:rPr>
-      <w:color w:themeColor="hyperlink" w:val="0000FF"/>
+      <w:color w:val="0000FF" w:themeColor="hyperlink"/>
       <w:u w:val="single"/>
     </w:rPr>
   </w:style>
@@ -3457,23 +3513,22 @@
     <w:semiHidden/>
     <w:unhideWhenUsed/>
     <w:qFormat/>
-    <w:rsid w:val="001345d3"/>
+    <w:rsid w:val="001345D3"/>
     <w:rPr>
       <w:color w:val="605E5C"/>
-      <w:shd w:fill="E1DFDD" w:val="clear"/>
+      <w:shd w:val="clear" w:color="auto" w:fill="E1DFDD"/>
     </w:rPr>
   </w:style>
-  <w:style w:type="character" w:styleId="EndnoteCharactersuser">
+  <w:style w:type="character" w:customStyle="1" w:styleId="EndnoteCharactersuser">
     <w:name w:val="Endnote Characters (user)"/>
     <w:qFormat/>
     <w:rPr>
       <w:vertAlign w:val="superscript"/>
     </w:rPr>
   </w:style>
-  <w:style w:type="character" w:styleId="EndnoteCharacters">
+  <w:style w:type="character" w:customStyle="1" w:styleId="EndnoteCharacters">
     <w:name w:val="Endnote Characters"/>
     <w:qFormat/>
-    <w:rPr/>
   </w:style>
   <w:style w:type="character" w:styleId="EndnoteReference">
     <w:name w:val="endnote reference"/>
@@ -3481,18 +3536,18 @@
       <w:vertAlign w:val="superscript"/>
     </w:rPr>
   </w:style>
-  <w:style w:type="paragraph" w:styleId="Heading" w:customStyle="1">
+  <w:style w:type="paragraph" w:customStyle="1" w:styleId="Heading">
     <w:name w:val="Heading"/>
     <w:basedOn w:val="Normal"/>
     <w:next w:val="Normal"/>
     <w:qFormat/>
-    <w:rsid w:val="007a5360"/>
+    <w:rsid w:val="007A5360"/>
     <w:pPr>
       <w:tabs>
-        <w:tab w:val="left" w:pos="720" w:leader="none"/>
+        <w:tab w:val="left" w:pos="720"/>
       </w:tabs>
-      <w:spacing w:before="0" w:after="240"/>
-      <w:ind w:hanging="0"/>
+      <w:spacing w:after="240"/>
+      <w:ind w:firstLine="0"/>
     </w:pPr>
     <w:rPr>
       <w:b/>
@@ -3503,14 +3558,12 @@
     <w:name w:val="Body Text"/>
     <w:basedOn w:val="Normal"/>
     <w:pPr>
-      <w:spacing w:lineRule="auto" w:line="276" w:before="0" w:after="140"/>
+      <w:spacing w:after="140" w:line="276" w:lineRule="auto"/>
     </w:pPr>
-    <w:rPr/>
   </w:style>
   <w:style w:type="paragraph" w:styleId="List">
     <w:name w:val="List"/>
     <w:basedOn w:val="BodyText"/>
-    <w:pPr/>
     <w:rPr>
       <w:rFonts w:cs="Noto Sans Devanagari"/>
     </w:rPr>
@@ -3522,19 +3575,19 @@
     <w:uiPriority w:val="35"/>
     <w:unhideWhenUsed/>
     <w:qFormat/>
-    <w:rsid w:val="008a79f3"/>
+    <w:rsid w:val="008A79F3"/>
     <w:pPr>
-      <w:spacing w:before="0" w:after="200"/>
+      <w:spacing w:after="200"/>
     </w:pPr>
     <w:rPr>
       <w:i/>
       <w:iCs/>
-      <w:color w:themeColor="text2" w:val="1F497D"/>
+      <w:color w:val="1F497D" w:themeColor="text2"/>
       <w:sz w:val="18"/>
       <w:szCs w:val="18"/>
     </w:rPr>
   </w:style>
-  <w:style w:type="paragraph" w:styleId="Index">
+  <w:style w:type="paragraph" w:customStyle="1" w:styleId="Index">
     <w:name w:val="Index"/>
     <w:basedOn w:val="Normal"/>
     <w:qFormat/>
@@ -3545,15 +3598,15 @@
       <w:rFonts w:cs="Noto Sans Devanagari"/>
     </w:rPr>
   </w:style>
-  <w:style w:type="paragraph" w:styleId="PaperTitle" w:customStyle="1">
+  <w:style w:type="paragraph" w:customStyle="1" w:styleId="PaperTitle">
     <w:name w:val="Paper Title"/>
     <w:basedOn w:val="Normal"/>
     <w:next w:val="AuthorLine"/>
     <w:qFormat/>
-    <w:rsid w:val="007a5360"/>
+    <w:rsid w:val="007A5360"/>
     <w:pPr>
       <w:spacing w:before="567" w:after="280"/>
-      <w:ind w:hanging="0"/>
+      <w:ind w:firstLine="0"/>
       <w:jc w:val="center"/>
     </w:pPr>
     <w:rPr>
@@ -3561,42 +3614,42 @@
       <w:sz w:val="28"/>
     </w:rPr>
   </w:style>
-  <w:style w:type="paragraph" w:styleId="AuthorLine" w:customStyle="1">
+  <w:style w:type="paragraph" w:customStyle="1" w:styleId="AuthorLine">
     <w:name w:val="Author Line"/>
     <w:basedOn w:val="Normal"/>
     <w:next w:val="InstitutionLine"/>
     <w:qFormat/>
-    <w:rsid w:val="007a5360"/>
+    <w:rsid w:val="007A5360"/>
     <w:pPr>
-      <w:spacing w:before="0" w:after="280"/>
-      <w:ind w:hanging="0"/>
+      <w:spacing w:after="280"/>
+      <w:ind w:firstLine="0"/>
       <w:jc w:val="center"/>
     </w:pPr>
     <w:rPr>
       <w:sz w:val="24"/>
     </w:rPr>
   </w:style>
-  <w:style w:type="paragraph" w:styleId="InstitutionLine" w:customStyle="1">
+  <w:style w:type="paragraph" w:customStyle="1" w:styleId="InstitutionLine">
     <w:name w:val="Institution Line"/>
     <w:basedOn w:val="Normal"/>
     <w:next w:val="AbstractHeading"/>
     <w:qFormat/>
-    <w:rsid w:val="007a5360"/>
+    <w:rsid w:val="007A5360"/>
     <w:pPr>
-      <w:spacing w:before="0" w:after="480"/>
-      <w:ind w:hanging="0"/>
+      <w:spacing w:after="480"/>
+      <w:ind w:firstLine="0"/>
       <w:jc w:val="center"/>
     </w:pPr>
     <w:rPr>
       <w:sz w:val="24"/>
     </w:rPr>
   </w:style>
-  <w:style w:type="paragraph" w:styleId="AbstractHeading" w:customStyle="1">
+  <w:style w:type="paragraph" w:customStyle="1" w:styleId="AbstractHeading">
     <w:name w:val="Abstract Heading"/>
     <w:basedOn w:val="Heading"/>
     <w:next w:val="AbstractText"/>
     <w:qFormat/>
-    <w:rsid w:val="007a5360"/>
+    <w:rsid w:val="007A5360"/>
     <w:pPr>
       <w:jc w:val="center"/>
     </w:pPr>
@@ -3604,60 +3657,57 @@
       <w:sz w:val="22"/>
     </w:rPr>
   </w:style>
-  <w:style w:type="paragraph" w:styleId="AbstractText" w:customStyle="1">
+  <w:style w:type="paragraph" w:customStyle="1" w:styleId="AbstractText">
     <w:name w:val="Abstract Text"/>
     <w:basedOn w:val="Normal"/>
     <w:qFormat/>
-    <w:rsid w:val="007a5360"/>
-    <w:pPr/>
+    <w:rsid w:val="007A5360"/>
     <w:rPr>
       <w:i/>
     </w:rPr>
   </w:style>
-  <w:style w:type="paragraph" w:styleId="Reference" w:customStyle="1">
+  <w:style w:type="paragraph" w:customStyle="1" w:styleId="Reference">
     <w:name w:val="Reference"/>
     <w:basedOn w:val="Normal"/>
     <w:qFormat/>
-    <w:rsid w:val="007a5360"/>
+    <w:rsid w:val="007A5360"/>
     <w:pPr>
-      <w:ind w:hanging="332" w:start="332"/>
+      <w:ind w:left="332" w:hanging="332"/>
     </w:pPr>
     <w:rPr>
       <w:sz w:val="18"/>
     </w:rPr>
   </w:style>
-  <w:style w:type="paragraph" w:styleId="AddressforCorrespondence" w:customStyle="1">
+  <w:style w:type="paragraph" w:customStyle="1" w:styleId="AddressforCorrespondence">
     <w:name w:val="Address for Correspondence"/>
     <w:basedOn w:val="Normal"/>
     <w:qFormat/>
-    <w:rsid w:val="007a5360"/>
+    <w:rsid w:val="007A5360"/>
     <w:pPr>
-      <w:ind w:hanging="0"/>
+      <w:ind w:firstLine="0"/>
     </w:pPr>
     <w:rPr>
       <w:sz w:val="18"/>
       <w:lang w:val="en-GB"/>
     </w:rPr>
   </w:style>
-  <w:style w:type="paragraph" w:styleId="Table" w:customStyle="1">
+  <w:style w:type="paragraph" w:customStyle="1" w:styleId="Table">
     <w:name w:val="Table"/>
     <w:basedOn w:val="Normal"/>
     <w:qFormat/>
-    <w:rsid w:val="007a5360"/>
+    <w:rsid w:val="007A5360"/>
     <w:pPr>
-      <w:ind w:hanging="0"/>
+      <w:ind w:firstLine="0"/>
     </w:pPr>
-    <w:rPr/>
-  </w:style>
-  <w:style w:type="paragraph" w:styleId="Figure" w:customStyle="1">
+  </w:style>
+  <w:style w:type="paragraph" w:customStyle="1" w:styleId="Figure">
     <w:name w:val="Figure"/>
     <w:basedOn w:val="Normal"/>
     <w:qFormat/>
-    <w:rsid w:val="007a5360"/>
+    <w:rsid w:val="007A5360"/>
     <w:pPr>
-      <w:ind w:hanging="0"/>
+      <w:ind w:firstLine="0"/>
     </w:pPr>
-    <w:rPr/>
   </w:style>
   <w:style w:type="paragraph" w:styleId="BalloonText">
     <w:name w:val="Balloon Text"/>
@@ -3667,8 +3717,7 @@
     <w:semiHidden/>
     <w:unhideWhenUsed/>
     <w:qFormat/>
-    <w:rsid w:val="008c5c71"/>
-    <w:pPr/>
+    <w:rsid w:val="008C5C71"/>
     <w:rPr>
       <w:rFonts w:ascii="Lucida Grande" w:hAnsi="Lucida Grande"/>
       <w:sz w:val="18"/>
@@ -3682,14 +3731,13 @@
     <w:uiPriority w:val="99"/>
     <w:semiHidden/>
     <w:unhideWhenUsed/>
-    <w:rsid w:val="008c5c71"/>
-    <w:pPr/>
+    <w:rsid w:val="008C5C71"/>
     <w:rPr>
       <w:sz w:val="24"/>
       <w:szCs w:val="24"/>
     </w:rPr>
   </w:style>
-  <w:style w:type="paragraph" w:styleId="annotationsubject">
+  <w:style w:type="paragraph" w:styleId="CommentSubject">
     <w:name w:val="annotation subject"/>
     <w:basedOn w:val="CommentText"/>
     <w:next w:val="CommentText"/>
@@ -3698,8 +3746,7 @@
     <w:semiHidden/>
     <w:unhideWhenUsed/>
     <w:qFormat/>
-    <w:rsid w:val="008c5c71"/>
-    <w:pPr/>
+    <w:rsid w:val="008C5C71"/>
     <w:rPr>
       <w:b/>
       <w:bCs/>
@@ -3707,12 +3754,10 @@
       <w:szCs w:val="20"/>
     </w:rPr>
   </w:style>
-  <w:style w:type="paragraph" w:styleId="HeaderandFooter">
+  <w:style w:type="paragraph" w:customStyle="1" w:styleId="HeaderandFooter">
     <w:name w:val="Header and Footer"/>
     <w:basedOn w:val="Normal"/>
     <w:qFormat/>
-    <w:pPr/>
-    <w:rPr/>
   </w:style>
   <w:style w:type="paragraph" w:styleId="Header">
     <w:name w:val="header"/>
@@ -3723,12 +3768,10 @@
     <w:rsid w:val="00982849"/>
     <w:pPr>
       <w:tabs>
-        <w:tab w:val="clear" w:pos="720"/>
-        <w:tab w:val="center" w:pos="4513" w:leader="none"/>
-        <w:tab w:val="right" w:pos="9026" w:leader="none"/>
+        <w:tab w:val="center" w:pos="4513"/>
+        <w:tab w:val="right" w:pos="9026"/>
       </w:tabs>
     </w:pPr>
-    <w:rPr/>
   </w:style>
   <w:style w:type="paragraph" w:styleId="Footer">
     <w:name w:val="footer"/>
@@ -3739,12 +3782,10 @@
     <w:rsid w:val="00982849"/>
     <w:pPr>
       <w:tabs>
-        <w:tab w:val="clear" w:pos="720"/>
-        <w:tab w:val="center" w:pos="4513" w:leader="none"/>
-        <w:tab w:val="right" w:pos="9026" w:leader="none"/>
+        <w:tab w:val="center" w:pos="4513"/>
+        <w:tab w:val="right" w:pos="9026"/>
       </w:tabs>
     </w:pPr>
-    <w:rPr/>
   </w:style>
   <w:style w:type="paragraph" w:styleId="FootnoteText">
     <w:name w:val="footnote text"/>
@@ -3754,96 +3795,67 @@
     <w:semiHidden/>
     <w:unhideWhenUsed/>
     <w:rsid w:val="00982849"/>
-    <w:pPr/>
-    <w:rPr/>
   </w:style>
   <w:style w:type="paragraph" w:styleId="ListParagraph">
     <w:name w:val="List Paragraph"/>
     <w:basedOn w:val="Normal"/>
     <w:uiPriority w:val="72"/>
     <w:qFormat/>
-    <w:rsid w:val="00d3461a"/>
+    <w:rsid w:val="00D3461A"/>
     <w:pPr>
-      <w:spacing w:before="0" w:after="0"/>
-      <w:ind w:start="720"/>
+      <w:ind w:left="720"/>
       <w:contextualSpacing/>
     </w:pPr>
-    <w:rPr/>
-  </w:style>
-  <w:style w:type="paragraph" w:styleId="FrameContents">
+  </w:style>
+  <w:style w:type="paragraph" w:customStyle="1" w:styleId="FrameContents">
     <w:name w:val="Frame Contents"/>
     <w:basedOn w:val="Normal"/>
     <w:qFormat/>
-    <w:pPr/>
-    <w:rPr/>
-  </w:style>
-  <w:style w:type="paragraph" w:styleId="FrameContentsuser">
+  </w:style>
+  <w:style w:type="paragraph" w:customStyle="1" w:styleId="FrameContentsuser">
     <w:name w:val="Frame Contents (user)"/>
     <w:basedOn w:val="Normal"/>
     <w:qFormat/>
-    <w:pPr/>
-    <w:rPr/>
-  </w:style>
-  <w:style w:type="numbering" w:styleId="NoList" w:default="1">
-    <w:name w:val="No List"/>
-    <w:uiPriority w:val="99"/>
-    <w:semiHidden/>
-    <w:unhideWhenUsed/>
-    <w:qFormat/>
-  </w:style>
-  <w:style w:type="table" w:default="1" w:styleId="TableNormal">
-    <w:name w:val="Normal Table"/>
-    <w:uiPriority w:val="99"/>
-    <w:semiHidden/>
-    <w:unhideWhenUsed/>
-    <w:tblPr>
-      <w:tblCellMar>
-        <w:top w:w="0" w:type="dxa"/>
-        <w:left w:w="108" w:type="dxa"/>
-        <w:bottom w:w="0" w:type="dxa"/>
-        <w:right w:w="108" w:type="dxa"/>
-      </w:tblCellMar>
-    </w:tblPr>
   </w:style>
 </w:styles>
 </file>
 
 <file path=word/theme/theme1.xml><?xml version="1.0" encoding="utf-8"?>
-<a:theme xmlns:a="http://schemas.openxmlformats.org/drawingml/2006/main" xmlns:r="http://schemas.openxmlformats.org/officeDocument/2006/relationships" name="Office Theme">
+<a:theme xmlns:a="http://schemas.openxmlformats.org/drawingml/2006/main" name="Office Theme">
   <a:themeElements>
     <a:clrScheme name="Office">
       <a:dk1>
         <a:srgbClr val="000000"/>
       </a:dk1>
       <a:lt1>
-        <a:srgbClr val="ffffff"/>
+        <a:srgbClr val="FFFFFF"/>
       </a:lt1>
       <a:dk2>
-        <a:srgbClr val="1f497d"/>
+        <a:srgbClr val="1F497D"/>
       </a:dk2>
       <a:lt2>
-        <a:srgbClr val="eeece1"/>
+        <a:srgbClr val="EEECE1"/>
       </a:lt2>
       <a:accent1>
-        <a:srgbClr val="4f81bd"/>
+        <a:srgbClr val="4F81BD"/>
       </a:accent1>
       <a:accent2>
-        <a:srgbClr val="c0504d"/>
+        <a:srgbClr val="C0504D"/>
       </a:accent2>
       <a:accent3>
-        <a:srgbClr val="9bbb59"/>
+        <a:srgbClr val="9BBB59"/>
       </a:accent3>
       <a:accent4>
-        <a:srgbClr val="8064a2"/>
+        <a:srgbClr val="8064A2"/>
       </a:accent4>
       <a:accent5>
-        <a:srgbClr val="4bacc6"/>
+        <a:srgbClr val="4BACC6"/>
       </a:accent5>
       <a:accent6>
-        <a:srgbClr val="f79646"/>
+        <a:srgbClr val="F79646"/>
       </a:accent6>
       <a:hlink>
-        <a:srgbClr val="0000ff"/>
+        <a:srgbClr val="0000FF"/>
       </a:hlink>
       <a:folHlink>
         <a:srgbClr val="800080"/>
@@ -3851,12 +3863,12 @@
     </a:clrScheme>
     <a:fontScheme name="Office">
       <a:majorFont>
-        <a:latin typeface="Calibri" pitchFamily="0" charset="1"/>
+        <a:latin typeface="Calibri"/>
         <a:ea typeface=""/>
         <a:cs typeface=""/>
       </a:majorFont>
       <a:minorFont>
-        <a:latin typeface="Cambria" pitchFamily="0" charset="1"/>
+        <a:latin typeface="Cambria"/>
         <a:ea typeface=""/>
         <a:cs typeface=""/>
       </a:minorFont>
@@ -3885,7 +3897,7 @@
             </a:gs>
           </a:gsLst>
           <a:lin ang="16200000" scaled="1"/>
-          <a:tileRect l="0" t="0" r="0" b="0"/>
+          <a:tileRect/>
         </a:gradFill>
         <a:gradFill>
           <a:gsLst>
@@ -3903,7 +3915,7 @@
             </a:gs>
           </a:gsLst>
           <a:lin ang="16200000" scaled="0"/>
-          <a:tileRect l="0" t="0" r="0" b="0"/>
+          <a:tileRect/>
         </a:gradFill>
       </a:fillStyleLst>
       <a:lnStyleLst>
@@ -3954,7 +3966,7 @@
           <a:path path="circle">
             <a:fillToRect l="50000" t="-80000" r="50000" b="180000"/>
           </a:path>
-          <a:tileRect l="0" t="0" r="0" b="0"/>
+          <a:tileRect/>
         </a:gradFill>
         <a:gradFill>
           <a:gsLst>
@@ -3972,11 +3984,13 @@
           <a:path path="circle">
             <a:fillToRect l="50000" t="50000" r="50000" b="50000"/>
           </a:path>
-          <a:tileRect l="0" t="0" r="0" b="0"/>
+          <a:tileRect/>
         </a:gradFill>
       </a:bgFillStyleLst>
     </a:fmtScheme>
   </a:themeElements>
+  <a:objectDefaults/>
+  <a:extraClrSchemeLst/>
 </a:theme>
 </file>
 

</xml_diff>

<commit_message>
Updated table in Word template
</commit_message>
<xml_diff>
--- a/2026/papers/2026_cinc_template.docx
+++ b/2026/papers/2026_cinc_template.docx
@@ -1,11 +1,11 @@
 
 <file path=word/document.xml><?xml version="1.0" encoding="utf-8"?>
-<w:document xmlns:wpc="http://schemas.microsoft.com/office/word/2010/wordprocessingCanvas" xmlns:cx="http://schemas.microsoft.com/office/drawing/2014/chartex" xmlns:cx1="http://schemas.microsoft.com/office/drawing/2015/9/8/chartex" xmlns:cx2="http://schemas.microsoft.com/office/drawing/2015/10/21/chartex" xmlns:cx3="http://schemas.microsoft.com/office/drawing/2016/5/9/chartex" xmlns:cx4="http://schemas.microsoft.com/office/drawing/2016/5/10/chartex" xmlns:cx5="http://schemas.microsoft.com/office/drawing/2016/5/11/chartex" xmlns:cx6="http://schemas.microsoft.com/office/drawing/2016/5/12/chartex" xmlns:cx7="http://schemas.microsoft.com/office/drawing/2016/5/13/chartex" xmlns:cx8="http://schemas.microsoft.com/office/drawing/2016/5/14/chartex" xmlns:mc="http://schemas.openxmlformats.org/markup-compatibility/2006" xmlns:m="http://schemas.openxmlformats.org/officeDocument/2006/math" xmlns:aink="http://schemas.microsoft.com/office/drawing/2016/ink" xmlns:am3d="http://schemas.microsoft.com/office/drawing/2017/model3d" xmlns:oel="http://schemas.microsoft.com/office/2019/extlst" xmlns:r="http://schemas.openxmlformats.org/officeDocument/2006/relationships" xmlns:wp14="http://schemas.microsoft.com/office/word/2010/wordprocessingDrawing" xmlns:wp="http://schemas.openxmlformats.org/drawingml/2006/wordprocessingDrawing" xmlns:wpg="http://schemas.microsoft.com/office/word/2010/wordprocessingGroup" xmlns:wpi="http://schemas.microsoft.com/office/word/2010/wordprocessingInk" xmlns:wps="http://schemas.microsoft.com/office/word/2010/wordprocessingShape" xmlns:o="urn:schemas-microsoft-com:office:office" xmlns:v="urn:schemas-microsoft-com:vml" xmlns:w10="urn:schemas-microsoft-com:office:word" xmlns:w="http://schemas.openxmlformats.org/wordprocessingml/2006/main" xmlns:w14="http://schemas.microsoft.com/office/word/2010/wordml" xmlns:w15="http://schemas.microsoft.com/office/word/2012/wordml" xmlns:w16cex="http://schemas.microsoft.com/office/word/2018/wordml/cex" xmlns:w16cid="http://schemas.microsoft.com/office/word/2016/wordml/cid" xmlns:w16="http://schemas.microsoft.com/office/word/2018/wordml" xmlns:w16sdtdh="http://schemas.microsoft.com/office/word/2020/wordml/sdtdatahash" xmlns:w16sdtfl="http://schemas.microsoft.com/office/word/2024/wordml/sdtformatlock" xmlns:w16se="http://schemas.microsoft.com/office/word/2015/wordml/symex" xmlns:w16du="http://schemas.microsoft.com/office/word/2023/wordml/word16du" xmlns:wne="http://schemas.microsoft.com/office/word/2006/wordml" mc:Ignorable="w14 w15 w16se w16cid w16 w16cex w16sdtdh w16sdtfl w16du wp14">
+<w:document xmlns:o="urn:schemas-microsoft-com:office:office" xmlns:r="http://schemas.openxmlformats.org/officeDocument/2006/relationships" xmlns:v="urn:schemas-microsoft-com:vml" xmlns:w="http://schemas.openxmlformats.org/wordprocessingml/2006/main" xmlns:w10="urn:schemas-microsoft-com:office:word" xmlns:wp="http://schemas.openxmlformats.org/drawingml/2006/wordprocessingDrawing" xmlns:pic="http://schemas.openxmlformats.org/drawingml/2006/picture" xmlns:wps="http://schemas.microsoft.com/office/word/2010/wordprocessingShape" xmlns:wpg="http://schemas.microsoft.com/office/word/2010/wordprocessingGroup" xmlns:mc="http://schemas.openxmlformats.org/markup-compatibility/2006" xmlns:wp14="http://schemas.microsoft.com/office/word/2010/wordprocessingDrawing" xmlns:w14="http://schemas.microsoft.com/office/word/2010/wordml" xmlns:w15="http://schemas.microsoft.com/office/word/2012/wordml" mc:Ignorable="w14 wp14 w15">
   <w:body>
     <w:p>
       <w:pPr>
         <w:pStyle w:val="PaperTitle"/>
-        <w:spacing w:line="288" w:lineRule="exact"/>
+        <w:spacing w:lineRule="exact" w:line="288" w:before="567" w:after="280"/>
         <w:rPr>
           <w:bCs/>
           <w:szCs w:val="28"/>
@@ -19,13 +19,6 @@
           <w:lang w:val="en-GB"/>
         </w:rPr>
         <w:t>Use the Same Title as Your Abstract or Change Your Abstract’s Title:</w:t>
-      </w:r>
-      <w:r>
-        <w:rPr>
-          <w:bCs/>
-          <w:szCs w:val="28"/>
-          <w:lang w:val="en-GB"/>
-        </w:rPr>
         <w:br/>
         <w:t>DO NOT use the terms ‘PhysioNet’, ‘Challenge’ or ‘Computing in Cardiology’ or Repeat the Title of the Challenge Verbatim. Be Specific and Unique: Subtitles are OK but Use Sentence Case Throughout</w:t>
       </w:r>
@@ -33,6 +26,7 @@
     <w:p>
       <w:pPr>
         <w:pStyle w:val="AuthorLine"/>
+        <w:rPr/>
       </w:pPr>
       <w:r>
         <w:rPr>
@@ -77,7 +71,7 @@
     <w:p>
       <w:pPr>
         <w:pStyle w:val="InstitutionLine"/>
-        <w:spacing w:after="0"/>
+        <w:spacing w:before="0" w:after="0"/>
         <w:rPr>
           <w:lang w:val="en-GB"/>
         </w:rPr>
@@ -99,7 +93,7 @@
     <w:p>
       <w:pPr>
         <w:pStyle w:val="InstitutionLine"/>
-        <w:spacing w:after="0"/>
+        <w:spacing w:before="0" w:after="0"/>
         <w:rPr>
           <w:lang w:val="en-GB"/>
         </w:rPr>
@@ -126,161 +120,104 @@
           <w:lang w:val="en-GB"/>
         </w:rPr>
       </w:pPr>
+      <w:r>
+        <w:rPr>
+          <w:lang w:val="en-GB"/>
+        </w:rPr>
+      </w:r>
     </w:p>
     <w:p>
       <w:pPr>
         <w:sectPr>
+          <w:type w:val="nextPage"/>
           <w:pgSz w:w="12240" w:h="15840"/>
-          <w:pgMar w:top="1440" w:right="1224" w:bottom="1440" w:left="1224" w:header="0" w:footer="0" w:gutter="0"/>
-          <w:cols w:space="720"/>
-          <w:formProt w:val="0"/>
-          <w:docGrid w:linePitch="100"/>
+          <w:pgMar w:left="1224" w:right="1224" w:gutter="0" w:header="0" w:top="1440" w:footer="0" w:bottom="1440"/>
+          <w:pgNumType w:fmt="decimal"/>
+          <w:formProt w:val="false"/>
+          <w:textDirection w:val="lrTb"/>
+          <w:docGrid w:type="default" w:linePitch="100" w:charSpace="0"/>
         </w:sectPr>
       </w:pPr>
     </w:p>
     <w:p>
       <w:pPr>
         <w:pStyle w:val="AbstractHeading"/>
-      </w:pPr>
-      <w:r>
+        <w:rPr/>
+      </w:pPr>
+      <w:r>
+        <w:rPr/>
         <w:t>Abstract</w:t>
       </w:r>
     </w:p>
     <w:p>
       <w:pPr>
         <w:pStyle w:val="AbstractText"/>
-        <w:ind w:firstLine="0"/>
+        <w:ind w:hanging="0"/>
+        <w:rPr/>
       </w:pPr>
       <w:r>
         <w:rPr>
           <w:iCs/>
         </w:rPr>
-        <w:t xml:space="preserve">Write your abstract here. Your abstract can be up to 300 words or 25 lines long. It cannot contain footnotes or a bibliography. You must define </w:t>
-      </w:r>
-      <w:proofErr w:type="gramStart"/>
+        <w:t xml:space="preserve">Write your abstract here. Your abstract can be up to 300 words or 25 lines long. It cannot contain footnotes or a bibliography. You must define all of the abbreviations in your abstract and redefine them in your paper. </w:t>
+      </w:r>
+    </w:p>
+    <w:p>
+      <w:pPr>
+        <w:pStyle w:val="AbstractText"/>
+        <w:rPr/>
+      </w:pPr>
       <w:r>
         <w:rPr>
           <w:iCs/>
         </w:rPr>
-        <w:t>all of</w:t>
-      </w:r>
-      <w:proofErr w:type="gramEnd"/>
-      <w:r>
+        <w:t xml:space="preserve">Please include the following information in your abstract: your team name, your scores from cross-validation on the public training data, and your official scores and rankings on the hidden validation or test data. The scores that you receive from us before the conference use the val- idation set, and the scores that you receive from us after the conference use the test set. For your preprint, please include your official scores and rankings on the validation set. For your final paper, please replace them with your official scores and rankings on the test set. </w:t>
+      </w:r>
+    </w:p>
+    <w:p>
+      <w:pPr>
+        <w:pStyle w:val="AbstractText"/>
         <w:rPr>
           <w:iCs/>
         </w:rPr>
-        <w:t xml:space="preserve"> the abbreviations in your abstract and redefine them in your paper. </w:t>
+      </w:pPr>
+      <w:r>
+        <w:rPr>
+          <w:iCs/>
+        </w:rPr>
+        <w:t xml:space="preserve">Please do not describe the data, objective, scoring, organization and structure, or other details of the Challenge in your abstract. The paper from the organizers of the Challenge describes these things so that you can focus on your approach. Your abstract should indicate that your article is part of the 2026 Challenge, but you should not write more about the Challenge beyond that. Instead, your abstract should describe your work and contributions and highlight the key issues that you encountered and how you addressed them. </w:t>
       </w:r>
     </w:p>
     <w:p>
       <w:pPr>
         <w:pStyle w:val="AbstractText"/>
-      </w:pPr>
-      <w:r>
         <w:rPr>
           <w:iCs/>
         </w:rPr>
-        <w:t xml:space="preserve">Please include the following information in your abstract: your </w:t>
-      </w:r>
-      <w:proofErr w:type="gramStart"/>
+      </w:pPr>
       <w:r>
         <w:rPr>
           <w:iCs/>
         </w:rPr>
-        <w:t>team</w:t>
-      </w:r>
-      <w:proofErr w:type="gramEnd"/>
+        <w:t xml:space="preserve">As part of the George B. Moody PhysioNet Challenge 2026, we developed a computational approach based on XGBoost to predict future diagnosis of cognitive impairment from polysomnography (PSG). Our team, [team name], developed a novel approach that [insert your novel contribution to the field here beyond using something out of the box]. Our model received a Challenge score of 0.678 (ranked 20th out of 50 teams) on the hidden validation set (replace later with ‘hidden test set’).’ Please write your results in the same way as we have outlined! </w:t>
+      </w:r>
+    </w:p>
+    <w:p>
+      <w:pPr>
+        <w:pStyle w:val="AbstractText"/>
+        <w:rPr/>
+      </w:pPr>
       <w:r>
         <w:rPr>
           <w:iCs/>
         </w:rPr>
-        <w:t xml:space="preserve"> name, your scores from cross-validation on the public training data, and your official scores and rankings on the hidden validation or test data. The scores that you receive from us before the conference use the </w:t>
-      </w:r>
-      <w:proofErr w:type="spellStart"/>
-      <w:r>
-        <w:rPr>
-          <w:iCs/>
-        </w:rPr>
-        <w:t>val</w:t>
-      </w:r>
-      <w:proofErr w:type="spellEnd"/>
-      <w:r>
-        <w:rPr>
-          <w:iCs/>
-        </w:rPr>
-        <w:t xml:space="preserve">- </w:t>
-      </w:r>
-      <w:proofErr w:type="spellStart"/>
-      <w:r>
-        <w:rPr>
-          <w:iCs/>
-        </w:rPr>
-        <w:t>idation</w:t>
-      </w:r>
-      <w:proofErr w:type="spellEnd"/>
-      <w:r>
-        <w:rPr>
-          <w:iCs/>
-        </w:rPr>
-        <w:t xml:space="preserve"> set, and the scores that you receive from us after the conference use the test set. For your preprint, please include your official scores and rankings on the validation set. For your final paper, please replace them with your official scores and rankings on the test set. </w:t>
+        <w:t xml:space="preserve">This abstract is too long! Make your abstract shorter. </w:t>
       </w:r>
     </w:p>
     <w:p>
       <w:pPr>
         <w:pStyle w:val="AbstractText"/>
-        <w:rPr>
-          <w:iCs/>
-        </w:rPr>
-      </w:pPr>
-      <w:r>
-        <w:rPr>
-          <w:iCs/>
-        </w:rPr>
-        <w:t xml:space="preserve">Please do not describe the data, objective, scoring, organization and structure, or other details of the Challenge in your abstract. The paper from the organizers of the Challenge describes these things so that you can focus on your approach. Your abstract should indicate that your article is part of the 2026 Challenge, but you should not write more about the Challenge beyond that. Instead, your abstract should describe your work and contributions and highlight the key issues that you encountered and how you addressed them. </w:t>
-      </w:r>
-    </w:p>
-    <w:p>
-      <w:pPr>
-        <w:pStyle w:val="AbstractText"/>
-        <w:rPr>
-          <w:iCs/>
-        </w:rPr>
-      </w:pPr>
-      <w:r>
-        <w:rPr>
-          <w:iCs/>
-        </w:rPr>
-        <w:t xml:space="preserve">As part of the George B. Moody PhysioNet Challenge 2026, we developed a computational approach based on </w:t>
-      </w:r>
-      <w:proofErr w:type="spellStart"/>
-      <w:r>
-        <w:rPr>
-          <w:iCs/>
-        </w:rPr>
-        <w:t>XGBoost</w:t>
-      </w:r>
-      <w:proofErr w:type="spellEnd"/>
-      <w:r>
-        <w:rPr>
-          <w:iCs/>
-        </w:rPr>
-        <w:t xml:space="preserve"> to predict future diagnosis of cognitive impairment from polysomnography (PSG). Our team, [team name], developed a novel approach that [insert your novel contribution to the field here beyond using something out of the box]. Our model received a Challenge score of 0.678 (ranked 20th out of 50 teams) on the hidden validation set (replace later with ‘hidden test set’).’ Please write your results in the same way as we have outlined! </w:t>
-      </w:r>
-    </w:p>
-    <w:p>
-      <w:pPr>
-        <w:pStyle w:val="AbstractText"/>
-      </w:pPr>
-      <w:r>
-        <w:rPr>
-          <w:iCs/>
-        </w:rPr>
-        <w:t xml:space="preserve">This abstract is too long! Make your abstract shorter. </w:t>
-      </w:r>
-    </w:p>
-    <w:p>
-      <w:pPr>
-        <w:pStyle w:val="AbstractText"/>
+        <w:rPr/>
       </w:pPr>
       <w:r>
         <w:rPr>
@@ -291,17 +228,29 @@
     </w:p>
     <w:p>
       <w:pPr>
-        <w:rPr>
-          <w:lang w:val="en-GB"/>
-        </w:rPr>
-      </w:pPr>
-    </w:p>
-    <w:p>
-      <w:pPr>
-        <w:rPr>
-          <w:lang w:val="en-GB"/>
-        </w:rPr>
-      </w:pPr>
+        <w:pStyle w:val="Normal"/>
+        <w:rPr>
+          <w:lang w:val="en-GB"/>
+        </w:rPr>
+      </w:pPr>
+      <w:r>
+        <w:rPr>
+          <w:lang w:val="en-GB"/>
+        </w:rPr>
+      </w:r>
+    </w:p>
+    <w:p>
+      <w:pPr>
+        <w:pStyle w:val="Normal"/>
+        <w:rPr>
+          <w:lang w:val="en-GB"/>
+        </w:rPr>
+      </w:pPr>
+      <w:r>
+        <w:rPr>
+          <w:lang w:val="en-GB"/>
+        </w:rPr>
+      </w:r>
     </w:p>
     <w:p>
       <w:pPr>
@@ -309,48 +258,53 @@
         <w:tabs>
           <w:tab w:val="clear" w:pos="720"/>
         </w:tabs>
-      </w:pPr>
-      <w:r>
+        <w:rPr/>
+      </w:pPr>
+      <w:r>
+        <w:rPr/>
         <w:t>1.</w:t>
-      </w:r>
-      <w:r>
         <w:tab/>
         <w:t>Introduction</w:t>
       </w:r>
     </w:p>
     <w:p>
       <w:pPr>
+        <w:pStyle w:val="Normal"/>
         <w:tabs>
-          <w:tab w:val="left" w:pos="-720"/>
-          <w:tab w:val="left" w:pos="0"/>
-          <w:tab w:val="left" w:pos="224"/>
-          <w:tab w:val="left" w:pos="720"/>
-          <w:tab w:val="left" w:pos="1440"/>
-          <w:tab w:val="left" w:pos="2160"/>
-          <w:tab w:val="left" w:pos="2880"/>
-          <w:tab w:val="left" w:pos="3600"/>
-          <w:tab w:val="left" w:pos="4320"/>
+          <w:tab w:val="left" w:pos="-720" w:leader="none"/>
+          <w:tab w:val="left" w:pos="0" w:leader="none"/>
+          <w:tab w:val="left" w:pos="224" w:leader="none"/>
+          <w:tab w:val="left" w:pos="720" w:leader="none"/>
+          <w:tab w:val="left" w:pos="1440" w:leader="none"/>
+          <w:tab w:val="left" w:pos="2160" w:leader="none"/>
+          <w:tab w:val="left" w:pos="2880" w:leader="none"/>
+          <w:tab w:val="left" w:pos="3600" w:leader="none"/>
+          <w:tab w:val="left" w:pos="4320" w:leader="none"/>
         </w:tabs>
         <w:ind w:firstLine="224"/>
-      </w:pPr>
-      <w:r>
+        <w:rPr/>
+      </w:pPr>
+      <w:r>
+        <w:rPr/>
         <w:t>Please read this entire article and treat it as a checklist. If you fail to follow the instructions, your paper will be rejected, you will not qualify for a prize, and you will not be published in the proceedings.</w:t>
       </w:r>
     </w:p>
     <w:p>
       <w:pPr>
+        <w:pStyle w:val="Normal"/>
         <w:tabs>
-          <w:tab w:val="left" w:pos="-720"/>
-          <w:tab w:val="left" w:pos="0"/>
-          <w:tab w:val="left" w:pos="224"/>
-          <w:tab w:val="left" w:pos="720"/>
-          <w:tab w:val="left" w:pos="1440"/>
-          <w:tab w:val="left" w:pos="2160"/>
-          <w:tab w:val="left" w:pos="2880"/>
-          <w:tab w:val="left" w:pos="3600"/>
-          <w:tab w:val="left" w:pos="4320"/>
+          <w:tab w:val="left" w:pos="-720" w:leader="none"/>
+          <w:tab w:val="left" w:pos="0" w:leader="none"/>
+          <w:tab w:val="left" w:pos="224" w:leader="none"/>
+          <w:tab w:val="left" w:pos="720" w:leader="none"/>
+          <w:tab w:val="left" w:pos="1440" w:leader="none"/>
+          <w:tab w:val="left" w:pos="2160" w:leader="none"/>
+          <w:tab w:val="left" w:pos="2880" w:leader="none"/>
+          <w:tab w:val="left" w:pos="3600" w:leader="none"/>
+          <w:tab w:val="left" w:pos="4320" w:leader="none"/>
         </w:tabs>
         <w:ind w:firstLine="224"/>
+        <w:rPr/>
       </w:pPr>
       <w:r>
         <w:rPr>
@@ -368,21 +322,23 @@
         <w:t>. Do not motivate the problem</w:t>
       </w:r>
       <w:r>
+        <w:rPr/>
         <w:t xml:space="preserve"> like you would do in a normal article. We have already done this for you in the main reference (see below). Save space for the Methods section. You can write something like the following text, but do not use the following text verbatim: </w:t>
       </w:r>
     </w:p>
     <w:p>
       <w:pPr>
+        <w:pStyle w:val="Normal"/>
         <w:tabs>
-          <w:tab w:val="left" w:pos="-720"/>
-          <w:tab w:val="left" w:pos="0"/>
-          <w:tab w:val="left" w:pos="224"/>
-          <w:tab w:val="left" w:pos="720"/>
-          <w:tab w:val="left" w:pos="1440"/>
-          <w:tab w:val="left" w:pos="2160"/>
-          <w:tab w:val="left" w:pos="2880"/>
-          <w:tab w:val="left" w:pos="3600"/>
-          <w:tab w:val="left" w:pos="4320"/>
+          <w:tab w:val="left" w:pos="-720" w:leader="none"/>
+          <w:tab w:val="left" w:pos="0" w:leader="none"/>
+          <w:tab w:val="left" w:pos="224" w:leader="none"/>
+          <w:tab w:val="left" w:pos="720" w:leader="none"/>
+          <w:tab w:val="left" w:pos="1440" w:leader="none"/>
+          <w:tab w:val="left" w:pos="2160" w:leader="none"/>
+          <w:tab w:val="left" w:pos="2880" w:leader="none"/>
+          <w:tab w:val="left" w:pos="3600" w:leader="none"/>
+          <w:tab w:val="left" w:pos="4320" w:leader="none"/>
         </w:tabs>
         <w:ind w:firstLine="224"/>
         <w:rPr>
@@ -395,237 +351,219 @@
           <w:i/>
           <w:iCs/>
         </w:rPr>
-        <w:t>We participated in the 2026 George B. Moody PhysioNet Challenge, which invited teams to develop algorithmic approaches for using polysomnography (PSG), which records various physiological signals during sleep studies, to predict future diagnoses of cognitive impairment [1, 2]. Our Challenge entry addresses this problem by applying high-order Runge-</w:t>
-      </w:r>
-      <w:proofErr w:type="spellStart"/>
+        <w:t>We participated in the 2026 George B. Moody PhysioNet Challenge, which invited teams to develop algorithmic approaches for using polysomnography (PSG), which records various physiological signals during sleep studies, to predict future diagnoses of cognitive impairment [1, 2]. Our Challenge entry addresses this problem by applying high-order Runge-Kutta discontinuous Galerkin (RKDG) methods to. . .</w:t>
+      </w:r>
+    </w:p>
+    <w:p>
+      <w:pPr>
+        <w:pStyle w:val="Normal"/>
+        <w:tabs>
+          <w:tab w:val="left" w:pos="-720" w:leader="none"/>
+          <w:tab w:val="left" w:pos="0" w:leader="none"/>
+          <w:tab w:val="left" w:pos="224" w:leader="none"/>
+          <w:tab w:val="left" w:pos="720" w:leader="none"/>
+          <w:tab w:val="left" w:pos="1440" w:leader="none"/>
+          <w:tab w:val="left" w:pos="2160" w:leader="none"/>
+          <w:tab w:val="left" w:pos="2880" w:leader="none"/>
+          <w:tab w:val="left" w:pos="3600" w:leader="none"/>
+          <w:tab w:val="left" w:pos="4320" w:leader="none"/>
+        </w:tabs>
+        <w:ind w:firstLine="224"/>
+        <w:rPr/>
+      </w:pPr>
+      <w:r>
+        <w:rPr>
+          <w:b/>
+          <w:bCs/>
+        </w:rPr>
+        <w:t>Do not</w:t>
+      </w:r>
+      <w:r>
+        <w:rPr/>
+        <w:t xml:space="preserve"> describe the Challenge beyond the detail found in the above paragraph. </w:t>
+      </w:r>
+      <w:r>
+        <w:rPr>
+          <w:b/>
+          <w:bCs/>
+        </w:rPr>
+        <w:t>Do not</w:t>
+      </w:r>
+      <w:r>
+        <w:rPr/>
+        <w:t xml:space="preserve"> provide details about your method in the introduction. Save them for methods section! </w:t>
+      </w:r>
+      <w:r>
+        <w:rPr>
+          <w:b/>
+          <w:bCs/>
+        </w:rPr>
+        <w:t>Do not</w:t>
+      </w:r>
+      <w:r>
+        <w:rPr/>
+        <w:t xml:space="preserve"> include results for your method in the introduction. Those goes in the results section! </w:t>
+      </w:r>
+    </w:p>
+    <w:p>
+      <w:pPr>
+        <w:pStyle w:val="Normal"/>
+        <w:tabs>
+          <w:tab w:val="left" w:pos="-720" w:leader="none"/>
+          <w:tab w:val="left" w:pos="0" w:leader="none"/>
+          <w:tab w:val="left" w:pos="224" w:leader="none"/>
+          <w:tab w:val="left" w:pos="720" w:leader="none"/>
+          <w:tab w:val="left" w:pos="1440" w:leader="none"/>
+          <w:tab w:val="left" w:pos="2160" w:leader="none"/>
+          <w:tab w:val="left" w:pos="2880" w:leader="none"/>
+          <w:tab w:val="left" w:pos="3600" w:leader="none"/>
+          <w:tab w:val="left" w:pos="4320" w:leader="none"/>
+        </w:tabs>
+        <w:ind w:firstLine="224"/>
+        <w:rPr/>
+      </w:pPr>
+      <w:r>
+        <w:rPr>
+          <w:b/>
+          <w:bCs/>
+        </w:rPr>
+        <w:t>Be sure to cite [2] for the Challenge description.</w:t>
+      </w:r>
+      <w:r>
+        <w:rPr/>
+        <w:t xml:space="preserve"> This reference is the definitive description of the Challenge, and you should refer to [2] instead of describing the Challenge itself, thus leaving you more room to focus on </w:t>
+      </w:r>
       <w:r>
         <w:rPr>
           <w:i/>
           <w:iCs/>
         </w:rPr>
-        <w:t>Kutta</w:t>
-      </w:r>
-      <w:proofErr w:type="spellEnd"/>
-      <w:r>
-        <w:rPr>
-          <w:i/>
-          <w:iCs/>
-        </w:rPr>
-        <w:t xml:space="preserve"> discontinuous </w:t>
-      </w:r>
-      <w:proofErr w:type="spellStart"/>
-      <w:r>
-        <w:rPr>
-          <w:i/>
-          <w:iCs/>
-        </w:rPr>
-        <w:t>Galerkin</w:t>
-      </w:r>
-      <w:proofErr w:type="spellEnd"/>
-      <w:r>
-        <w:rPr>
-          <w:i/>
-          <w:iCs/>
-        </w:rPr>
-        <w:t xml:space="preserve"> (RKDG) methods to. . .</w:t>
-      </w:r>
-    </w:p>
-    <w:p>
-      <w:pPr>
+        <w:t xml:space="preserve">your </w:t>
+      </w:r>
+      <w:r>
+        <w:rPr/>
+        <w:t xml:space="preserve">approach. </w:t>
+      </w:r>
+    </w:p>
+    <w:p>
+      <w:pPr>
+        <w:pStyle w:val="Normal"/>
         <w:tabs>
-          <w:tab w:val="left" w:pos="-720"/>
-          <w:tab w:val="left" w:pos="0"/>
-          <w:tab w:val="left" w:pos="224"/>
-          <w:tab w:val="left" w:pos="720"/>
-          <w:tab w:val="left" w:pos="1440"/>
-          <w:tab w:val="left" w:pos="2160"/>
-          <w:tab w:val="left" w:pos="2880"/>
-          <w:tab w:val="left" w:pos="3600"/>
-          <w:tab w:val="left" w:pos="4320"/>
+          <w:tab w:val="left" w:pos="-720" w:leader="none"/>
+          <w:tab w:val="left" w:pos="0" w:leader="none"/>
+          <w:tab w:val="left" w:pos="224" w:leader="none"/>
+          <w:tab w:val="left" w:pos="720" w:leader="none"/>
+          <w:tab w:val="left" w:pos="1440" w:leader="none"/>
+          <w:tab w:val="left" w:pos="2160" w:leader="none"/>
+          <w:tab w:val="left" w:pos="2880" w:leader="none"/>
+          <w:tab w:val="left" w:pos="3600" w:leader="none"/>
+          <w:tab w:val="left" w:pos="4320" w:leader="none"/>
         </w:tabs>
         <w:ind w:firstLine="224"/>
+        <w:rPr/>
       </w:pPr>
       <w:r>
         <w:rPr>
           <w:b/>
           <w:bCs/>
         </w:rPr>
-        <w:t>Do not</w:t>
-      </w:r>
-      <w:r>
-        <w:t xml:space="preserve"> describe the Challenge beyond the detail found in the above paragraph. </w:t>
-      </w:r>
+        <w:t>Be sure to cite the Challenge data.</w:t>
+      </w:r>
+      <w:r>
+        <w:rPr/>
+        <w:t xml:space="preserve"> The availability of this database made the Challenge possible, and you should refer to [3] instead of describing the Challenge data so that you can focus on your methods. </w:t>
+      </w:r>
+    </w:p>
+    <w:p>
+      <w:pPr>
+        <w:pStyle w:val="Normal"/>
+        <w:tabs>
+          <w:tab w:val="left" w:pos="-720" w:leader="none"/>
+          <w:tab w:val="left" w:pos="0" w:leader="none"/>
+          <w:tab w:val="left" w:pos="224" w:leader="none"/>
+          <w:tab w:val="left" w:pos="720" w:leader="none"/>
+          <w:tab w:val="left" w:pos="1440" w:leader="none"/>
+          <w:tab w:val="left" w:pos="2160" w:leader="none"/>
+          <w:tab w:val="left" w:pos="2880" w:leader="none"/>
+          <w:tab w:val="left" w:pos="3600" w:leader="none"/>
+          <w:tab w:val="left" w:pos="4320" w:leader="none"/>
+        </w:tabs>
+        <w:ind w:firstLine="224"/>
+        <w:rPr>
+          <w:lang w:val="en-GB"/>
+        </w:rPr>
+      </w:pPr>
       <w:r>
         <w:rPr>
           <w:b/>
           <w:bCs/>
         </w:rPr>
-        <w:t>Do not</w:t>
-      </w:r>
-      <w:r>
-        <w:t xml:space="preserve"> provide details about your method in the introduction. Save them for methods section! </w:t>
+        <w:t>Do not cite a URL, a website, or any other reference to describe the Challenge.</w:t>
+      </w:r>
+      <w:r>
+        <w:rPr/>
+        <w:t xml:space="preserve"> It is better to refer to a single, consistent description of the Challenge and focus on describing your approach than to have many slightly different descriptions of the Challenge and leave out the details of your approach. </w:t>
+      </w:r>
+    </w:p>
+    <w:p>
+      <w:pPr>
+        <w:pStyle w:val="Normal"/>
+        <w:tabs>
+          <w:tab w:val="left" w:pos="-720" w:leader="none"/>
+          <w:tab w:val="left" w:pos="0" w:leader="none"/>
+          <w:tab w:val="left" w:pos="224" w:leader="none"/>
+          <w:tab w:val="left" w:pos="720" w:leader="none"/>
+          <w:tab w:val="left" w:pos="1440" w:leader="none"/>
+          <w:tab w:val="left" w:pos="2160" w:leader="none"/>
+          <w:tab w:val="left" w:pos="2880" w:leader="none"/>
+          <w:tab w:val="left" w:pos="3600" w:leader="none"/>
+          <w:tab w:val="left" w:pos="4320" w:leader="none"/>
+        </w:tabs>
+        <w:ind w:firstLine="224"/>
+        <w:rPr>
+          <w:lang w:val="en-GB"/>
+        </w:rPr>
+      </w:pPr>
+      <w:r>
+        <w:rPr>
+          <w:lang w:val="en-GB"/>
+        </w:rPr>
+        <w:t xml:space="preserve">Please do not survey the literature in this field: we have already done this in the main article describing the Challenge [2]. </w:t>
       </w:r>
       <w:r>
         <w:rPr>
           <w:b/>
           <w:bCs/>
-        </w:rPr>
-        <w:t>Do not</w:t>
-      </w:r>
-      <w:r>
-        <w:t xml:space="preserve"> include results for your method in the introduction. Those goes in the results section! </w:t>
-      </w:r>
-    </w:p>
-    <w:p>
-      <w:pPr>
+          <w:lang w:val="en-GB"/>
+        </w:rPr>
+        <w:t xml:space="preserve">To be clear, there is no need to cite other works in this field unless they are directly relevant to the techniques you used / you built directly off their unique approach. If you think we’ve missed a key article in our paper, please let us know. </w:t>
+      </w:r>
+    </w:p>
+    <w:p>
+      <w:pPr>
+        <w:pStyle w:val="Normal"/>
         <w:tabs>
-          <w:tab w:val="left" w:pos="-720"/>
-          <w:tab w:val="left" w:pos="0"/>
-          <w:tab w:val="left" w:pos="224"/>
-          <w:tab w:val="left" w:pos="720"/>
-          <w:tab w:val="left" w:pos="1440"/>
-          <w:tab w:val="left" w:pos="2160"/>
-          <w:tab w:val="left" w:pos="2880"/>
-          <w:tab w:val="left" w:pos="3600"/>
-          <w:tab w:val="left" w:pos="4320"/>
+          <w:tab w:val="left" w:pos="-720" w:leader="none"/>
+          <w:tab w:val="left" w:pos="0" w:leader="none"/>
+          <w:tab w:val="left" w:pos="224" w:leader="none"/>
+          <w:tab w:val="left" w:pos="720" w:leader="none"/>
+          <w:tab w:val="left" w:pos="1440" w:leader="none"/>
+          <w:tab w:val="left" w:pos="2160" w:leader="none"/>
+          <w:tab w:val="left" w:pos="2880" w:leader="none"/>
+          <w:tab w:val="left" w:pos="3600" w:leader="none"/>
+          <w:tab w:val="left" w:pos="4320" w:leader="none"/>
         </w:tabs>
         <w:ind w:firstLine="224"/>
-      </w:pPr>
-      <w:r>
-        <w:rPr>
-          <w:b/>
-          <w:bCs/>
-        </w:rPr>
-        <w:t>Be sure to cite [2] for the Challenge description.</w:t>
-      </w:r>
-      <w:r>
-        <w:t xml:space="preserve"> This reference is the definitive description of the Challenge, and you should refer to [2] instead of describing the Challenge itself, thus leaving you more room to focus on </w:t>
-      </w:r>
-      <w:r>
-        <w:rPr>
-          <w:i/>
-          <w:iCs/>
-        </w:rPr>
-        <w:t xml:space="preserve">your </w:t>
-      </w:r>
-      <w:r>
-        <w:t xml:space="preserve">approach. </w:t>
-      </w:r>
-    </w:p>
-    <w:p>
-      <w:pPr>
-        <w:tabs>
-          <w:tab w:val="left" w:pos="-720"/>
-          <w:tab w:val="left" w:pos="0"/>
-          <w:tab w:val="left" w:pos="224"/>
-          <w:tab w:val="left" w:pos="720"/>
-          <w:tab w:val="left" w:pos="1440"/>
-          <w:tab w:val="left" w:pos="2160"/>
-          <w:tab w:val="left" w:pos="2880"/>
-          <w:tab w:val="left" w:pos="3600"/>
-          <w:tab w:val="left" w:pos="4320"/>
-        </w:tabs>
-        <w:ind w:firstLine="224"/>
-      </w:pPr>
-      <w:r>
-        <w:rPr>
-          <w:b/>
-          <w:bCs/>
-        </w:rPr>
-        <w:t>Be sure to cite the Challenge data.</w:t>
-      </w:r>
-      <w:r>
-        <w:t xml:space="preserve"> The availability of this database made the Challenge possible, and you should refer to [3] instead of describing the Challenge data so that you can focus on your methods. </w:t>
-      </w:r>
-    </w:p>
-    <w:p>
-      <w:pPr>
-        <w:tabs>
-          <w:tab w:val="left" w:pos="-720"/>
-          <w:tab w:val="left" w:pos="0"/>
-          <w:tab w:val="left" w:pos="224"/>
-          <w:tab w:val="left" w:pos="720"/>
-          <w:tab w:val="left" w:pos="1440"/>
-          <w:tab w:val="left" w:pos="2160"/>
-          <w:tab w:val="left" w:pos="2880"/>
-          <w:tab w:val="left" w:pos="3600"/>
-          <w:tab w:val="left" w:pos="4320"/>
-        </w:tabs>
-        <w:ind w:firstLine="224"/>
-        <w:rPr>
-          <w:lang w:val="en-GB"/>
-        </w:rPr>
-      </w:pPr>
-      <w:r>
-        <w:rPr>
-          <w:b/>
-          <w:bCs/>
-        </w:rPr>
-        <w:t>Do not cite a URL, a website, or any other reference to describe the Challenge.</w:t>
-      </w:r>
-      <w:r>
-        <w:t xml:space="preserve"> It is better to refer to a single, consistent description of the Challenge and focus on describing your approach than to have many slightly different descriptions of the Challenge and leave out the details of your approach. </w:t>
-      </w:r>
-    </w:p>
-    <w:p>
-      <w:pPr>
-        <w:tabs>
-          <w:tab w:val="left" w:pos="-720"/>
-          <w:tab w:val="left" w:pos="0"/>
-          <w:tab w:val="left" w:pos="224"/>
-          <w:tab w:val="left" w:pos="720"/>
-          <w:tab w:val="left" w:pos="1440"/>
-          <w:tab w:val="left" w:pos="2160"/>
-          <w:tab w:val="left" w:pos="2880"/>
-          <w:tab w:val="left" w:pos="3600"/>
-          <w:tab w:val="left" w:pos="4320"/>
-        </w:tabs>
-        <w:ind w:firstLine="224"/>
-        <w:rPr>
-          <w:lang w:val="en-GB"/>
-        </w:rPr>
-      </w:pPr>
-      <w:r>
-        <w:rPr>
-          <w:lang w:val="en-GB"/>
-        </w:rPr>
-        <w:t xml:space="preserve">Please do not survey the literature in this field: we have </w:t>
-      </w:r>
-      <w:r>
-        <w:rPr>
-          <w:lang w:val="en-GB"/>
-        </w:rPr>
-        <w:lastRenderedPageBreak/>
-        <w:t xml:space="preserve">already done this in the main article describing the Challenge [2]. </w:t>
-      </w:r>
-      <w:r>
-        <w:rPr>
-          <w:b/>
-          <w:bCs/>
-          <w:lang w:val="en-GB"/>
-        </w:rPr>
-        <w:t xml:space="preserve">To be clear, there is no need to cite other works in this field unless they are directly relevant to the techniques you used / you built directly off their unique approach. If you think we’ve missed a key article in our paper, please let us know. </w:t>
-      </w:r>
-    </w:p>
-    <w:p>
-      <w:pPr>
-        <w:tabs>
-          <w:tab w:val="left" w:pos="-720"/>
-          <w:tab w:val="left" w:pos="0"/>
-          <w:tab w:val="left" w:pos="224"/>
-          <w:tab w:val="left" w:pos="720"/>
-          <w:tab w:val="left" w:pos="1440"/>
-          <w:tab w:val="left" w:pos="2160"/>
-          <w:tab w:val="left" w:pos="2880"/>
-          <w:tab w:val="left" w:pos="3600"/>
-          <w:tab w:val="left" w:pos="4320"/>
-        </w:tabs>
-        <w:ind w:firstLine="224"/>
-        <w:jc w:val="left"/>
-        <w:rPr>
-          <w:lang w:val="en-GB"/>
-        </w:rPr>
-      </w:pPr>
+        <w:jc w:val="start"/>
+        <w:rPr>
+          <w:lang w:val="en-GB"/>
+        </w:rPr>
+      </w:pPr>
+      <w:r>
+        <w:rPr>
+          <w:lang w:val="en-GB"/>
+        </w:rPr>
+      </w:r>
     </w:p>
     <w:p>
       <w:pPr>
@@ -633,27 +571,28 @@
         <w:tabs>
           <w:tab w:val="clear" w:pos="720"/>
         </w:tabs>
-      </w:pPr>
-      <w:r>
+        <w:rPr/>
+      </w:pPr>
+      <w:r>
+        <w:rPr/>
         <w:t>2.</w:t>
-      </w:r>
-      <w:r>
         <w:tab/>
         <w:t>Method</w:t>
       </w:r>
     </w:p>
     <w:p>
       <w:pPr>
+        <w:pStyle w:val="Normal"/>
         <w:tabs>
-          <w:tab w:val="left" w:pos="-720"/>
-          <w:tab w:val="left" w:pos="0"/>
-          <w:tab w:val="left" w:pos="224"/>
-          <w:tab w:val="left" w:pos="720"/>
-          <w:tab w:val="left" w:pos="1440"/>
-          <w:tab w:val="left" w:pos="2160"/>
-          <w:tab w:val="left" w:pos="2880"/>
-          <w:tab w:val="left" w:pos="3600"/>
-          <w:tab w:val="left" w:pos="4320"/>
+          <w:tab w:val="left" w:pos="-720" w:leader="none"/>
+          <w:tab w:val="left" w:pos="0" w:leader="none"/>
+          <w:tab w:val="left" w:pos="224" w:leader="none"/>
+          <w:tab w:val="left" w:pos="720" w:leader="none"/>
+          <w:tab w:val="left" w:pos="1440" w:leader="none"/>
+          <w:tab w:val="left" w:pos="2160" w:leader="none"/>
+          <w:tab w:val="left" w:pos="2880" w:leader="none"/>
+          <w:tab w:val="left" w:pos="3600" w:leader="none"/>
+          <w:tab w:val="left" w:pos="4320" w:leader="none"/>
         </w:tabs>
         <w:ind w:firstLine="224"/>
         <w:rPr>
@@ -700,16 +639,17 @@
     </w:p>
     <w:p>
       <w:pPr>
+        <w:pStyle w:val="Normal"/>
         <w:tabs>
-          <w:tab w:val="left" w:pos="-720"/>
-          <w:tab w:val="left" w:pos="0"/>
-          <w:tab w:val="left" w:pos="224"/>
-          <w:tab w:val="left" w:pos="720"/>
-          <w:tab w:val="left" w:pos="1440"/>
-          <w:tab w:val="left" w:pos="2160"/>
-          <w:tab w:val="left" w:pos="2880"/>
-          <w:tab w:val="left" w:pos="3600"/>
-          <w:tab w:val="left" w:pos="4320"/>
+          <w:tab w:val="left" w:pos="-720" w:leader="none"/>
+          <w:tab w:val="left" w:pos="0" w:leader="none"/>
+          <w:tab w:val="left" w:pos="224" w:leader="none"/>
+          <w:tab w:val="left" w:pos="720" w:leader="none"/>
+          <w:tab w:val="left" w:pos="1440" w:leader="none"/>
+          <w:tab w:val="left" w:pos="2160" w:leader="none"/>
+          <w:tab w:val="left" w:pos="2880" w:leader="none"/>
+          <w:tab w:val="left" w:pos="3600" w:leader="none"/>
+          <w:tab w:val="left" w:pos="4320" w:leader="none"/>
         </w:tabs>
         <w:ind w:firstLine="224"/>
         <w:rPr>
@@ -728,139 +668,82 @@
           <w:bCs/>
           <w:lang w:val="en-GB"/>
         </w:rPr>
-        <w:t xml:space="preserve">If we reject your </w:t>
-      </w:r>
-      <w:proofErr w:type="spellStart"/>
-      <w:r>
-        <w:rPr>
-          <w:b/>
-          <w:bCs/>
-          <w:lang w:val="en-GB"/>
-        </w:rPr>
-        <w:t>CinC</w:t>
-      </w:r>
-      <w:proofErr w:type="spellEnd"/>
-      <w:r>
-        <w:rPr>
-          <w:b/>
-          <w:bCs/>
-          <w:lang w:val="en-GB"/>
-        </w:rPr>
-        <w:t xml:space="preserve"> article you will be disqualified from the Challenge and removed from the official rankings.</w:t>
-      </w:r>
-      <w:r>
-        <w:rPr>
-          <w:lang w:val="en-GB"/>
-        </w:rPr>
-        <w:t xml:space="preserve"> Accurate dissemination of the results of the Challenge </w:t>
-      </w:r>
-      <w:proofErr w:type="gramStart"/>
-      <w:r>
-        <w:rPr>
-          <w:lang w:val="en-GB"/>
-        </w:rPr>
-        <w:t>are</w:t>
-      </w:r>
-      <w:proofErr w:type="gramEnd"/>
-      <w:r>
-        <w:rPr>
-          <w:lang w:val="en-GB"/>
-        </w:rPr>
-        <w:t xml:space="preserve"> the most important product. Misleading or confusing articles detract from the impact. So please read these instructions carefully. </w:t>
-      </w:r>
-    </w:p>
-    <w:p>
-      <w:pPr>
+        <w:t>If we reject your CinC article you will be disqualified from the Challenge and removed from the official rankings.</w:t>
+      </w:r>
+      <w:r>
+        <w:rPr>
+          <w:lang w:val="en-GB"/>
+        </w:rPr>
+        <w:t xml:space="preserve"> Accurate dissemination of the results of the Challenge are the most important product. Misleading or confusing articles detract from the impact. So please read these instructions carefully. </w:t>
+      </w:r>
+    </w:p>
+    <w:p>
+      <w:pPr>
+        <w:pStyle w:val="Normal"/>
         <w:tabs>
-          <w:tab w:val="left" w:pos="-720"/>
-          <w:tab w:val="left" w:pos="0"/>
-          <w:tab w:val="left" w:pos="224"/>
-          <w:tab w:val="left" w:pos="720"/>
-          <w:tab w:val="left" w:pos="1440"/>
-          <w:tab w:val="left" w:pos="2160"/>
-          <w:tab w:val="left" w:pos="2880"/>
-          <w:tab w:val="left" w:pos="3600"/>
-          <w:tab w:val="left" w:pos="4320"/>
+          <w:tab w:val="left" w:pos="-720" w:leader="none"/>
+          <w:tab w:val="left" w:pos="0" w:leader="none"/>
+          <w:tab w:val="left" w:pos="224" w:leader="none"/>
+          <w:tab w:val="left" w:pos="720" w:leader="none"/>
+          <w:tab w:val="left" w:pos="1440" w:leader="none"/>
+          <w:tab w:val="left" w:pos="2160" w:leader="none"/>
+          <w:tab w:val="left" w:pos="2880" w:leader="none"/>
+          <w:tab w:val="left" w:pos="3600" w:leader="none"/>
+          <w:tab w:val="left" w:pos="4320" w:leader="none"/>
         </w:tabs>
-        <w:ind w:firstLine="0"/>
-        <w:rPr>
-          <w:lang w:val="en-GB"/>
-        </w:rPr>
-      </w:pPr>
-      <w:r>
-        <w:rPr>
-          <w:lang w:val="en-GB"/>
-        </w:rPr>
-        <w:t xml:space="preserve">1. Include any data processing steps that you performed, including any exclusion criteria or </w:t>
-      </w:r>
-      <w:proofErr w:type="spellStart"/>
-      <w:r>
-        <w:rPr>
-          <w:lang w:val="en-GB"/>
-        </w:rPr>
-        <w:t>relabeling</w:t>
-      </w:r>
-      <w:proofErr w:type="spellEnd"/>
-      <w:r>
-        <w:rPr>
-          <w:lang w:val="en-GB"/>
-        </w:rPr>
-        <w:t xml:space="preserve"> of the training data.</w:t>
-      </w:r>
-    </w:p>
-    <w:p>
-      <w:pPr>
+        <w:ind w:hanging="0"/>
+        <w:rPr>
+          <w:lang w:val="en-GB"/>
+        </w:rPr>
+      </w:pPr>
+      <w:r>
+        <w:rPr>
+          <w:lang w:val="en-GB"/>
+        </w:rPr>
+        <w:t>1. Include any data processing steps that you performed, including any exclusion criteria or relabeling of the training data.</w:t>
+      </w:r>
+    </w:p>
+    <w:p>
+      <w:pPr>
+        <w:pStyle w:val="Normal"/>
         <w:tabs>
-          <w:tab w:val="left" w:pos="-720"/>
-          <w:tab w:val="left" w:pos="0"/>
-          <w:tab w:val="left" w:pos="224"/>
-          <w:tab w:val="left" w:pos="720"/>
-          <w:tab w:val="left" w:pos="1440"/>
-          <w:tab w:val="left" w:pos="2160"/>
-          <w:tab w:val="left" w:pos="2880"/>
-          <w:tab w:val="left" w:pos="3600"/>
-          <w:tab w:val="left" w:pos="4320"/>
+          <w:tab w:val="left" w:pos="-720" w:leader="none"/>
+          <w:tab w:val="left" w:pos="0" w:leader="none"/>
+          <w:tab w:val="left" w:pos="224" w:leader="none"/>
+          <w:tab w:val="left" w:pos="720" w:leader="none"/>
+          <w:tab w:val="left" w:pos="1440" w:leader="none"/>
+          <w:tab w:val="left" w:pos="2160" w:leader="none"/>
+          <w:tab w:val="left" w:pos="2880" w:leader="none"/>
+          <w:tab w:val="left" w:pos="3600" w:leader="none"/>
+          <w:tab w:val="left" w:pos="4320" w:leader="none"/>
         </w:tabs>
-        <w:ind w:firstLine="0"/>
-        <w:rPr>
-          <w:lang w:val="en-GB"/>
-        </w:rPr>
-      </w:pPr>
-      <w:r>
-        <w:rPr>
-          <w:lang w:val="en-GB"/>
-        </w:rPr>
-        <w:t xml:space="preserve">2. Include a description of </w:t>
-      </w:r>
-      <w:proofErr w:type="gramStart"/>
-      <w:r>
-        <w:rPr>
-          <w:lang w:val="en-GB"/>
-        </w:rPr>
-        <w:t>all of</w:t>
-      </w:r>
-      <w:proofErr w:type="gramEnd"/>
-      <w:r>
-        <w:rPr>
-          <w:lang w:val="en-GB"/>
-        </w:rPr>
-        <w:t xml:space="preserve"> the parameters that you optimized and how you optimized them, including any data and methods that you used for optimization. If you picked a parameter without optimizing, then report that, too. A table of parameters and their optimized/chosen value would be very useful. </w:t>
-      </w:r>
-    </w:p>
-    <w:p>
-      <w:pPr>
+        <w:ind w:hanging="0"/>
+        <w:rPr>
+          <w:lang w:val="en-GB"/>
+        </w:rPr>
+      </w:pPr>
+      <w:r>
+        <w:rPr>
+          <w:lang w:val="en-GB"/>
+        </w:rPr>
+        <w:t xml:space="preserve">2. Include a description of all of the parameters that you optimized and how you optimized them, including any data and methods that you used for optimization. If you picked a parameter without optimizing, then report that, too. A table of parameters and their optimized/chosen value would be very useful. </w:t>
+      </w:r>
+    </w:p>
+    <w:p>
+      <w:pPr>
+        <w:pStyle w:val="Normal"/>
         <w:tabs>
-          <w:tab w:val="left" w:pos="-720"/>
-          <w:tab w:val="left" w:pos="0"/>
-          <w:tab w:val="left" w:pos="224"/>
-          <w:tab w:val="left" w:pos="720"/>
-          <w:tab w:val="left" w:pos="1440"/>
-          <w:tab w:val="left" w:pos="2160"/>
-          <w:tab w:val="left" w:pos="2880"/>
-          <w:tab w:val="left" w:pos="3600"/>
-          <w:tab w:val="left" w:pos="4320"/>
+          <w:tab w:val="left" w:pos="-720" w:leader="none"/>
+          <w:tab w:val="left" w:pos="0" w:leader="none"/>
+          <w:tab w:val="left" w:pos="224" w:leader="none"/>
+          <w:tab w:val="left" w:pos="720" w:leader="none"/>
+          <w:tab w:val="left" w:pos="1440" w:leader="none"/>
+          <w:tab w:val="left" w:pos="2160" w:leader="none"/>
+          <w:tab w:val="left" w:pos="2880" w:leader="none"/>
+          <w:tab w:val="left" w:pos="3600" w:leader="none"/>
+          <w:tab w:val="left" w:pos="4320" w:leader="none"/>
         </w:tabs>
-        <w:ind w:firstLine="0"/>
+        <w:ind w:hanging="0"/>
         <w:rPr>
           <w:lang w:val="en-GB"/>
         </w:rPr>
@@ -874,35 +757,23 @@
     </w:p>
     <w:p>
       <w:pPr>
-        <w:ind w:firstLine="0"/>
-        <w:rPr>
-          <w:lang w:val="en-GB"/>
-        </w:rPr>
-      </w:pPr>
-      <w:r>
-        <w:rPr>
-          <w:lang w:val="en-GB"/>
-        </w:rPr>
-        <w:t xml:space="preserve">4. Be sure to highlight any similarities or differences be- tween your approaches and that of others (i.e. read their preprints after </w:t>
-      </w:r>
-      <w:proofErr w:type="spellStart"/>
-      <w:r>
-        <w:rPr>
-          <w:lang w:val="en-GB"/>
-        </w:rPr>
-        <w:t>CinC</w:t>
-      </w:r>
-      <w:proofErr w:type="spellEnd"/>
-      <w:r>
-        <w:rPr>
-          <w:lang w:val="en-GB"/>
-        </w:rPr>
-        <w:t xml:space="preserve"> and compare your approach to other teams.</w:t>
-      </w:r>
-    </w:p>
-    <w:p>
-      <w:pPr>
-        <w:ind w:firstLine="0"/>
+        <w:pStyle w:val="Normal"/>
+        <w:ind w:hanging="0"/>
+        <w:rPr>
+          <w:lang w:val="en-GB"/>
+        </w:rPr>
+      </w:pPr>
+      <w:r>
+        <w:rPr>
+          <w:lang w:val="en-GB"/>
+        </w:rPr>
+        <w:t>4. Be sure to highlight any similarities or differences be- tween your approaches and that of others (i.e. read their preprints after CinC and compare your approach to other teams.</w:t>
+      </w:r>
+    </w:p>
+    <w:p>
+      <w:pPr>
+        <w:pStyle w:val="Normal"/>
+        <w:ind w:hanging="0"/>
         <w:rPr>
           <w:lang w:val="en-GB"/>
         </w:rPr>
@@ -916,56 +787,40 @@
     </w:p>
     <w:p>
       <w:pPr>
-        <w:ind w:firstLine="0"/>
-        <w:jc w:val="right"/>
-        <w:rPr>
-          <w:lang w:val="en-GB"/>
-        </w:rPr>
-      </w:pPr>
-      <m:oMathPara>
+        <w:pStyle w:val="Normal"/>
+        <w:ind w:hanging="0"/>
+        <w:jc w:val="end"/>
+        <w:rPr>
+          <w:lang w:val="en-GB"/>
+        </w:rPr>
+      </w:pPr>
+      <w:r>
+        <w:rPr/>
+      </w:r>
+      <m:oMathPara xmlns:m="http://schemas.openxmlformats.org/officeDocument/2006/math">
         <m:oMathParaPr>
           <m:jc m:val="right"/>
         </m:oMathParaPr>
         <m:oMath>
           <m:nary>
             <m:naryPr>
-              <m:ctrlPr>
-                <w:rPr>
-                  <w:rFonts w:ascii="Cambria Math" w:hAnsi="Cambria Math"/>
-                </w:rPr>
-              </m:ctrlPr>
+              <m:chr m:val="∫"/>
             </m:naryPr>
             <m:sub>
               <m:r>
-                <w:rPr>
-                  <w:rFonts w:ascii="Cambria Math" w:hAnsi="Cambria Math"/>
-                </w:rPr>
-                <m:t>0</m:t>
+                <m:t xml:space="preserve">0</m:t>
               </m:r>
             </m:sub>
             <m:sup>
               <m:r>
-                <w:rPr>
-                  <w:rFonts w:ascii="Cambria Math" w:hAnsi="Cambria Math"/>
-                </w:rPr>
-                <m:t>∞</m:t>
+                <m:t xml:space="preserve">∞</m:t>
               </m:r>
             </m:sup>
             <m:e>
               <m:sSup>
-                <m:sSupPr>
-                  <m:ctrlPr>
-                    <w:rPr>
-                      <w:rFonts w:ascii="Cambria Math" w:hAnsi="Cambria Math"/>
-                    </w:rPr>
-                  </m:ctrlPr>
-                </m:sSupPr>
                 <m:e>
                   <m:r>
-                    <w:rPr>
-                      <w:rFonts w:ascii="Cambria Math" w:hAnsi="Cambria Math"/>
-                    </w:rPr>
-                    <m:t>e</m:t>
+                    <m:t xml:space="preserve">e</m:t>
                   </m:r>
                 </m:e>
                 <m:sup>
@@ -974,91 +829,54 @@
                       <m:lit/>
                       <m:nor/>
                     </m:rPr>
-                    <m:t>-</m:t>
+                    <m:t xml:space="preserve">-</m:t>
                   </m:r>
                   <m:sSup>
-                    <m:sSupPr>
-                      <m:ctrlPr>
-                        <w:rPr>
-                          <w:rFonts w:ascii="Cambria Math" w:hAnsi="Cambria Math"/>
-                        </w:rPr>
-                      </m:ctrlPr>
-                    </m:sSupPr>
                     <m:e>
                       <m:r>
-                        <w:rPr>
-                          <w:rFonts w:ascii="Cambria Math" w:hAnsi="Cambria Math"/>
-                        </w:rPr>
-                        <m:t>x</m:t>
+                        <m:t xml:space="preserve">x</m:t>
                       </m:r>
                     </m:e>
                     <m:sup>
                       <m:r>
-                        <w:rPr>
-                          <w:rFonts w:ascii="Cambria Math" w:hAnsi="Cambria Math"/>
-                        </w:rPr>
-                        <m:t>2</m:t>
+                        <m:t xml:space="preserve">2</m:t>
                       </m:r>
                     </m:sup>
                   </m:sSup>
                 </m:sup>
               </m:sSup>
               <m:r>
-                <w:rPr>
-                  <w:rFonts w:ascii="Cambria Math" w:hAnsi="Cambria Math"/>
-                </w:rPr>
-                <m:t>dx</m:t>
+                <m:t xml:space="preserve">dx</m:t>
               </m:r>
               <m:r>
                 <m:rPr>
                   <m:lit/>
                   <m:nor/>
                 </m:rPr>
-                <m:t>=</m:t>
+                <m:t xml:space="preserve">=</m:t>
               </m:r>
               <m:f>
-                <m:fPr>
-                  <m:ctrlPr>
-                    <w:rPr>
-                      <w:rFonts w:ascii="Cambria Math" w:hAnsi="Cambria Math"/>
-                    </w:rPr>
-                  </m:ctrlPr>
-                </m:fPr>
                 <m:num>
                   <m:rad>
                     <m:radPr>
                       <m:degHide m:val="1"/>
-                      <m:ctrlPr>
-                        <w:rPr>
-                          <w:rFonts w:ascii="Cambria Math" w:hAnsi="Cambria Math"/>
-                        </w:rPr>
-                      </m:ctrlPr>
                     </m:radPr>
                     <m:deg/>
                     <m:e>
                       <m:r>
-                        <w:rPr>
-                          <w:rFonts w:ascii="Cambria Math" w:hAnsi="Cambria Math"/>
-                        </w:rPr>
-                        <m:t>π</m:t>
+                        <m:t xml:space="preserve">π</m:t>
                       </m:r>
                     </m:e>
                   </m:rad>
                 </m:num>
                 <m:den>
                   <m:r>
-                    <w:rPr>
-                      <w:rFonts w:ascii="Cambria Math" w:hAnsi="Cambria Math"/>
-                    </w:rPr>
-                    <m:t>2</m:t>
+                    <m:t xml:space="preserve">2</m:t>
                   </m:r>
                 </m:den>
               </m:f>
               <m:r>
-                <w:rPr>
-                  <w:rFonts w:ascii="Cambria Math" w:hAnsi="Cambria Math"/>
-                </w:rPr>
-                <m:t>.</m:t>
+                <m:t xml:space="preserve">.</m:t>
               </m:r>
               <m:r>
                 <m:rPr>
@@ -1068,10 +886,13 @@
                 <m:t xml:space="preserve">                           </m:t>
               </m:r>
               <m:r>
-                <w:rPr>
-                  <w:rFonts w:ascii="Cambria Math" w:hAnsi="Cambria Math"/>
-                </w:rPr>
-                <m:t>(1)</m:t>
+                <m:t xml:space="preserve">(</m:t>
+              </m:r>
+              <m:r>
+                <m:t xml:space="preserve">1</m:t>
+              </m:r>
+              <m:r>
+                <m:t xml:space="preserve">)</m:t>
               </m:r>
             </m:e>
           </m:nary>
@@ -1080,7 +901,8 @@
     </w:p>
     <w:p>
       <w:pPr>
-        <w:ind w:firstLine="0"/>
+        <w:pStyle w:val="Normal"/>
+        <w:ind w:hanging="0"/>
         <w:rPr>
           <w:lang w:val="en-GB"/>
         </w:rPr>
@@ -1094,7 +916,8 @@
     </w:p>
     <w:p>
       <w:pPr>
-        <w:ind w:firstLine="0"/>
+        <w:pStyle w:val="Normal"/>
+        <w:ind w:hanging="0"/>
         <w:rPr>
           <w:lang w:val="en-GB"/>
         </w:rPr>
@@ -1108,7 +931,8 @@
     </w:p>
     <w:p>
       <w:pPr>
-        <w:ind w:firstLine="0"/>
+        <w:pStyle w:val="Normal"/>
+        <w:ind w:hanging="0"/>
         <w:rPr>
           <w:lang w:val="en-GB"/>
         </w:rPr>
@@ -1122,33 +946,38 @@
     </w:p>
     <w:p>
       <w:pPr>
-        <w:ind w:firstLine="0"/>
-        <w:rPr>
-          <w:lang w:val="en-GB"/>
-        </w:rPr>
-      </w:pPr>
-      <w:r>
-        <w:rPr>
-          <w:lang w:val="en-GB"/>
-        </w:rPr>
-        <w:t xml:space="preserve"> 9. Use appropriate significant figures, i.e., number of decimal places.</w:t>
-      </w:r>
-    </w:p>
-    <w:p>
-      <w:pPr>
-        <w:ind w:firstLine="0"/>
-        <w:rPr>
-          <w:lang w:val="en-GB"/>
-        </w:rPr>
-      </w:pPr>
-      <w:r>
-        <w:rPr>
-          <w:noProof/>
-        </w:rPr>
+        <w:pStyle w:val="Normal"/>
+        <w:ind w:hanging="0"/>
+        <w:rPr>
+          <w:lang w:val="en-GB"/>
+        </w:rPr>
+      </w:pPr>
+      <w:r>
+        <w:rPr>
+          <w:lang w:val="en-GB"/>
+        </w:rPr>
+        <w:t xml:space="preserve"> </w:t>
+      </w:r>
+      <w:r>
+        <w:rPr>
+          <w:lang w:val="en-GB"/>
+        </w:rPr>
+        <w:t>9. Use appropriate significant figures, i.e., number of decimal places.</w:t>
+      </w:r>
+    </w:p>
+    <w:p>
+      <w:pPr>
+        <w:pStyle w:val="Normal"/>
+        <w:ind w:hanging="0"/>
+        <w:rPr>
+          <w:lang w:val="en-GB"/>
+        </w:rPr>
+      </w:pPr>
+      <w:r>
         <mc:AlternateContent>
           <mc:Choice Requires="wpg">
             <w:drawing>
-              <wp:anchor distT="0" distB="0" distL="114300" distR="114300" simplePos="0" relativeHeight="2" behindDoc="0" locked="0" layoutInCell="0" allowOverlap="1" wp14:anchorId="1DDC4378" wp14:editId="727AA8F5">
+              <wp:anchor distT="0" distB="0" distL="114300" distR="114300" simplePos="0" relativeHeight="2" behindDoc="0" locked="0" layoutInCell="0" allowOverlap="1" wp14:anchorId="1DDC4378">
                 <wp:simplePos x="0" y="0"/>
                 <wp:positionH relativeFrom="column">
                   <wp:posOffset>24130</wp:posOffset>
@@ -1160,7 +989,6 @@
                 <wp:effectExtent l="0" t="0" r="0" b="0"/>
                 <wp:wrapTopAndBottom/>
                 <wp:docPr id="1" name="Group 3"/>
-                <wp:cNvGraphicFramePr/>
                 <a:graphic xmlns:a="http://schemas.openxmlformats.org/drawingml/2006/main">
                   <a:graphicData uri="http://schemas.microsoft.com/office/word/2010/wordprocessingGroup">
                     <wpg:wgp>
@@ -1179,7 +1007,7 @@
                           <pic:cNvPicPr/>
                         </pic:nvPicPr>
                         <pic:blipFill>
-                          <a:blip r:embed="rId7"/>
+                          <a:blip r:embed="rId2"/>
                           <a:stretch/>
                         </pic:blipFill>
                         <pic:spPr>
@@ -1201,29 +1029,23 @@
                         <wps:cNvSpPr/>
                         <wps:spPr>
                           <a:xfrm>
-                            <a:off x="63360" y="1956960"/>
-                            <a:ext cx="2875320" cy="1731600"/>
+                            <a:off x="63360" y="1957680"/>
+                            <a:ext cx="2875320" cy="1730880"/>
                           </a:xfrm>
                           <a:prstGeom prst="rect">
                             <a:avLst/>
                           </a:prstGeom>
                           <a:solidFill>
-                            <a:srgbClr val="FFFFFF"/>
+                            <a:srgbClr val="ffffff"/>
                           </a:solidFill>
                           <a:ln w="0">
                             <a:noFill/>
                           </a:ln>
                         </wps:spPr>
                         <wps:style>
-                          <a:lnRef idx="0">
-                            <a:scrgbClr r="0" g="0" b="0"/>
-                          </a:lnRef>
-                          <a:fillRef idx="0">
-                            <a:scrgbClr r="0" g="0" b="0"/>
-                          </a:fillRef>
-                          <a:effectRef idx="0">
-                            <a:scrgbClr r="0" g="0" b="0"/>
-                          </a:effectRef>
+                          <a:lnRef idx="0"/>
+                          <a:fillRef idx="0"/>
+                          <a:effectRef idx="0"/>
                           <a:fontRef idx="minor"/>
                         </wps:style>
                         <wps:txbx>
@@ -1231,10 +1053,11 @@
                             <w:p>
                               <w:pPr>
                                 <w:pStyle w:val="Caption"/>
-                                <w:ind w:firstLine="0"/>
+                                <w:spacing w:before="0" w:after="200"/>
+                                <w:ind w:hanging="0"/>
                                 <w:rPr>
-                                  <w:i w:val="0"/>
-                                  <w:iCs w:val="0"/>
+                                  <w:i w:val="false"/>
+                                  <w:iCs w:val="false"/>
                                   <w:color w:val="auto"/>
                                   <w:sz w:val="20"/>
                                   <w:szCs w:val="20"/>
@@ -1243,8 +1066,8 @@
                               </w:pPr>
                               <w:r>
                                 <w:rPr>
-                                  <w:i w:val="0"/>
-                                  <w:iCs w:val="0"/>
+                                  <w:i w:val="false"/>
+                                  <w:iCs w:val="false"/>
                                   <w:color w:val="auto"/>
                                   <w:sz w:val="20"/>
                                   <w:szCs w:val="20"/>
@@ -1253,8 +1076,8 @@
                               </w:r>
                               <w:r>
                                 <w:rPr>
-                                  <w:i w:val="0"/>
-                                  <w:iCs w:val="0"/>
+                                  <w:i w:val="false"/>
+                                  <w:iCs w:val="false"/>
                                   <w:color w:val="auto"/>
                                   <w:sz w:val="20"/>
                                   <w:szCs w:val="20"/>
@@ -1263,8 +1086,8 @@
                               </w:r>
                               <w:r>
                                 <w:rPr>
-                                  <w:i w:val="0"/>
-                                  <w:iCs w:val="0"/>
+                                  <w:i w:val="false"/>
+                                  <w:iCs w:val="false"/>
                                   <w:color w:val="auto"/>
                                   <w:sz w:val="20"/>
                                   <w:szCs w:val="20"/>
@@ -1273,8 +1096,8 @@
                               </w:r>
                               <w:r>
                                 <w:rPr>
-                                  <w:i w:val="0"/>
-                                  <w:iCs w:val="0"/>
+                                  <w:i w:val="false"/>
+                                  <w:iCs w:val="false"/>
                                   <w:color w:val="auto"/>
                                   <w:sz w:val="20"/>
                                   <w:szCs w:val="20"/>
@@ -1283,8 +1106,8 @@
                               </w:r>
                               <w:r>
                                 <w:rPr>
-                                  <w:i w:val="0"/>
-                                  <w:iCs w:val="0"/>
+                                  <w:i w:val="false"/>
+                                  <w:iCs w:val="false"/>
                                   <w:color w:val="auto"/>
                                   <w:sz w:val="20"/>
                                   <w:szCs w:val="20"/>
@@ -1293,8 +1116,8 @@
                               </w:r>
                               <w:r>
                                 <w:rPr>
-                                  <w:i w:val="0"/>
-                                  <w:iCs w:val="0"/>
+                                  <w:i w:val="false"/>
+                                  <w:iCs w:val="false"/>
                                   <w:color w:val="auto"/>
                                   <w:sz w:val="20"/>
                                   <w:szCs w:val="20"/>
@@ -1303,8 +1126,8 @@
                               </w:r>
                               <w:r>
                                 <w:rPr>
-                                  <w:i w:val="0"/>
-                                  <w:iCs w:val="0"/>
+                                  <w:i w:val="false"/>
+                                  <w:iCs w:val="false"/>
                                   <w:color w:val="auto"/>
                                   <w:sz w:val="20"/>
                                   <w:szCs w:val="20"/>
@@ -1314,7 +1137,7 @@
                             </w:p>
                           </w:txbxContent>
                         </wps:txbx>
-                        <wps:bodyPr lIns="0" tIns="0" rIns="0" bIns="0" anchor="t">
+                        <wps:bodyPr lIns="0" rIns="0" tIns="0" bIns="0" anchor="t">
                           <a:noAutofit/>
                         </wps:bodyPr>
                       </wps:wsp>
@@ -1324,7 +1147,7 @@
               </wp:anchor>
             </w:drawing>
           </mc:Choice>
-          <mc:Fallback xmlns:pic="http://schemas.openxmlformats.org/drawingml/2006/picture">
+          <mc:Fallback>
             <w:pict>
               <v:group id="shape_0" alt="Group 3" style="position:absolute;margin-left:1.9pt;margin-top:10.4pt;width:231.4pt;height:290.45pt" coordorigin="38,208" coordsize="4628,5809">
                 <v:shapetype id="_x0000_t75" coordsize="21600,21600" o:spt="75" o:preferrelative="t" path="m@4@5l@4@11@9@11@9@5xe" filled="f" stroked="f">
@@ -1347,11 +1170,11 @@
                   <o:lock v:ext="edit" aspectratio="t"/>
                 </v:shapetype>
                 <v:shape id="shape_0" stroked="f" o:allowincell="f" style="position:absolute;left:38;top:208;width:4353;height:3056;mso-wrap-style:none;v-text-anchor:middle" type="_x0000_t75">
-                  <v:imagedata r:id="rId8" o:detectmouseclick="t"/>
+                  <v:imagedata r:id="rId3" o:detectmouseclick="t"/>
                   <v:stroke color="#3465a4" joinstyle="round" endcap="flat"/>
                   <w10:wrap type="topAndBottom"/>
                 </v:shape>
-                <v:rect id="shape_0" fillcolor="white" stroked="f" o:allowincell="f" style="position:absolute;left:138;top:3290;width:4527;height:2726;mso-wrap-style:square;v-text-anchor:top">
+                <v:rect id="shape_0" fillcolor="white" stroked="f" o:allowincell="f" style="position:absolute;left:138;top:3291;width:4527;height:2725;mso-wrap-style:square;v-text-anchor:top">
                   <v:fill o:detectmouseclick="t" type="solid" color2="black"/>
                   <v:stroke color="#3465a4" joinstyle="round" endcap="flat"/>
                   <v:textbox>
@@ -1459,7 +1282,8 @@
     </w:p>
     <w:p>
       <w:pPr>
-        <w:ind w:firstLine="0"/>
+        <w:pStyle w:val="Normal"/>
+        <w:ind w:hanging="0"/>
         <w:rPr>
           <w:lang w:val="en-GB"/>
         </w:rPr>
@@ -1473,56 +1297,30 @@
     </w:p>
     <w:p>
       <w:pPr>
-        <w:ind w:firstLine="0"/>
-        <w:rPr>
-          <w:lang w:val="en-GB"/>
-        </w:rPr>
-      </w:pPr>
-      <w:r>
-        <w:rPr>
-          <w:lang w:val="en-GB"/>
-        </w:rPr>
-        <w:t xml:space="preserve">12. Note that a significant portion of the population has </w:t>
-      </w:r>
-      <w:proofErr w:type="spellStart"/>
-      <w:r>
-        <w:rPr>
-          <w:lang w:val="en-GB"/>
-        </w:rPr>
-        <w:t>color</w:t>
-      </w:r>
-      <w:proofErr w:type="spellEnd"/>
-      <w:r>
-        <w:rPr>
-          <w:lang w:val="en-GB"/>
-        </w:rPr>
-        <w:t xml:space="preserve"> perception issues and/or your article may be viewed in black and white. </w:t>
-      </w:r>
-      <w:proofErr w:type="spellStart"/>
-      <w:r>
-        <w:rPr>
-          <w:lang w:val="en-GB"/>
-        </w:rPr>
-        <w:t>Color</w:t>
-      </w:r>
-      <w:proofErr w:type="spellEnd"/>
-      <w:r>
-        <w:rPr>
-          <w:lang w:val="en-GB"/>
-        </w:rPr>
-        <w:t xml:space="preserve"> your figures accordingly.</w:t>
+        <w:pStyle w:val="Normal"/>
+        <w:ind w:hanging="0"/>
+        <w:rPr>
+          <w:lang w:val="en-GB"/>
+        </w:rPr>
+      </w:pPr>
+      <w:r>
+        <w:rPr>
+          <w:lang w:val="en-GB"/>
+        </w:rPr>
+        <w:t>12. Note that a significant portion of the population has color perception issues and/or your article may be viewed in black and white. Color your figures accordingly.</w:t>
       </w:r>
       <w:r>
         <w:rPr>
           <w:rStyle w:val="FootnoteReference"/>
           <w:lang w:val="en-GB"/>
         </w:rPr>
-        <w:footnoteReference w:id="1"/>
-      </w:r>
-    </w:p>
-    <w:p>
-      <w:pPr>
-        <w:ind w:firstLine="0"/>
+        <w:footnoteReference w:id="2"/>
+      </w:r>
+    </w:p>
+    <w:p>
+      <w:pPr>
+        <w:pStyle w:val="Normal"/>
+        <w:ind w:hanging="0"/>
         <w:rPr>
           <w:lang w:val="en-GB"/>
         </w:rPr>
@@ -1536,7 +1334,8 @@
     </w:p>
     <w:p>
       <w:pPr>
-        <w:ind w:firstLine="0"/>
+        <w:pStyle w:val="Normal"/>
+        <w:ind w:hanging="0"/>
         <w:rPr>
           <w:lang w:val="en-GB"/>
         </w:rPr>
@@ -1550,7 +1349,8 @@
     </w:p>
     <w:p>
       <w:pPr>
-        <w:ind w:firstLine="0"/>
+        <w:pStyle w:val="Normal"/>
+        <w:ind w:hanging="0"/>
         <w:rPr>
           <w:lang w:val="en-GB"/>
         </w:rPr>
@@ -1564,8 +1364,9 @@
     </w:p>
     <w:p>
       <w:pPr>
-        <w:spacing w:after="240"/>
-        <w:ind w:firstLine="0"/>
+        <w:pStyle w:val="Normal"/>
+        <w:spacing w:before="0" w:after="240"/>
+        <w:ind w:hanging="0"/>
         <w:rPr>
           <w:lang w:val="en-GB"/>
         </w:rPr>
@@ -1581,8 +1382,15 @@
       <w:tblPr>
         <w:tblW w:w="4106" w:type="dxa"/>
         <w:jc w:val="center"/>
+        <w:tblInd w:w="0" w:type="dxa"/>
         <w:tblLayout w:type="fixed"/>
-        <w:tblLook w:val="0020" w:firstRow="1" w:lastRow="0" w:firstColumn="0" w:lastColumn="0" w:noHBand="0" w:noVBand="0"/>
+        <w:tblCellMar>
+          <w:top w:w="0" w:type="dxa"/>
+          <w:start w:w="108" w:type="dxa"/>
+          <w:bottom w:w="0" w:type="dxa"/>
+          <w:end w:w="108" w:type="dxa"/>
+        </w:tblCellMar>
+        <w:tblLook w:val="0020" w:noHBand="0" w:noVBand="0" w:firstColumn="0" w:lastRow="0" w:lastColumn="0" w:firstRow="1"/>
       </w:tblPr>
       <w:tblGrid>
         <w:gridCol w:w="2268"/>
@@ -1590,9 +1398,7 @@
         <w:gridCol w:w="706"/>
       </w:tblGrid>
       <w:tr>
-        <w:trPr>
-          <w:jc w:val="center"/>
-        </w:trPr>
+        <w:trPr/>
         <w:tc>
           <w:tcPr>
             <w:tcW w:w="2268" w:type="dxa"/>
@@ -1664,9 +1470,7 @@
         </w:tc>
       </w:tr>
       <w:tr>
-        <w:trPr>
-          <w:jc w:val="center"/>
-        </w:trPr>
+        <w:trPr/>
         <w:tc>
           <w:tcPr>
             <w:tcW w:w="2268" w:type="dxa"/>
@@ -1707,16 +1511,8 @@
               <w:rPr>
                 <w:lang w:val="en-GB"/>
               </w:rPr>
-              <w:t xml:space="preserve">14 </w:t>
+              <w:t>14 point</w:t>
             </w:r>
-            <w:proofErr w:type="gramStart"/>
-            <w:r>
-              <w:rPr>
-                <w:lang w:val="en-GB"/>
-              </w:rPr>
-              <w:t>point</w:t>
-            </w:r>
-            <w:proofErr w:type="gramEnd"/>
           </w:p>
         </w:tc>
         <w:tc>
@@ -1743,12 +1539,11 @@
         </w:tc>
       </w:tr>
       <w:tr>
-        <w:trPr>
-          <w:jc w:val="center"/>
-        </w:trPr>
+        <w:trPr/>
         <w:tc>
           <w:tcPr>
             <w:tcW w:w="2268" w:type="dxa"/>
+            <w:tcBorders/>
           </w:tcPr>
           <w:p>
             <w:pPr>
@@ -1768,6 +1563,7 @@
         <w:tc>
           <w:tcPr>
             <w:tcW w:w="1132" w:type="dxa"/>
+            <w:tcBorders/>
           </w:tcPr>
           <w:p>
             <w:pPr>
@@ -1780,21 +1576,14 @@
               <w:rPr>
                 <w:lang w:val="en-GB"/>
               </w:rPr>
-              <w:t xml:space="preserve">12 </w:t>
+              <w:t>12 point</w:t>
             </w:r>
-            <w:proofErr w:type="gramStart"/>
-            <w:r>
-              <w:rPr>
-                <w:lang w:val="en-GB"/>
-              </w:rPr>
-              <w:t>point</w:t>
-            </w:r>
-            <w:proofErr w:type="gramEnd"/>
           </w:p>
         </w:tc>
         <w:tc>
           <w:tcPr>
             <w:tcW w:w="706" w:type="dxa"/>
+            <w:tcBorders/>
           </w:tcPr>
           <w:p>
             <w:pPr>
@@ -1803,16 +1592,20 @@
                 <w:lang w:val="en-GB"/>
               </w:rPr>
             </w:pPr>
+            <w:r>
+              <w:rPr>
+                <w:lang w:val="en-GB"/>
+              </w:rPr>
+            </w:r>
           </w:p>
         </w:tc>
       </w:tr>
       <w:tr>
-        <w:trPr>
-          <w:jc w:val="center"/>
-        </w:trPr>
+        <w:trPr/>
         <w:tc>
           <w:tcPr>
             <w:tcW w:w="2268" w:type="dxa"/>
+            <w:tcBorders/>
           </w:tcPr>
           <w:p>
             <w:pPr>
@@ -1832,6 +1625,7 @@
         <w:tc>
           <w:tcPr>
             <w:tcW w:w="1132" w:type="dxa"/>
+            <w:tcBorders/>
           </w:tcPr>
           <w:p>
             <w:pPr>
@@ -1844,21 +1638,14 @@
               <w:rPr>
                 <w:lang w:val="en-GB"/>
               </w:rPr>
-              <w:t xml:space="preserve">11 </w:t>
+              <w:t>11 point</w:t>
             </w:r>
-            <w:proofErr w:type="gramStart"/>
-            <w:r>
-              <w:rPr>
-                <w:lang w:val="en-GB"/>
-              </w:rPr>
-              <w:t>point</w:t>
-            </w:r>
-            <w:proofErr w:type="gramEnd"/>
           </w:p>
         </w:tc>
         <w:tc>
           <w:tcPr>
             <w:tcW w:w="706" w:type="dxa"/>
+            <w:tcBorders/>
           </w:tcPr>
           <w:p>
             <w:pPr>
@@ -1877,12 +1664,11 @@
         </w:tc>
       </w:tr>
       <w:tr>
-        <w:trPr>
-          <w:jc w:val="center"/>
-        </w:trPr>
+        <w:trPr/>
         <w:tc>
           <w:tcPr>
             <w:tcW w:w="2268" w:type="dxa"/>
+            <w:tcBorders/>
           </w:tcPr>
           <w:p>
             <w:pPr>
@@ -1902,6 +1688,7 @@
         <w:tc>
           <w:tcPr>
             <w:tcW w:w="1132" w:type="dxa"/>
+            <w:tcBorders/>
           </w:tcPr>
           <w:p>
             <w:pPr>
@@ -1914,21 +1701,14 @@
               <w:rPr>
                 <w:lang w:val="en-GB"/>
               </w:rPr>
-              <w:t xml:space="preserve">12 </w:t>
+              <w:t>12 point</w:t>
             </w:r>
-            <w:proofErr w:type="gramStart"/>
-            <w:r>
-              <w:rPr>
-                <w:lang w:val="en-GB"/>
-              </w:rPr>
-              <w:t>point</w:t>
-            </w:r>
-            <w:proofErr w:type="gramEnd"/>
           </w:p>
         </w:tc>
         <w:tc>
           <w:tcPr>
             <w:tcW w:w="706" w:type="dxa"/>
+            <w:tcBorders/>
           </w:tcPr>
           <w:p>
             <w:pPr>
@@ -1947,12 +1727,11 @@
         </w:tc>
       </w:tr>
       <w:tr>
-        <w:trPr>
-          <w:jc w:val="center"/>
-        </w:trPr>
+        <w:trPr/>
         <w:tc>
           <w:tcPr>
             <w:tcW w:w="2268" w:type="dxa"/>
+            <w:tcBorders/>
           </w:tcPr>
           <w:p>
             <w:pPr>
@@ -1972,6 +1751,7 @@
         <w:tc>
           <w:tcPr>
             <w:tcW w:w="1132" w:type="dxa"/>
+            <w:tcBorders/>
           </w:tcPr>
           <w:p>
             <w:pPr>
@@ -1984,21 +1764,14 @@
               <w:rPr>
                 <w:lang w:val="en-GB"/>
               </w:rPr>
-              <w:t xml:space="preserve">10 </w:t>
+              <w:t>10 point</w:t>
             </w:r>
-            <w:proofErr w:type="gramStart"/>
-            <w:r>
-              <w:rPr>
-                <w:lang w:val="en-GB"/>
-              </w:rPr>
-              <w:t>point</w:t>
-            </w:r>
-            <w:proofErr w:type="gramEnd"/>
           </w:p>
         </w:tc>
         <w:tc>
           <w:tcPr>
             <w:tcW w:w="706" w:type="dxa"/>
+            <w:tcBorders/>
           </w:tcPr>
           <w:p>
             <w:pPr>
@@ -2017,12 +1790,11 @@
         </w:tc>
       </w:tr>
       <w:tr>
-        <w:trPr>
-          <w:jc w:val="center"/>
-        </w:trPr>
+        <w:trPr/>
         <w:tc>
           <w:tcPr>
             <w:tcW w:w="2268" w:type="dxa"/>
+            <w:tcBorders/>
           </w:tcPr>
           <w:p>
             <w:pPr>
@@ -2042,6 +1814,7 @@
         <w:tc>
           <w:tcPr>
             <w:tcW w:w="1132" w:type="dxa"/>
+            <w:tcBorders/>
           </w:tcPr>
           <w:p>
             <w:pPr>
@@ -2054,21 +1827,14 @@
               <w:rPr>
                 <w:lang w:val="en-GB"/>
               </w:rPr>
-              <w:t xml:space="preserve">9 </w:t>
+              <w:t>9 point</w:t>
             </w:r>
-            <w:proofErr w:type="gramStart"/>
-            <w:r>
-              <w:rPr>
-                <w:lang w:val="en-GB"/>
-              </w:rPr>
-              <w:t>point</w:t>
-            </w:r>
-            <w:proofErr w:type="gramEnd"/>
           </w:p>
         </w:tc>
         <w:tc>
           <w:tcPr>
             <w:tcW w:w="706" w:type="dxa"/>
+            <w:tcBorders/>
           </w:tcPr>
           <w:p>
             <w:pPr>
@@ -2087,9 +1853,7 @@
         </w:tc>
       </w:tr>
       <w:tr>
-        <w:trPr>
-          <w:jc w:val="center"/>
-        </w:trPr>
+        <w:trPr/>
         <w:tc>
           <w:tcPr>
             <w:tcW w:w="2268" w:type="dxa"/>
@@ -2108,7 +1872,6 @@
               <w:rPr>
                 <w:lang w:val="en-GB"/>
               </w:rPr>
-              <w:lastRenderedPageBreak/>
               <w:t>All other text</w:t>
             </w:r>
           </w:p>
@@ -2123,21 +1886,14 @@
           <w:p>
             <w:pPr>
               <w:pStyle w:val="Table"/>
+              <w:rPr/>
             </w:pPr>
             <w:r>
               <w:rPr>
                 <w:lang w:val="en-GB"/>
               </w:rPr>
-              <w:t xml:space="preserve">10 </w:t>
+              <w:t>10 point</w:t>
             </w:r>
-            <w:proofErr w:type="gramStart"/>
-            <w:r>
-              <w:rPr>
-                <w:lang w:val="en-GB"/>
-              </w:rPr>
-              <w:t>point</w:t>
-            </w:r>
-            <w:proofErr w:type="gramEnd"/>
           </w:p>
         </w:tc>
         <w:tc>
@@ -2150,28 +1906,50 @@
           <w:p>
             <w:pPr>
               <w:pStyle w:val="Table"/>
-              <w:keepNext/>
+              <w:keepNext w:val="true"/>
+              <w:rPr/>
             </w:pPr>
+            <w:r>
+              <w:rPr/>
+            </w:r>
           </w:p>
         </w:tc>
       </w:tr>
     </w:tbl>
     <w:p>
       <w:pPr>
+        <w:pStyle w:val="Normal"/>
         <w:jc w:val="center"/>
         <w:rPr>
           <w:lang w:val="en-GB"/>
         </w:rPr>
       </w:pPr>
       <w:r>
+        <w:rPr/>
         <w:t xml:space="preserve">Table </w:t>
       </w:r>
-      <w:fldSimple w:instr=" SEQ Table \* ARABIC ">
-        <w:r>
-          <w:t>1</w:t>
-        </w:r>
-      </w:fldSimple>
-      <w:r>
+      <w:r>
+        <w:rPr/>
+        <w:fldChar w:fldCharType="begin"/>
+      </w:r>
+      <w:r>
+        <w:rPr/>
+        <w:instrText xml:space="preserve"> SEQ Table \* ARABIC </w:instrText>
+      </w:r>
+      <w:r>
+        <w:rPr/>
+        <w:fldChar w:fldCharType="separate"/>
+      </w:r>
+      <w:r>
+        <w:rPr/>
+        <w:t>1</w:t>
+      </w:r>
+      <w:r>
+        <w:rPr/>
+        <w:fldChar w:fldCharType="end"/>
+      </w:r>
+      <w:r>
+        <w:rPr/>
         <w:t xml:space="preserve">.  </w:t>
       </w:r>
       <w:r>
@@ -2183,8 +1961,13 @@
     </w:p>
     <w:p>
       <w:pPr>
-        <w:ind w:firstLine="0"/>
-      </w:pPr>
+        <w:pStyle w:val="Normal"/>
+        <w:ind w:hanging="0"/>
+        <w:rPr/>
+      </w:pPr>
+      <w:r>
+        <w:rPr/>
+      </w:r>
     </w:p>
     <w:p>
       <w:pPr>
@@ -2192,99 +1975,187 @@
         <w:tabs>
           <w:tab w:val="clear" w:pos="720"/>
         </w:tabs>
-      </w:pPr>
-      <w:r>
+        <w:rPr/>
+      </w:pPr>
+      <w:r>
+        <w:rPr/>
         <w:t>3.</w:t>
-      </w:r>
-      <w:r>
         <w:tab/>
         <w:t>Results</w:t>
       </w:r>
     </w:p>
     <w:p>
       <w:pPr>
+        <w:pStyle w:val="Normal"/>
         <w:ind w:firstLine="224"/>
-      </w:pPr>
-      <w:r>
+        <w:rPr/>
+      </w:pPr>
+      <w:r>
+        <w:rPr/>
         <w:t xml:space="preserve">Present your results here. We expect this to take approximately one half to one page. Remember to report the Challenge scores (weighted accuracy metric for the murmur detection task, and cost for the clinical outcome identification task) on the training, validation, and test sets. The scores that you receive from us before the conference use the hid- den validation set, and the scores that you receive from us after the conference use the hidden test set. You can use other metrics to provide insight into your method, but you should clearly report the Challenge scores. </w:t>
       </w:r>
     </w:p>
     <w:p>
       <w:pPr>
+        <w:pStyle w:val="Normal"/>
         <w:ind w:firstLine="224"/>
-      </w:pPr>
-      <w:r>
+        <w:rPr/>
+      </w:pPr>
+      <w:r>
+        <w:rPr/>
         <w:t xml:space="preserve">You should include a table (see Tables 2) to summarize your results. Follow the guidelines detailed in the methods. Comparing your results to others in the field is important, and this should be updated after the final scores are released. Please do not change the format of the table, which allows your readers to easily compare your results with other papers. </w:t>
       </w:r>
     </w:p>
     <w:p>
       <w:pPr>
+        <w:pStyle w:val="Normal"/>
         <w:ind w:firstLine="224"/>
-      </w:pPr>
-      <w:r>
+        <w:rPr/>
+      </w:pPr>
+      <w:r>
+        <w:rPr/>
         <w:t xml:space="preserve">Do not discuss your results here – save interpretation for the next section. </w:t>
+      </w:r>
+    </w:p>
+    <w:p>
+      <w:pPr>
+        <w:pStyle w:val="Normal"/>
+        <w:ind w:firstLine="224"/>
+        <w:rPr/>
+      </w:pPr>
+      <w:r>
+        <w:rPr/>
       </w:r>
     </w:p>
     <w:tbl>
       <w:tblPr>
-        <w:tblW w:w="4140" w:type="dxa"/>
+        <w:tblW w:w="4666" w:type="dxa"/>
         <w:jc w:val="center"/>
+        <w:tblInd w:w="0" w:type="dxa"/>
         <w:tblLayout w:type="fixed"/>
-        <w:tblLook w:val="0020" w:firstRow="1" w:lastRow="0" w:firstColumn="0" w:lastColumn="0" w:noHBand="0" w:noVBand="0"/>
+        <w:tblCellMar>
+          <w:top w:w="0" w:type="dxa"/>
+          <w:start w:w="108" w:type="dxa"/>
+          <w:bottom w:w="0" w:type="dxa"/>
+          <w:end w:w="108" w:type="dxa"/>
+        </w:tblCellMar>
+        <w:tblLook w:val="0020" w:noHBand="0" w:noVBand="0" w:firstColumn="0" w:lastRow="0" w:lastColumn="0" w:firstRow="1"/>
       </w:tblPr>
       <w:tblGrid>
-        <w:gridCol w:w="1350"/>
-        <w:gridCol w:w="1085"/>
-        <w:gridCol w:w="807"/>
-        <w:gridCol w:w="898"/>
+        <w:gridCol w:w="779"/>
+        <w:gridCol w:w="757"/>
+        <w:gridCol w:w="756"/>
+        <w:gridCol w:w="965"/>
+        <w:gridCol w:w="632"/>
+        <w:gridCol w:w="777"/>
       </w:tblGrid>
       <w:tr>
-        <w:trPr>
-          <w:jc w:val="center"/>
-        </w:trPr>
+        <w:trPr/>
         <w:tc>
           <w:tcPr>
-            <w:tcW w:w="1350" w:type="dxa"/>
+            <w:tcW w:w="779" w:type="dxa"/>
             <w:tcBorders>
               <w:bottom w:val="single" w:sz="6" w:space="0" w:color="808080"/>
-              <w:right w:val="single" w:sz="4" w:space="0" w:color="000000"/>
             </w:tcBorders>
           </w:tcPr>
           <w:p>
             <w:pPr>
               <w:pStyle w:val="Table"/>
-              <w:jc w:val="right"/>
-              <w:rPr>
-                <w:lang w:val="en-GB"/>
+              <w:jc w:val="end"/>
+              <w:rPr>
+                <w:sz w:val="16"/>
+                <w:szCs w:val="16"/>
               </w:rPr>
             </w:pPr>
             <w:r>
               <w:rPr>
-                <w:lang w:val="en-GB"/>
-              </w:rPr>
-              <w:t>Training</w:t>
+                <w:sz w:val="16"/>
+                <w:szCs w:val="16"/>
+                <w:lang w:val="en-GB"/>
+              </w:rPr>
+              <w:t>I0002</w:t>
             </w:r>
           </w:p>
         </w:tc>
         <w:tc>
           <w:tcPr>
-            <w:tcW w:w="1085" w:type="dxa"/>
+            <w:tcW w:w="757" w:type="dxa"/>
             <w:tcBorders>
-              <w:left w:val="single" w:sz="4" w:space="0" w:color="000000"/>
+              <w:start w:val="single" w:sz="4" w:space="0" w:color="000000"/>
               <w:bottom w:val="single" w:sz="6" w:space="0" w:color="808080"/>
-              <w:right w:val="single" w:sz="4" w:space="0" w:color="000000"/>
             </w:tcBorders>
           </w:tcPr>
           <w:p>
             <w:pPr>
               <w:pStyle w:val="Table"/>
-              <w:jc w:val="right"/>
-              <w:rPr>
+              <w:jc w:val="end"/>
+              <w:rPr>
+                <w:sz w:val="16"/>
+                <w:szCs w:val="16"/>
                 <w:lang w:val="en-GB"/>
               </w:rPr>
             </w:pPr>
             <w:r>
               <w:rPr>
+                <w:sz w:val="16"/>
+                <w:szCs w:val="16"/>
+                <w:lang w:val="en-GB"/>
+              </w:rPr>
+              <w:t>I0006</w:t>
+            </w:r>
+          </w:p>
+        </w:tc>
+        <w:tc>
+          <w:tcPr>
+            <w:tcW w:w="756" w:type="dxa"/>
+            <w:tcBorders>
+              <w:start w:val="single" w:sz="4" w:space="0" w:color="000000"/>
+              <w:bottom w:val="single" w:sz="6" w:space="0" w:color="808080"/>
+              <w:end w:val="single" w:sz="4" w:space="0" w:color="000000"/>
+            </w:tcBorders>
+          </w:tcPr>
+          <w:p>
+            <w:pPr>
+              <w:pStyle w:val="Table"/>
+              <w:jc w:val="end"/>
+              <w:rPr>
+                <w:sz w:val="16"/>
+                <w:szCs w:val="16"/>
+                <w:lang w:val="en-GB"/>
+              </w:rPr>
+            </w:pPr>
+            <w:r>
+              <w:rPr>
+                <w:sz w:val="16"/>
+                <w:szCs w:val="16"/>
+                <w:lang w:val="en-GB"/>
+              </w:rPr>
+              <w:t>S0001</w:t>
+            </w:r>
+          </w:p>
+        </w:tc>
+        <w:tc>
+          <w:tcPr>
+            <w:tcW w:w="965" w:type="dxa"/>
+            <w:tcBorders>
+              <w:start w:val="single" w:sz="4" w:space="0" w:color="000000"/>
+              <w:bottom w:val="single" w:sz="6" w:space="0" w:color="808080"/>
+              <w:end w:val="single" w:sz="4" w:space="0" w:color="000000"/>
+            </w:tcBorders>
+          </w:tcPr>
+          <w:p>
+            <w:pPr>
+              <w:pStyle w:val="Table"/>
+              <w:jc w:val="end"/>
+              <w:rPr>
+                <w:sz w:val="16"/>
+                <w:szCs w:val="16"/>
+              </w:rPr>
+            </w:pPr>
+            <w:r>
+              <w:rPr>
+                <w:sz w:val="16"/>
+                <w:szCs w:val="16"/>
                 <w:lang w:val="en-GB"/>
               </w:rPr>
               <w:t>Validation</w:t>
@@ -2293,23 +2164,26 @@
         </w:tc>
         <w:tc>
           <w:tcPr>
-            <w:tcW w:w="807" w:type="dxa"/>
+            <w:tcW w:w="632" w:type="dxa"/>
             <w:tcBorders>
-              <w:left w:val="single" w:sz="4" w:space="0" w:color="000000"/>
+              <w:start w:val="single" w:sz="4" w:space="0" w:color="000000"/>
               <w:bottom w:val="single" w:sz="6" w:space="0" w:color="808080"/>
-              <w:right w:val="single" w:sz="4" w:space="0" w:color="000000"/>
+              <w:end w:val="single" w:sz="4" w:space="0" w:color="000000"/>
             </w:tcBorders>
           </w:tcPr>
           <w:p>
             <w:pPr>
               <w:pStyle w:val="Table"/>
-              <w:jc w:val="right"/>
-              <w:rPr>
-                <w:lang w:val="en-GB"/>
+              <w:jc w:val="end"/>
+              <w:rPr>
+                <w:sz w:val="16"/>
+                <w:szCs w:val="16"/>
               </w:rPr>
             </w:pPr>
             <w:r>
               <w:rPr>
+                <w:sz w:val="16"/>
+                <w:szCs w:val="16"/>
                 <w:lang w:val="en-GB"/>
               </w:rPr>
               <w:t>Test</w:t>
@@ -2318,22 +2192,25 @@
         </w:tc>
         <w:tc>
           <w:tcPr>
-            <w:tcW w:w="898" w:type="dxa"/>
+            <w:tcW w:w="777" w:type="dxa"/>
             <w:tcBorders>
-              <w:left w:val="single" w:sz="4" w:space="0" w:color="000000"/>
+              <w:start w:val="single" w:sz="4" w:space="0" w:color="000000"/>
               <w:bottom w:val="single" w:sz="6" w:space="0" w:color="808080"/>
             </w:tcBorders>
           </w:tcPr>
           <w:p>
             <w:pPr>
               <w:pStyle w:val="Table"/>
-              <w:jc w:val="right"/>
-              <w:rPr>
-                <w:lang w:val="en-GB"/>
+              <w:jc w:val="end"/>
+              <w:rPr>
+                <w:sz w:val="16"/>
+                <w:szCs w:val="16"/>
               </w:rPr>
             </w:pPr>
             <w:r>
               <w:rPr>
+                <w:sz w:val="16"/>
+                <w:szCs w:val="16"/>
                 <w:lang w:val="en-GB"/>
               </w:rPr>
               <w:t>Ranking</w:t>
@@ -2342,52 +2219,112 @@
         </w:tc>
       </w:tr>
       <w:tr>
-        <w:trPr>
-          <w:jc w:val="center"/>
-        </w:trPr>
+        <w:trPr/>
         <w:tc>
           <w:tcPr>
-            <w:tcW w:w="1350" w:type="dxa"/>
+            <w:tcW w:w="779" w:type="dxa"/>
             <w:tcBorders>
               <w:bottom w:val="single" w:sz="12" w:space="0" w:color="808080"/>
-              <w:right w:val="single" w:sz="4" w:space="0" w:color="000000"/>
             </w:tcBorders>
           </w:tcPr>
           <w:p>
             <w:pPr>
               <w:pStyle w:val="Table"/>
-              <w:jc w:val="right"/>
-              <w:rPr>
-                <w:lang w:val="en-GB"/>
+              <w:jc w:val="end"/>
+              <w:rPr>
+                <w:sz w:val="16"/>
+                <w:szCs w:val="16"/>
               </w:rPr>
             </w:pPr>
             <w:r>
               <w:rPr>
-                <w:lang w:val="en-GB"/>
-              </w:rPr>
-              <w:t>0.654±0.0321</w:t>
+                <w:sz w:val="16"/>
+                <w:szCs w:val="16"/>
+                <w:lang w:val="en-GB"/>
+              </w:rPr>
+              <w:t>0.475</w:t>
             </w:r>
           </w:p>
         </w:tc>
         <w:tc>
           <w:tcPr>
-            <w:tcW w:w="1085" w:type="dxa"/>
+            <w:tcW w:w="757" w:type="dxa"/>
             <w:tcBorders>
-              <w:left w:val="single" w:sz="4" w:space="0" w:color="000000"/>
+              <w:start w:val="single" w:sz="4" w:space="0" w:color="000000"/>
               <w:bottom w:val="single" w:sz="12" w:space="0" w:color="808080"/>
-              <w:right w:val="single" w:sz="4" w:space="0" w:color="000000"/>
             </w:tcBorders>
           </w:tcPr>
           <w:p>
             <w:pPr>
               <w:pStyle w:val="Table"/>
-              <w:jc w:val="right"/>
-              <w:rPr>
+              <w:jc w:val="end"/>
+              <w:rPr>
+                <w:sz w:val="16"/>
+                <w:szCs w:val="16"/>
                 <w:lang w:val="en-GB"/>
               </w:rPr>
             </w:pPr>
             <w:r>
               <w:rPr>
+                <w:sz w:val="16"/>
+                <w:szCs w:val="16"/>
+                <w:lang w:val="en-GB"/>
+              </w:rPr>
+              <w:t>0.512</w:t>
+            </w:r>
+          </w:p>
+        </w:tc>
+        <w:tc>
+          <w:tcPr>
+            <w:tcW w:w="756" w:type="dxa"/>
+            <w:tcBorders>
+              <w:start w:val="single" w:sz="4" w:space="0" w:color="000000"/>
+              <w:bottom w:val="single" w:sz="12" w:space="0" w:color="808080"/>
+              <w:end w:val="single" w:sz="4" w:space="0" w:color="000000"/>
+            </w:tcBorders>
+          </w:tcPr>
+          <w:p>
+            <w:pPr>
+              <w:pStyle w:val="Table"/>
+              <w:jc w:val="end"/>
+              <w:rPr>
+                <w:sz w:val="16"/>
+                <w:szCs w:val="16"/>
+                <w:lang w:val="en-GB"/>
+              </w:rPr>
+            </w:pPr>
+            <w:r>
+              <w:rPr>
+                <w:sz w:val="16"/>
+                <w:szCs w:val="16"/>
+                <w:lang w:val="en-GB"/>
+              </w:rPr>
+              <w:t>0.987</w:t>
+            </w:r>
+          </w:p>
+        </w:tc>
+        <w:tc>
+          <w:tcPr>
+            <w:tcW w:w="965" w:type="dxa"/>
+            <w:tcBorders>
+              <w:start w:val="single" w:sz="4" w:space="0" w:color="000000"/>
+              <w:bottom w:val="single" w:sz="12" w:space="0" w:color="808080"/>
+              <w:end w:val="single" w:sz="4" w:space="0" w:color="000000"/>
+            </w:tcBorders>
+          </w:tcPr>
+          <w:p>
+            <w:pPr>
+              <w:pStyle w:val="Table"/>
+              <w:jc w:val="end"/>
+              <w:rPr>
+                <w:sz w:val="16"/>
+                <w:szCs w:val="16"/>
+              </w:rPr>
+            </w:pPr>
+            <w:r>
+              <w:rPr>
+                <w:sz w:val="16"/>
+                <w:szCs w:val="16"/>
                 <w:lang w:val="en-GB"/>
               </w:rPr>
               <w:t>0.678</w:t>
@@ -2396,23 +2333,26 @@
         </w:tc>
         <w:tc>
           <w:tcPr>
-            <w:tcW w:w="807" w:type="dxa"/>
+            <w:tcW w:w="632" w:type="dxa"/>
             <w:tcBorders>
-              <w:left w:val="single" w:sz="4" w:space="0" w:color="000000"/>
+              <w:start w:val="single" w:sz="4" w:space="0" w:color="000000"/>
               <w:bottom w:val="single" w:sz="12" w:space="0" w:color="808080"/>
-              <w:right w:val="single" w:sz="4" w:space="0" w:color="000000"/>
+              <w:end w:val="single" w:sz="4" w:space="0" w:color="000000"/>
             </w:tcBorders>
           </w:tcPr>
           <w:p>
             <w:pPr>
               <w:pStyle w:val="Table"/>
-              <w:jc w:val="right"/>
-              <w:rPr>
-                <w:lang w:val="en-GB"/>
+              <w:jc w:val="end"/>
+              <w:rPr>
+                <w:sz w:val="16"/>
+                <w:szCs w:val="16"/>
               </w:rPr>
             </w:pPr>
             <w:r>
               <w:rPr>
+                <w:sz w:val="16"/>
+                <w:szCs w:val="16"/>
                 <w:lang w:val="en-GB"/>
               </w:rPr>
               <w:t>0.596</w:t>
@@ -2421,23 +2361,26 @@
         </w:tc>
         <w:tc>
           <w:tcPr>
-            <w:tcW w:w="898" w:type="dxa"/>
+            <w:tcW w:w="777" w:type="dxa"/>
             <w:tcBorders>
-              <w:left w:val="single" w:sz="4" w:space="0" w:color="000000"/>
+              <w:start w:val="single" w:sz="4" w:space="0" w:color="000000"/>
               <w:bottom w:val="single" w:sz="12" w:space="0" w:color="808080"/>
             </w:tcBorders>
           </w:tcPr>
           <w:p>
             <w:pPr>
               <w:pStyle w:val="Table"/>
-              <w:keepNext/>
-              <w:jc w:val="right"/>
-              <w:rPr>
-                <w:lang w:val="en-GB"/>
+              <w:keepNext w:val="true"/>
+              <w:jc w:val="end"/>
+              <w:rPr>
+                <w:sz w:val="16"/>
+                <w:szCs w:val="16"/>
               </w:rPr>
             </w:pPr>
             <w:r>
               <w:rPr>
+                <w:sz w:val="16"/>
+                <w:szCs w:val="16"/>
                 <w:lang w:val="en-GB"/>
               </w:rPr>
               <w:t>20/50</w:t>
@@ -2449,11 +2392,11 @@
     <w:p>
       <w:pPr>
         <w:pStyle w:val="Caption"/>
-        <w:ind w:firstLine="0"/>
-        <w:rPr>
-          <w:i w:val="0"/>
-          <w:iCs w:val="0"/>
-          <w:color w:val="000000" w:themeColor="text1"/>
+        <w:ind w:hanging="0"/>
+        <w:rPr>
+          <w:i w:val="false"/>
+          <w:iCs w:val="false"/>
+          <w:color w:themeColor="text1" w:val="000000"/>
           <w:sz w:val="20"/>
           <w:szCs w:val="20"/>
           <w:lang w:val="en-GB"/>
@@ -2461,9 +2404,9 @@
       </w:pPr>
       <w:r>
         <w:rPr>
-          <w:i w:val="0"/>
-          <w:iCs w:val="0"/>
-          <w:color w:val="000000" w:themeColor="text1"/>
+          <w:i w:val="false"/>
+          <w:iCs w:val="false"/>
+          <w:color w:themeColor="text1" w:val="000000"/>
           <w:sz w:val="20"/>
           <w:szCs w:val="20"/>
         </w:rPr>
@@ -2471,9 +2414,9 @@
       </w:r>
       <w:r>
         <w:rPr>
-          <w:i w:val="0"/>
-          <w:iCs w:val="0"/>
-          <w:color w:val="000000" w:themeColor="text1"/>
+          <w:i w:val="false"/>
+          <w:iCs w:val="false"/>
+          <w:color w:themeColor="text1" w:val="000000"/>
           <w:sz w:val="20"/>
           <w:szCs w:val="20"/>
           <w:lang w:val="en-GB"/>
@@ -2484,25 +2427,29 @@
     <w:p>
       <w:pPr>
         <w:pStyle w:val="Heading"/>
-      </w:pPr>
-      <w:r>
+        <w:rPr/>
+      </w:pPr>
+      <w:r>
+        <w:rPr/>
         <w:t>4.</w:t>
-      </w:r>
-      <w:r>
         <w:tab/>
         <w:t>Discussion and Conclusions</w:t>
       </w:r>
     </w:p>
     <w:p>
       <w:pPr>
+        <w:pStyle w:val="Normal"/>
         <w:ind w:firstLine="224"/>
-      </w:pPr>
-      <w:r>
+        <w:rPr/>
+      </w:pPr>
+      <w:r>
+        <w:rPr/>
         <w:t xml:space="preserve">This section can be two separate sections or one combined section. We expect this to take up one half to one page, with the references taking the remainder of the article’s four-page limit. </w:t>
       </w:r>
     </w:p>
     <w:p>
       <w:pPr>
+        <w:pStyle w:val="Normal"/>
         <w:ind w:firstLine="224"/>
         <w:rPr>
           <w:lang w:val="en-GB"/>
@@ -2517,6 +2464,7 @@
     </w:p>
     <w:p>
       <w:pPr>
+        <w:pStyle w:val="Normal"/>
         <w:ind w:firstLine="224"/>
         <w:rPr>
           <w:lang w:val="en-GB"/>
@@ -2531,6 +2479,7 @@
     </w:p>
     <w:p>
       <w:pPr>
+        <w:pStyle w:val="Normal"/>
         <w:ind w:firstLine="224"/>
         <w:rPr>
           <w:lang w:val="en-GB"/>
@@ -2545,6 +2494,7 @@
     </w:p>
     <w:p>
       <w:pPr>
+        <w:pStyle w:val="Normal"/>
         <w:ind w:firstLine="224"/>
         <w:rPr>
           <w:lang w:val="en-GB"/>
@@ -2554,17 +2504,12 @@
         <w:rPr>
           <w:lang w:val="en-GB"/>
         </w:rPr>
-        <w:t xml:space="preserve">This article has a limit of 4 pages, including the title, authors, abstract, acknowledgments, references, and an address for correspondence. If you have extra space, then </w:t>
-      </w:r>
-      <w:r>
-        <w:rPr>
-          <w:lang w:val="en-GB"/>
-        </w:rPr>
-        <w:t>we recommend that you add more detail to your methods. It should be easy to write more than 3 pages and difficult to write less than 4 pages.</w:t>
-      </w:r>
-    </w:p>
-    <w:p>
-      <w:pPr>
+        <w:t>This article has a limit of 4 pages, including the title, authors, abstract, acknowledgments, references, and an address for correspondence. If you have extra space, then we recommend that you add more detail to your methods. It should be easy to write more than 3 pages and difficult to write less than 4 pages.</w:t>
+      </w:r>
+    </w:p>
+    <w:p>
+      <w:pPr>
+        <w:pStyle w:val="Normal"/>
         <w:ind w:firstLine="224"/>
         <w:rPr>
           <w:lang w:val="en-GB"/>
@@ -2579,7 +2524,8 @@
     </w:p>
     <w:p>
       <w:pPr>
-        <w:spacing w:after="240"/>
+        <w:pStyle w:val="Normal"/>
+        <w:spacing w:before="0" w:after="240"/>
         <w:ind w:firstLine="224"/>
         <w:rPr>
           <w:lang w:val="en-GB"/>
@@ -2603,21 +2549,7 @@
         <w:rPr>
           <w:lang w:val="en-GB"/>
         </w:rPr>
-        <w:t xml:space="preserve"> carefully. Look for repetitions of the same article and capitalize all Journal Names Like This. (This is called ‘title case’.) Be sure that all abbreviations and names are capitalized. Be sure you have included the full references, including volume, issue, pages, etc. Look for errors in accents that have been introduced by copy and paste. Sloppy references make the reader think that your research is sloppy and will be rejected. Acceptance of your article is not guaranteed – it will be reviewed for </w:t>
-      </w:r>
-      <w:proofErr w:type="gramStart"/>
-      <w:r>
-        <w:rPr>
-          <w:lang w:val="en-GB"/>
-        </w:rPr>
-        <w:t>all of</w:t>
-      </w:r>
-      <w:proofErr w:type="gramEnd"/>
-      <w:r>
-        <w:rPr>
-          <w:lang w:val="en-GB"/>
-        </w:rPr>
-        <w:t xml:space="preserve"> the criteria specified in this document.</w:t>
+        <w:t xml:space="preserve"> carefully. Look for repetitions of the same article and capitalize all Journal Names Like This. (This is called ‘title case’.) Be sure that all abbreviations and names are capitalized. Be sure you have included the full references, including volume, issue, pages, etc. Look for errors in accents that have been introduced by copy and paste. Sloppy references make the reader think that your research is sloppy and will be rejected. Acceptance of your article is not guaranteed – it will be reviewed for all of the criteria specified in this document.</w:t>
       </w:r>
     </w:p>
     <w:p>
@@ -2626,31 +2558,44 @@
         <w:tabs>
           <w:tab w:val="clear" w:pos="720"/>
         </w:tabs>
-      </w:pPr>
-      <w:r>
+        <w:rPr/>
+      </w:pPr>
+      <w:r>
+        <w:rPr/>
         <w:t>Acknowledgments</w:t>
       </w:r>
     </w:p>
     <w:p>
       <w:pPr>
+        <w:pStyle w:val="Normal"/>
         <w:ind w:firstLine="224"/>
-      </w:pPr>
-      <w:r>
+        <w:rPr/>
+      </w:pPr>
+      <w:r>
+        <w:rPr/>
         <w:t xml:space="preserve">Provide any acknowledgments and conflicts of interest here. This section should include the official organization that funded you, if relevant, and anyone who contributed but not enough to gain authorship (e.g., those that provided advice, code, and non-Challenge data). </w:t>
       </w:r>
     </w:p>
     <w:p>
       <w:pPr>
+        <w:pStyle w:val="Normal"/>
         <w:ind w:firstLine="224"/>
-      </w:pPr>
-      <w:r>
+        <w:rPr/>
+      </w:pPr>
+      <w:r>
+        <w:rPr/>
         <w:t>Please do not thank the organizers of the Challenge or the providers of the Challenge data. A good paper is appreciation enough. We would rather that you added one useful line to the methods than thanked us!</w:t>
       </w:r>
     </w:p>
     <w:p>
       <w:pPr>
+        <w:pStyle w:val="Normal"/>
         <w:ind w:firstLine="224"/>
-      </w:pPr>
+        <w:rPr/>
+      </w:pPr>
+      <w:r>
+        <w:rPr/>
+      </w:r>
     </w:p>
     <w:p>
       <w:pPr>
@@ -2658,46 +2603,24 @@
         <w:tabs>
           <w:tab w:val="clear" w:pos="720"/>
         </w:tabs>
-      </w:pPr>
-      <w:r>
+        <w:rPr/>
+      </w:pPr>
+      <w:r>
+        <w:rPr/>
         <w:t>References</w:t>
       </w:r>
     </w:p>
     <w:p>
       <w:pPr>
         <w:pStyle w:val="Reference"/>
-        <w:jc w:val="left"/>
-      </w:pPr>
-      <w:r>
-        <w:t xml:space="preserve">[1] Goldberger AL, Amaral LA, Glass L, </w:t>
-      </w:r>
-      <w:proofErr w:type="spellStart"/>
-      <w:r>
-        <w:t>Hausdorff</w:t>
-      </w:r>
-      <w:proofErr w:type="spellEnd"/>
-      <w:r>
-        <w:t xml:space="preserve"> JM, Ivanov</w:t>
-      </w:r>
-      <w:r>
+        <w:jc w:val="start"/>
+        <w:rPr/>
+      </w:pPr>
+      <w:r>
+        <w:rPr/>
+        <w:t>[1] Goldberger AL, Amaral LA, Glass L, Hausdorff JM, Ivanov</w:t>
         <w:br/>
-        <w:t xml:space="preserve">PC, Mark RG, et al. </w:t>
-      </w:r>
-      <w:proofErr w:type="spellStart"/>
-      <w:r>
-        <w:t>PhysioBank</w:t>
-      </w:r>
-      <w:proofErr w:type="spellEnd"/>
-      <w:r>
-        <w:t xml:space="preserve">, </w:t>
-      </w:r>
-      <w:proofErr w:type="spellStart"/>
-      <w:r>
-        <w:t>PhysioToolkit</w:t>
-      </w:r>
-      <w:proofErr w:type="spellEnd"/>
-      <w:r>
-        <w:t xml:space="preserve">, and PhysioNet: Components of a New Research Resource for Complex Physiologic Signals. </w:t>
+        <w:t xml:space="preserve">PC, Mark RG, et al. PhysioBank, PhysioToolkit, and PhysioNet: Components of a New Research Resource for Complex Physiologic Signals. </w:t>
       </w:r>
       <w:r>
         <w:rPr>
@@ -2707,32 +2630,19 @@
         <w:t>Circulation</w:t>
       </w:r>
       <w:r>
-        <w:t xml:space="preserve"> 2000;101(23</w:t>
-      </w:r>
-      <w:proofErr w:type="gramStart"/>
-      <w:r>
-        <w:t>):e</w:t>
-      </w:r>
-      <w:proofErr w:type="gramEnd"/>
-      <w:r>
-        <w:t>215–e220.</w:t>
+        <w:rPr/>
+        <w:t xml:space="preserve"> 2000;101(23):e215–e220.</w:t>
       </w:r>
     </w:p>
     <w:p>
       <w:pPr>
         <w:pStyle w:val="Reference"/>
-        <w:jc w:val="left"/>
-      </w:pPr>
-      <w:r>
-        <w:t xml:space="preserve">[2] Reyna MA, Weigle A, Li Q, </w:t>
-      </w:r>
-      <w:proofErr w:type="spellStart"/>
-      <w:r>
-        <w:t>Koscova</w:t>
-      </w:r>
-      <w:proofErr w:type="spellEnd"/>
-      <w:r>
-        <w:t xml:space="preserve"> Z, Sun HS, Wen S, et al. Screening for Cognitive Impairment During Sleep Studies: The George B. Moody PhysioNet Challenge 2026. In </w:t>
+        <w:jc w:val="start"/>
+        <w:rPr/>
+      </w:pPr>
+      <w:r>
+        <w:rPr/>
+        <w:t xml:space="preserve">[2] Reyna MA, Weigle A, Li Q, Koscova Z, Sun HS, Wen S, et al. Screening for Cognitive Impairment During Sleep Studies: The George B. Moody PhysioNet Challenge 2026. In </w:t>
       </w:r>
       <w:r>
         <w:rPr>
@@ -2742,30 +2652,19 @@
         <w:t>Computing in Cardiology</w:t>
       </w:r>
       <w:r>
-        <w:t xml:space="preserve"> 2026, volume 53. 2026; 1–</w:t>
-      </w:r>
-      <w:r>
-        <w:t>4</w:t>
-      </w:r>
-      <w:r>
-        <w:t>.</w:t>
+        <w:rPr/>
+        <w:t xml:space="preserve"> 2026, volume 53. 2026; 1–4.</w:t>
       </w:r>
     </w:p>
     <w:p>
       <w:pPr>
         <w:pStyle w:val="Reference"/>
-        <w:jc w:val="left"/>
-      </w:pPr>
-      <w:r>
-        <w:t xml:space="preserve">[3] Li Q, Wen S, Sun H, </w:t>
-      </w:r>
-      <w:proofErr w:type="spellStart"/>
-      <w:r>
-        <w:t>Ganglberger</w:t>
-      </w:r>
-      <w:proofErr w:type="spellEnd"/>
-      <w:r>
-        <w:t xml:space="preserve"> W, Tripathi A, Turley N, et al. The Human Sleep Project: A multi-center clinical polysomnography dataset across the human lifespan. </w:t>
+        <w:jc w:val="start"/>
+        <w:rPr/>
+      </w:pPr>
+      <w:r>
+        <w:rPr/>
+        <w:t xml:space="preserve">[3] Li Q, Wen S, Sun H, Ganglberger W, Tripathi A, Turley N, et al. The Human Sleep Project: A multi-center clinical polysomnography dataset across the human lifespan. </w:t>
       </w:r>
       <w:r>
         <w:rPr>
@@ -2775,9 +2674,10 @@
         <w:t>Sleep</w:t>
       </w:r>
       <w:r>
+        <w:rPr/>
         <w:t xml:space="preserve"> 08 2026; zsag215. ISSN 0161-8105. URL </w:t>
       </w:r>
-      <w:hyperlink r:id="rId9">
+      <w:hyperlink r:id="rId4">
         <w:r>
           <w:rPr>
             <w:rStyle w:val="Hyperlink"/>
@@ -2786,14 +2686,17 @@
         </w:r>
       </w:hyperlink>
       <w:r>
+        <w:rPr/>
         <w:t>.</w:t>
       </w:r>
     </w:p>
     <w:p>
       <w:pPr>
         <w:pStyle w:val="Reference"/>
-      </w:pPr>
-      <w:r>
+        <w:rPr/>
+      </w:pPr>
+      <w:r>
+        <w:rPr/>
         <w:t xml:space="preserve">. </w:t>
       </w:r>
     </w:p>
@@ -2818,79 +2721,75 @@
           <w:lang w:val="en-US"/>
         </w:rPr>
       </w:pPr>
+      <w:r>
+        <w:rPr>
+          <w:lang w:val="en-US"/>
+        </w:rPr>
+      </w:r>
     </w:p>
     <w:p>
       <w:pPr>
         <w:pStyle w:val="AddressforCorrespondence"/>
-      </w:pPr>
-      <w:r>
+        <w:rPr/>
+      </w:pPr>
+      <w:r>
+        <w:rPr/>
         <w:t>Eve L Knievel</w:t>
       </w:r>
     </w:p>
     <w:p>
       <w:pPr>
         <w:pStyle w:val="AddressforCorrespondence"/>
-      </w:pPr>
-      <w:r>
+        <w:rPr/>
+      </w:pPr>
+      <w:r>
+        <w:rPr/>
         <w:t>123 Main Street, Any Town, Any State/Province, Any Country</w:t>
       </w:r>
     </w:p>
     <w:p>
       <w:pPr>
         <w:pStyle w:val="AddressforCorrespondence"/>
-      </w:pPr>
-      <w:r>
+        <w:rPr/>
+      </w:pPr>
+      <w:r>
+        <w:rPr/>
         <w:t>eve@example.com</w:t>
       </w:r>
     </w:p>
     <w:sectPr>
+      <w:footnotePr>
+        <w:numFmt w:val="decimal"/>
+      </w:footnotePr>
       <w:type w:val="continuous"/>
       <w:pgSz w:w="12240" w:h="15840"/>
-      <w:pgMar w:top="1440" w:right="1224" w:bottom="1440" w:left="1224" w:header="0" w:footer="0" w:gutter="0"/>
-      <w:cols w:num="2" w:space="460"/>
-      <w:formProt w:val="0"/>
-      <w:docGrid w:linePitch="100"/>
+      <w:pgMar w:left="1224" w:right="1224" w:gutter="0" w:header="0" w:top="1440" w:footer="0" w:bottom="1440"/>
+      <w:cols w:num="2" w:space="460" w:equalWidth="true" w:sep="false"/>
+      <w:formProt w:val="false"/>
+      <w:textDirection w:val="lrTb"/>
+      <w:docGrid w:type="default" w:linePitch="100" w:charSpace="0"/>
     </w:sectPr>
   </w:body>
 </w:document>
 </file>
 
-<file path=word/endnotes.xml><?xml version="1.0" encoding="utf-8"?>
-<w:endnotes xmlns:wpc="http://schemas.microsoft.com/office/word/2010/wordprocessingCanvas" xmlns:cx="http://schemas.microsoft.com/office/drawing/2014/chartex" xmlns:cx1="http://schemas.microsoft.com/office/drawing/2015/9/8/chartex" xmlns:cx2="http://schemas.microsoft.com/office/drawing/2015/10/21/chartex" xmlns:cx3="http://schemas.microsoft.com/office/drawing/2016/5/9/chartex" xmlns:cx4="http://schemas.microsoft.com/office/drawing/2016/5/10/chartex" xmlns:cx5="http://schemas.microsoft.com/office/drawing/2016/5/11/chartex" xmlns:cx6="http://schemas.microsoft.com/office/drawing/2016/5/12/chartex" xmlns:cx7="http://schemas.microsoft.com/office/drawing/2016/5/13/chartex" xmlns:cx8="http://schemas.microsoft.com/office/drawing/2016/5/14/chartex" xmlns:mc="http://schemas.openxmlformats.org/markup-compatibility/2006" xmlns:m="http://schemas.openxmlformats.org/officeDocument/2006/math" xmlns:aink="http://schemas.microsoft.com/office/drawing/2016/ink" xmlns:am3d="http://schemas.microsoft.com/office/drawing/2017/model3d" xmlns:oel="http://schemas.microsoft.com/office/2019/extlst" xmlns:r="http://schemas.openxmlformats.org/officeDocument/2006/relationships" xmlns:wp14="http://schemas.microsoft.com/office/word/2010/wordprocessingDrawing" xmlns:wp="http://schemas.openxmlformats.org/drawingml/2006/wordprocessingDrawing" xmlns:wpg="http://schemas.microsoft.com/office/word/2010/wordprocessingGroup" xmlns:wpi="http://schemas.microsoft.com/office/word/2010/wordprocessingInk" xmlns:wps="http://schemas.microsoft.com/office/word/2010/wordprocessingShape" xmlns:o="urn:schemas-microsoft-com:office:office" xmlns:v="urn:schemas-microsoft-com:vml" xmlns:w10="urn:schemas-microsoft-com:office:word" xmlns:w="http://schemas.openxmlformats.org/wordprocessingml/2006/main" xmlns:w14="http://schemas.microsoft.com/office/word/2010/wordml" xmlns:w15="http://schemas.microsoft.com/office/word/2012/wordml" xmlns:w16cex="http://schemas.microsoft.com/office/word/2018/wordml/cex" xmlns:w16cid="http://schemas.microsoft.com/office/word/2016/wordml/cid" xmlns:w16="http://schemas.microsoft.com/office/word/2018/wordml" xmlns:w16sdtdh="http://schemas.microsoft.com/office/word/2020/wordml/sdtdatahash" xmlns:w16sdtfl="http://schemas.microsoft.com/office/word/2024/wordml/sdtformatlock" xmlns:w16se="http://schemas.microsoft.com/office/word/2015/wordml/symex" xmlns:w16du="http://schemas.microsoft.com/office/word/2023/wordml/word16du" xmlns:wne="http://schemas.microsoft.com/office/word/2006/wordml" mc:Ignorable="w14 w15 w16se w16cid w16 w16cex w16sdtdh w16sdtfl w16du wp14">
-  <w:endnote w:type="separator" w:id="-1">
+<file path=word/footnotes.xml><?xml version="1.0" encoding="utf-8"?>
+<w:footnotes xmlns:o="urn:schemas-microsoft-com:office:office" xmlns:r="http://schemas.openxmlformats.org/officeDocument/2006/relationships" xmlns:v="urn:schemas-microsoft-com:vml" xmlns:w="http://schemas.openxmlformats.org/wordprocessingml/2006/main" xmlns:w10="urn:schemas-microsoft-com:office:word" xmlns:wp="http://schemas.openxmlformats.org/drawingml/2006/wordprocessingDrawing" xmlns:pic="http://schemas.openxmlformats.org/drawingml/2006/picture" xmlns:wps="http://schemas.microsoft.com/office/word/2010/wordprocessingShape" xmlns:wpg="http://schemas.microsoft.com/office/word/2010/wordprocessingGroup" xmlns:mc="http://schemas.openxmlformats.org/markup-compatibility/2006" xmlns:wp14="http://schemas.microsoft.com/office/word/2010/wordprocessingDrawing" xmlns:w14="http://schemas.microsoft.com/office/word/2010/wordml" xmlns:w15="http://schemas.microsoft.com/office/word/2012/wordml" mc:Ignorable="w14 wp14 w15">
+  <w:footnote w:id="0" w:type="separator">
     <w:p>
       <w:r>
         <w:separator/>
       </w:r>
     </w:p>
-  </w:endnote>
-  <w:endnote w:type="continuationSeparator" w:id="0">
+  </w:footnote>
+  <w:footnote w:id="1" w:type="continuationSeparator">
     <w:p>
       <w:r>
         <w:continuationSeparator/>
       </w:r>
     </w:p>
-  </w:endnote>
-</w:endnotes>
-</file>
-
-<file path=word/footnotes.xml><?xml version="1.0" encoding="utf-8"?>
-<w:footnotes xmlns:wpc="http://schemas.microsoft.com/office/word/2010/wordprocessingCanvas" xmlns:cx="http://schemas.microsoft.com/office/drawing/2014/chartex" xmlns:cx1="http://schemas.microsoft.com/office/drawing/2015/9/8/chartex" xmlns:cx2="http://schemas.microsoft.com/office/drawing/2015/10/21/chartex" xmlns:cx3="http://schemas.microsoft.com/office/drawing/2016/5/9/chartex" xmlns:cx4="http://schemas.microsoft.com/office/drawing/2016/5/10/chartex" xmlns:cx5="http://schemas.microsoft.com/office/drawing/2016/5/11/chartex" xmlns:cx6="http://schemas.microsoft.com/office/drawing/2016/5/12/chartex" xmlns:cx7="http://schemas.microsoft.com/office/drawing/2016/5/13/chartex" xmlns:cx8="http://schemas.microsoft.com/office/drawing/2016/5/14/chartex" xmlns:mc="http://schemas.openxmlformats.org/markup-compatibility/2006" xmlns:m="http://schemas.openxmlformats.org/officeDocument/2006/math" xmlns:aink="http://schemas.microsoft.com/office/drawing/2016/ink" xmlns:am3d="http://schemas.microsoft.com/office/drawing/2017/model3d" xmlns:oel="http://schemas.microsoft.com/office/2019/extlst" xmlns:r="http://schemas.openxmlformats.org/officeDocument/2006/relationships" xmlns:wp14="http://schemas.microsoft.com/office/word/2010/wordprocessingDrawing" xmlns:wp="http://schemas.openxmlformats.org/drawingml/2006/wordprocessingDrawing" xmlns:wpg="http://schemas.microsoft.com/office/word/2010/wordprocessingGroup" xmlns:wpi="http://schemas.microsoft.com/office/word/2010/wordprocessingInk" xmlns:wps="http://schemas.microsoft.com/office/word/2010/wordprocessingShape" xmlns:o="urn:schemas-microsoft-com:office:office" xmlns:v="urn:schemas-microsoft-com:vml" xmlns:w10="urn:schemas-microsoft-com:office:word" xmlns:w="http://schemas.openxmlformats.org/wordprocessingml/2006/main" xmlns:w14="http://schemas.microsoft.com/office/word/2010/wordml" xmlns:w15="http://schemas.microsoft.com/office/word/2012/wordml" xmlns:w16cex="http://schemas.microsoft.com/office/word/2018/wordml/cex" xmlns:w16cid="http://schemas.microsoft.com/office/word/2016/wordml/cid" xmlns:w16="http://schemas.microsoft.com/office/word/2018/wordml" xmlns:w16sdtdh="http://schemas.microsoft.com/office/word/2020/wordml/sdtdatahash" xmlns:w16sdtfl="http://schemas.microsoft.com/office/word/2024/wordml/sdtformatlock" xmlns:w16se="http://schemas.microsoft.com/office/word/2015/wordml/symex" xmlns:w16du="http://schemas.microsoft.com/office/word/2023/wordml/word16du" xmlns:wne="http://schemas.microsoft.com/office/word/2006/wordml" mc:Ignorable="w14 w15 w16se w16cid w16 w16cex w16sdtdh w16sdtfl w16du wp14">
-  <w:footnote w:type="separator" w:id="-1">
-    <w:p>
-      <w:r>
-        <w:separator/>
-      </w:r>
-    </w:p>
   </w:footnote>
-  <w:footnote w:type="continuationSeparator" w:id="0">
-    <w:p>
-      <w:r>
-        <w:continuationSeparator/>
-      </w:r>
-    </w:p>
-  </w:footnote>
-  <w:footnote w:id="1">
+  <w:footnote w:id="2">
     <w:p>
       <w:pPr>
         <w:pStyle w:val="FootnoteText"/>
@@ -2907,6 +2806,7 @@
         <w:footnoteRef/>
       </w:r>
       <w:r>
+        <w:rPr/>
         <w:t xml:space="preserve"> </w:t>
       </w:r>
       <w:r>
@@ -2932,42 +2832,45 @@
     <w:p>
       <w:pPr>
         <w:pStyle w:val="FootnoteText"/>
-        <w:ind w:firstLine="0"/>
+        <w:ind w:hanging="0"/>
         <w:rPr>
           <w:lang w:val="en-AU"/>
         </w:rPr>
       </w:pPr>
+      <w:r>
+        <w:rPr/>
+      </w:r>
     </w:p>
   </w:footnote>
 </w:footnotes>
 </file>
 
 <file path=word/styles.xml><?xml version="1.0" encoding="utf-8"?>
-<w:styles xmlns:mc="http://schemas.openxmlformats.org/markup-compatibility/2006" xmlns:r="http://schemas.openxmlformats.org/officeDocument/2006/relationships" xmlns:w="http://schemas.openxmlformats.org/wordprocessingml/2006/main" xmlns:w14="http://schemas.microsoft.com/office/word/2010/wordml" xmlns:w15="http://schemas.microsoft.com/office/word/2012/wordml" xmlns:w16cex="http://schemas.microsoft.com/office/word/2018/wordml/cex" xmlns:w16cid="http://schemas.microsoft.com/office/word/2016/wordml/cid" xmlns:w16="http://schemas.microsoft.com/office/word/2018/wordml" xmlns:w16sdtdh="http://schemas.microsoft.com/office/word/2020/wordml/sdtdatahash" xmlns:w16sdtfl="http://schemas.microsoft.com/office/word/2024/wordml/sdtformatlock" xmlns:w16se="http://schemas.microsoft.com/office/word/2015/wordml/symex" xmlns:w16du="http://schemas.microsoft.com/office/word/2023/wordml/word16du" mc:Ignorable="w14 w15 w16se w16cid w16 w16cex w16sdtdh w16sdtfl w16du">
+<w:styles xmlns:w="http://schemas.openxmlformats.org/wordprocessingml/2006/main" xmlns:w14="http://schemas.microsoft.com/office/word/2010/wordml" xmlns:mc="http://schemas.openxmlformats.org/markup-compatibility/2006" mc:Ignorable="w14">
   <w:docDefaults>
     <w:rPrDefault>
       <w:rPr>
-        <w:rFonts w:ascii="Times New Roman" w:eastAsia="Times New Roman" w:hAnsi="Times New Roman" w:cs="Times New Roman"/>
+        <w:rFonts w:ascii="Times New Roman" w:hAnsi="Times New Roman" w:eastAsia="Times New Roman" w:cs="Times New Roman"/>
         <w:lang w:val="en-US" w:eastAsia="en-US" w:bidi="ar-SA"/>
       </w:rPr>
     </w:rPrDefault>
     <w:pPrDefault>
       <w:pPr>
-        <w:suppressAutoHyphens/>
+        <w:suppressAutoHyphens w:val="true"/>
       </w:pPr>
     </w:pPrDefault>
   </w:docDefaults>
   <w:latentStyles w:defLockedState="0" w:defUIPriority="99" w:defSemiHidden="0" w:defUnhideWhenUsed="0" w:defQFormat="0" w:count="376">
     <w:lsdException w:name="Normal" w:uiPriority="0" w:qFormat="1"/>
     <w:lsdException w:name="heading 1" w:uiPriority="9" w:qFormat="1"/>
-    <w:lsdException w:name="heading 2" w:semiHidden="1" w:uiPriority="9" w:unhideWhenUsed="1" w:qFormat="1"/>
-    <w:lsdException w:name="heading 3" w:semiHidden="1" w:uiPriority="9" w:unhideWhenUsed="1" w:qFormat="1"/>
-    <w:lsdException w:name="heading 4" w:semiHidden="1" w:uiPriority="9" w:unhideWhenUsed="1" w:qFormat="1"/>
-    <w:lsdException w:name="heading 5" w:semiHidden="1" w:uiPriority="9" w:unhideWhenUsed="1" w:qFormat="1"/>
-    <w:lsdException w:name="heading 6" w:semiHidden="1" w:uiPriority="9" w:unhideWhenUsed="1" w:qFormat="1"/>
-    <w:lsdException w:name="heading 7" w:semiHidden="1" w:uiPriority="9" w:unhideWhenUsed="1" w:qFormat="1"/>
-    <w:lsdException w:name="heading 8" w:semiHidden="1" w:uiPriority="9" w:unhideWhenUsed="1" w:qFormat="1"/>
-    <w:lsdException w:name="heading 9" w:semiHidden="1" w:uiPriority="9" w:unhideWhenUsed="1" w:qFormat="1"/>
+    <w:lsdException w:name="heading 2" w:uiPriority="9" w:semiHidden="1" w:unhideWhenUsed="1" w:qFormat="1"/>
+    <w:lsdException w:name="heading 3" w:uiPriority="9" w:semiHidden="1" w:unhideWhenUsed="1" w:qFormat="1"/>
+    <w:lsdException w:name="heading 4" w:uiPriority="9" w:semiHidden="1" w:unhideWhenUsed="1" w:qFormat="1"/>
+    <w:lsdException w:name="heading 5" w:uiPriority="9" w:semiHidden="1" w:unhideWhenUsed="1" w:qFormat="1"/>
+    <w:lsdException w:name="heading 6" w:uiPriority="9" w:semiHidden="1" w:unhideWhenUsed="1" w:qFormat="1"/>
+    <w:lsdException w:name="heading 7" w:uiPriority="9" w:semiHidden="1" w:unhideWhenUsed="1" w:qFormat="1"/>
+    <w:lsdException w:name="heading 8" w:uiPriority="9" w:semiHidden="1" w:unhideWhenUsed="1" w:qFormat="1"/>
+    <w:lsdException w:name="heading 9" w:uiPriority="9" w:semiHidden="1" w:unhideWhenUsed="1" w:qFormat="1"/>
     <w:lsdException w:name="index 1" w:semiHidden="1" w:unhideWhenUsed="1"/>
     <w:lsdException w:name="index 2" w:semiHidden="1" w:unhideWhenUsed="1"/>
     <w:lsdException w:name="index 3" w:semiHidden="1" w:unhideWhenUsed="1"/>
@@ -2977,22 +2880,22 @@
     <w:lsdException w:name="index 7" w:semiHidden="1" w:unhideWhenUsed="1"/>
     <w:lsdException w:name="index 8" w:semiHidden="1" w:unhideWhenUsed="1"/>
     <w:lsdException w:name="index 9" w:semiHidden="1" w:unhideWhenUsed="1"/>
-    <w:lsdException w:name="toc 1" w:semiHidden="1" w:uiPriority="39" w:unhideWhenUsed="1"/>
-    <w:lsdException w:name="toc 2" w:semiHidden="1" w:uiPriority="39" w:unhideWhenUsed="1"/>
-    <w:lsdException w:name="toc 3" w:semiHidden="1" w:uiPriority="39" w:unhideWhenUsed="1"/>
-    <w:lsdException w:name="toc 4" w:semiHidden="1" w:uiPriority="39" w:unhideWhenUsed="1"/>
-    <w:lsdException w:name="toc 5" w:semiHidden="1" w:uiPriority="39" w:unhideWhenUsed="1"/>
-    <w:lsdException w:name="toc 6" w:semiHidden="1" w:uiPriority="39" w:unhideWhenUsed="1"/>
-    <w:lsdException w:name="toc 7" w:semiHidden="1" w:uiPriority="39" w:unhideWhenUsed="1"/>
-    <w:lsdException w:name="toc 8" w:semiHidden="1" w:uiPriority="39" w:unhideWhenUsed="1"/>
-    <w:lsdException w:name="toc 9" w:semiHidden="1" w:uiPriority="39" w:unhideWhenUsed="1"/>
+    <w:lsdException w:name="toc 1" w:uiPriority="39" w:semiHidden="1" w:unhideWhenUsed="1"/>
+    <w:lsdException w:name="toc 2" w:uiPriority="39" w:semiHidden="1" w:unhideWhenUsed="1"/>
+    <w:lsdException w:name="toc 3" w:uiPriority="39" w:semiHidden="1" w:unhideWhenUsed="1"/>
+    <w:lsdException w:name="toc 4" w:uiPriority="39" w:semiHidden="1" w:unhideWhenUsed="1"/>
+    <w:lsdException w:name="toc 5" w:uiPriority="39" w:semiHidden="1" w:unhideWhenUsed="1"/>
+    <w:lsdException w:name="toc 6" w:uiPriority="39" w:semiHidden="1" w:unhideWhenUsed="1"/>
+    <w:lsdException w:name="toc 7" w:uiPriority="39" w:semiHidden="1" w:unhideWhenUsed="1"/>
+    <w:lsdException w:name="toc 8" w:uiPriority="39" w:semiHidden="1" w:unhideWhenUsed="1"/>
+    <w:lsdException w:name="toc 9" w:uiPriority="39" w:semiHidden="1" w:unhideWhenUsed="1"/>
     <w:lsdException w:name="Normal Indent" w:semiHidden="1" w:unhideWhenUsed="1"/>
     <w:lsdException w:name="footnote text" w:semiHidden="1" w:unhideWhenUsed="1"/>
     <w:lsdException w:name="annotation text" w:semiHidden="1" w:unhideWhenUsed="1"/>
     <w:lsdException w:name="header" w:semiHidden="1" w:unhideWhenUsed="1"/>
     <w:lsdException w:name="footer" w:semiHidden="1" w:unhideWhenUsed="1"/>
     <w:lsdException w:name="index heading" w:semiHidden="1" w:unhideWhenUsed="1"/>
-    <w:lsdException w:name="caption" w:semiHidden="1" w:uiPriority="35" w:unhideWhenUsed="1" w:qFormat="1"/>
+    <w:lsdException w:name="caption" w:uiPriority="35" w:semiHidden="1" w:unhideWhenUsed="1" w:qFormat="1"/>
     <w:lsdException w:name="table of figures" w:semiHidden="1" w:unhideWhenUsed="1"/>
     <w:lsdException w:name="envelope address" w:semiHidden="1" w:unhideWhenUsed="1"/>
     <w:lsdException w:name="envelope return" w:semiHidden="1" w:unhideWhenUsed="1"/>
@@ -3023,7 +2926,7 @@
     <w:lsdException w:name="Title" w:uiPriority="10" w:qFormat="1"/>
     <w:lsdException w:name="Closing" w:semiHidden="1" w:unhideWhenUsed="1"/>
     <w:lsdException w:name="Signature" w:semiHidden="1" w:unhideWhenUsed="1"/>
-    <w:lsdException w:name="Default Paragraph Font" w:semiHidden="1" w:uiPriority="1" w:unhideWhenUsed="1"/>
+    <w:lsdException w:name="Default Paragraph Font" w:uiPriority="1" w:semiHidden="1" w:unhideWhenUsed="1"/>
     <w:lsdException w:name="Body Text" w:semiHidden="1" w:unhideWhenUsed="1"/>
     <w:lsdException w:name="Body Text Indent" w:semiHidden="1" w:unhideWhenUsed="1"/>
     <w:lsdException w:name="List Continue" w:semiHidden="1" w:unhideWhenUsed="1"/>
@@ -3223,8 +3126,8 @@
     <w:lsdException w:name="Subtle Reference" w:uiPriority="31" w:qFormat="1"/>
     <w:lsdException w:name="Intense Reference" w:uiPriority="32" w:qFormat="1"/>
     <w:lsdException w:name="Book Title" w:uiPriority="33" w:qFormat="1"/>
-    <w:lsdException w:name="Bibliography" w:semiHidden="1" w:uiPriority="37" w:unhideWhenUsed="1"/>
-    <w:lsdException w:name="TOC Heading" w:semiHidden="1" w:uiPriority="39" w:unhideWhenUsed="1" w:qFormat="1"/>
+    <w:lsdException w:name="Bibliography" w:uiPriority="37" w:semiHidden="1" w:unhideWhenUsed="1"/>
+    <w:lsdException w:name="TOC Heading" w:uiPriority="39" w:semiHidden="1" w:unhideWhenUsed="1" w:qFormat="1"/>
     <w:lsdException w:name="Grid Table 4" w:uiPriority="49"/>
     <w:lsdException w:name="Grid Table 5 Dark" w:uiPriority="50"/>
     <w:lsdException w:name="Grid Table 6 Colorful" w:uiPriority="51"/>
@@ -3326,24 +3229,35 @@
     <w:lsdException w:name="Unresolved Mention" w:semiHidden="1" w:unhideWhenUsed="1"/>
     <w:lsdException w:name="Smart Link" w:semiHidden="1" w:unhideWhenUsed="1"/>
   </w:latentStyles>
-  <w:style w:type="paragraph" w:default="1" w:styleId="Normal">
+  <w:style w:type="paragraph" w:styleId="Normal" w:default="1">
     <w:name w:val="Normal"/>
     <w:qFormat/>
-    <w:rsid w:val="007A5360"/>
+    <w:rsid w:val="007a5360"/>
     <w:pPr>
-      <w:widowControl w:val="0"/>
+      <w:widowControl w:val="false"/>
+      <w:suppressAutoHyphens w:val="true"/>
+      <w:bidi w:val="0"/>
+      <w:spacing w:before="0" w:after="0"/>
       <w:ind w:firstLine="230"/>
       <w:jc w:val="both"/>
     </w:pPr>
+    <w:rPr>
+      <w:rFonts w:ascii="Times New Roman" w:hAnsi="Times New Roman" w:eastAsia="Times New Roman" w:cs="Times New Roman"/>
+      <w:color w:val="auto"/>
+      <w:kern w:val="0"/>
+      <w:sz w:val="20"/>
+      <w:szCs w:val="20"/>
+      <w:lang w:val="en-US" w:eastAsia="en-US" w:bidi="ar-SA"/>
+    </w:rPr>
   </w:style>
   <w:style w:type="paragraph" w:styleId="Heading1">
     <w:name w:val="heading 1"/>
     <w:basedOn w:val="Normal"/>
     <w:next w:val="Normal"/>
     <w:qFormat/>
-    <w:rsid w:val="007A5360"/>
+    <w:rsid w:val="007a5360"/>
     <w:pPr>
-      <w:keepNext/>
+      <w:keepNext w:val="true"/>
       <w:spacing w:before="240" w:after="60"/>
       <w:outlineLvl w:val="0"/>
     </w:pPr>
@@ -3354,41 +3268,22 @@
       <w:sz w:val="28"/>
     </w:rPr>
   </w:style>
-  <w:style w:type="character" w:default="1" w:styleId="DefaultParagraphFont">
+  <w:style w:type="character" w:styleId="DefaultParagraphFont" w:default="1">
     <w:name w:val="Default Paragraph Font"/>
     <w:uiPriority w:val="1"/>
     <w:semiHidden/>
     <w:unhideWhenUsed/>
-  </w:style>
-  <w:style w:type="table" w:default="1" w:styleId="TableNormal">
-    <w:name w:val="Normal Table"/>
-    <w:uiPriority w:val="99"/>
-    <w:semiHidden/>
-    <w:unhideWhenUsed/>
-    <w:tblPr>
-      <w:tblInd w:w="0" w:type="dxa"/>
-      <w:tblCellMar>
-        <w:top w:w="0" w:type="dxa"/>
-        <w:left w:w="108" w:type="dxa"/>
-        <w:bottom w:w="0" w:type="dxa"/>
-        <w:right w:w="108" w:type="dxa"/>
-      </w:tblCellMar>
-    </w:tblPr>
-  </w:style>
-  <w:style w:type="numbering" w:default="1" w:styleId="NoList">
-    <w:name w:val="No List"/>
-    <w:uiPriority w:val="99"/>
-    <w:semiHidden/>
-    <w:unhideWhenUsed/>
-  </w:style>
-  <w:style w:type="character" w:customStyle="1" w:styleId="BalloonTextChar">
+    <w:qFormat/>
+    <w:rPr/>
+  </w:style>
+  <w:style w:type="character" w:styleId="BalloonTextChar" w:customStyle="1">
     <w:name w:val="Balloon Text Char"/>
     <w:basedOn w:val="DefaultParagraphFont"/>
     <w:link w:val="BalloonText"/>
     <w:uiPriority w:val="99"/>
     <w:semiHidden/>
     <w:qFormat/>
-    <w:rsid w:val="008C5C71"/>
+    <w:rsid w:val="008c5c71"/>
     <w:rPr>
       <w:rFonts w:ascii="Lucida Grande" w:hAnsi="Lucida Grande"/>
       <w:sz w:val="18"/>
@@ -3402,33 +3297,33 @@
     <w:semiHidden/>
     <w:unhideWhenUsed/>
     <w:qFormat/>
-    <w:rsid w:val="008C5C71"/>
+    <w:rsid w:val="008c5c71"/>
     <w:rPr>
       <w:sz w:val="18"/>
       <w:szCs w:val="18"/>
     </w:rPr>
   </w:style>
-  <w:style w:type="character" w:customStyle="1" w:styleId="CommentTextChar">
+  <w:style w:type="character" w:styleId="CommentTextChar" w:customStyle="1">
     <w:name w:val="Comment Text Char"/>
     <w:basedOn w:val="DefaultParagraphFont"/>
     <w:link w:val="CommentText"/>
     <w:uiPriority w:val="99"/>
     <w:semiHidden/>
     <w:qFormat/>
-    <w:rsid w:val="008C5C71"/>
+    <w:rsid w:val="008c5c71"/>
     <w:rPr>
       <w:sz w:val="24"/>
       <w:szCs w:val="24"/>
     </w:rPr>
   </w:style>
-  <w:style w:type="character" w:customStyle="1" w:styleId="CommentSubjectChar">
+  <w:style w:type="character" w:styleId="CommentSubjectChar" w:customStyle="1">
     <w:name w:val="Comment Subject Char"/>
     <w:basedOn w:val="CommentTextChar"/>
-    <w:link w:val="CommentSubject"/>
+    <w:link w:val="annotationsubject"/>
     <w:uiPriority w:val="99"/>
     <w:semiHidden/>
     <w:qFormat/>
-    <w:rsid w:val="008C5C71"/>
+    <w:rsid w:val="008c5c71"/>
     <w:rPr>
       <w:b/>
       <w:bCs/>
@@ -3436,23 +3331,25 @@
       <w:szCs w:val="24"/>
     </w:rPr>
   </w:style>
-  <w:style w:type="character" w:customStyle="1" w:styleId="HeaderChar">
+  <w:style w:type="character" w:styleId="HeaderChar" w:customStyle="1">
     <w:name w:val="Header Char"/>
     <w:basedOn w:val="DefaultParagraphFont"/>
     <w:link w:val="Header"/>
     <w:uiPriority w:val="99"/>
     <w:qFormat/>
     <w:rsid w:val="00982849"/>
-  </w:style>
-  <w:style w:type="character" w:customStyle="1" w:styleId="FooterChar">
+    <w:rPr/>
+  </w:style>
+  <w:style w:type="character" w:styleId="FooterChar" w:customStyle="1">
     <w:name w:val="Footer Char"/>
     <w:basedOn w:val="DefaultParagraphFont"/>
     <w:link w:val="Footer"/>
     <w:uiPriority w:val="99"/>
     <w:qFormat/>
     <w:rsid w:val="00982849"/>
-  </w:style>
-  <w:style w:type="character" w:customStyle="1" w:styleId="FootnoteTextChar">
+    <w:rPr/>
+  </w:style>
+  <w:style w:type="character" w:styleId="FootnoteTextChar" w:customStyle="1">
     <w:name w:val="Footnote Text Char"/>
     <w:basedOn w:val="DefaultParagraphFont"/>
     <w:link w:val="FootnoteText"/>
@@ -3460,9 +3357,10 @@
     <w:semiHidden/>
     <w:qFormat/>
     <w:rsid w:val="00982849"/>
-  </w:style>
-  <w:style w:type="character" w:customStyle="1" w:styleId="FootnoteCharacters">
-    <w:name w:val="Footnote Characters"/>
+    <w:rPr/>
+  </w:style>
+  <w:style w:type="character" w:styleId="FootnoteCharactersuser" w:customStyle="1">
+    <w:name w:val="Footnote Characters (user)"/>
     <w:uiPriority w:val="99"/>
     <w:semiHidden/>
     <w:unhideWhenUsed/>
@@ -3472,8 +3370,8 @@
       <w:vertAlign w:val="superscript"/>
     </w:rPr>
   </w:style>
-  <w:style w:type="character" w:customStyle="1" w:styleId="FootnoteCharactersuser">
-    <w:name w:val="Footnote Characters (user)"/>
+  <w:style w:type="character" w:styleId="FootnoteCharacters" w:customStyle="1">
+    <w:name w:val="Footnote Characters"/>
     <w:qFormat/>
     <w:rPr>
       <w:vertAlign w:val="superscript"/>
@@ -3490,7 +3388,7 @@
     <w:basedOn w:val="DefaultParagraphFont"/>
     <w:uiPriority w:val="67"/>
     <w:qFormat/>
-    <w:rsid w:val="00D3461A"/>
+    <w:rsid w:val="00d3461a"/>
     <w:rPr>
       <w:color w:val="808080"/>
     </w:rPr>
@@ -3500,9 +3398,9 @@
     <w:basedOn w:val="DefaultParagraphFont"/>
     <w:uiPriority w:val="99"/>
     <w:unhideWhenUsed/>
-    <w:rsid w:val="001345D3"/>
+    <w:rsid w:val="001345d3"/>
     <w:rPr>
-      <w:color w:val="0000FF" w:themeColor="hyperlink"/>
+      <w:color w:themeColor="hyperlink" w:val="0000FF"/>
       <w:u w:val="single"/>
     </w:rPr>
   </w:style>
@@ -3513,22 +3411,23 @@
     <w:semiHidden/>
     <w:unhideWhenUsed/>
     <w:qFormat/>
-    <w:rsid w:val="001345D3"/>
+    <w:rsid w:val="001345d3"/>
     <w:rPr>
       <w:color w:val="605E5C"/>
-      <w:shd w:val="clear" w:color="auto" w:fill="E1DFDD"/>
+      <w:shd w:fill="E1DFDD" w:val="clear"/>
     </w:rPr>
   </w:style>
-  <w:style w:type="character" w:customStyle="1" w:styleId="EndnoteCharactersuser">
-    <w:name w:val="Endnote Characters (user)"/>
+  <w:style w:type="character" w:styleId="EndnoteCharacters" w:customStyle="1">
+    <w:name w:val="Endnote Characters"/>
     <w:qFormat/>
     <w:rPr>
       <w:vertAlign w:val="superscript"/>
     </w:rPr>
   </w:style>
-  <w:style w:type="character" w:customStyle="1" w:styleId="EndnoteCharacters">
-    <w:name w:val="Endnote Characters"/>
+  <w:style w:type="character" w:styleId="EndnoteCharactersuser" w:customStyle="1">
+    <w:name w:val="Endnote Characters (user)"/>
     <w:qFormat/>
+    <w:rPr/>
   </w:style>
   <w:style w:type="character" w:styleId="EndnoteReference">
     <w:name w:val="endnote reference"/>
@@ -3536,18 +3435,18 @@
       <w:vertAlign w:val="superscript"/>
     </w:rPr>
   </w:style>
-  <w:style w:type="paragraph" w:customStyle="1" w:styleId="Heading">
+  <w:style w:type="paragraph" w:styleId="Heading" w:customStyle="1">
     <w:name w:val="Heading"/>
     <w:basedOn w:val="Normal"/>
     <w:next w:val="Normal"/>
     <w:qFormat/>
-    <w:rsid w:val="007A5360"/>
+    <w:rsid w:val="007a5360"/>
     <w:pPr>
       <w:tabs>
-        <w:tab w:val="left" w:pos="720"/>
+        <w:tab w:val="left" w:pos="720" w:leader="none"/>
       </w:tabs>
-      <w:spacing w:after="240"/>
-      <w:ind w:firstLine="0"/>
+      <w:spacing w:before="0" w:after="240"/>
+      <w:ind w:hanging="0"/>
     </w:pPr>
     <w:rPr>
       <w:b/>
@@ -3558,12 +3457,14 @@
     <w:name w:val="Body Text"/>
     <w:basedOn w:val="Normal"/>
     <w:pPr>
-      <w:spacing w:after="140" w:line="276" w:lineRule="auto"/>
+      <w:spacing w:lineRule="auto" w:line="276" w:before="0" w:after="140"/>
     </w:pPr>
+    <w:rPr/>
   </w:style>
   <w:style w:type="paragraph" w:styleId="List">
     <w:name w:val="List"/>
     <w:basedOn w:val="BodyText"/>
+    <w:pPr/>
     <w:rPr>
       <w:rFonts w:cs="Noto Sans Devanagari"/>
     </w:rPr>
@@ -3575,19 +3476,19 @@
     <w:uiPriority w:val="35"/>
     <w:unhideWhenUsed/>
     <w:qFormat/>
-    <w:rsid w:val="008A79F3"/>
+    <w:rsid w:val="008a79f3"/>
     <w:pPr>
-      <w:spacing w:after="200"/>
+      <w:spacing w:before="0" w:after="200"/>
     </w:pPr>
     <w:rPr>
       <w:i/>
       <w:iCs/>
-      <w:color w:val="1F497D" w:themeColor="text2"/>
+      <w:color w:themeColor="text2" w:val="1F497D"/>
       <w:sz w:val="18"/>
       <w:szCs w:val="18"/>
     </w:rPr>
   </w:style>
-  <w:style w:type="paragraph" w:customStyle="1" w:styleId="Index">
+  <w:style w:type="paragraph" w:styleId="Index" w:customStyle="1">
     <w:name w:val="Index"/>
     <w:basedOn w:val="Normal"/>
     <w:qFormat/>
@@ -3598,15 +3499,15 @@
       <w:rFonts w:cs="Noto Sans Devanagari"/>
     </w:rPr>
   </w:style>
-  <w:style w:type="paragraph" w:customStyle="1" w:styleId="PaperTitle">
+  <w:style w:type="paragraph" w:styleId="PaperTitle" w:customStyle="1">
     <w:name w:val="Paper Title"/>
     <w:basedOn w:val="Normal"/>
     <w:next w:val="AuthorLine"/>
     <w:qFormat/>
-    <w:rsid w:val="007A5360"/>
+    <w:rsid w:val="007a5360"/>
     <w:pPr>
       <w:spacing w:before="567" w:after="280"/>
-      <w:ind w:firstLine="0"/>
+      <w:ind w:hanging="0"/>
       <w:jc w:val="center"/>
     </w:pPr>
     <w:rPr>
@@ -3614,42 +3515,42 @@
       <w:sz w:val="28"/>
     </w:rPr>
   </w:style>
-  <w:style w:type="paragraph" w:customStyle="1" w:styleId="AuthorLine">
+  <w:style w:type="paragraph" w:styleId="AuthorLine" w:customStyle="1">
     <w:name w:val="Author Line"/>
     <w:basedOn w:val="Normal"/>
     <w:next w:val="InstitutionLine"/>
     <w:qFormat/>
-    <w:rsid w:val="007A5360"/>
+    <w:rsid w:val="007a5360"/>
     <w:pPr>
-      <w:spacing w:after="280"/>
-      <w:ind w:firstLine="0"/>
+      <w:spacing w:before="0" w:after="280"/>
+      <w:ind w:hanging="0"/>
       <w:jc w:val="center"/>
     </w:pPr>
     <w:rPr>
       <w:sz w:val="24"/>
     </w:rPr>
   </w:style>
-  <w:style w:type="paragraph" w:customStyle="1" w:styleId="InstitutionLine">
+  <w:style w:type="paragraph" w:styleId="InstitutionLine" w:customStyle="1">
     <w:name w:val="Institution Line"/>
     <w:basedOn w:val="Normal"/>
     <w:next w:val="AbstractHeading"/>
     <w:qFormat/>
-    <w:rsid w:val="007A5360"/>
+    <w:rsid w:val="007a5360"/>
     <w:pPr>
-      <w:spacing w:after="480"/>
-      <w:ind w:firstLine="0"/>
+      <w:spacing w:before="0" w:after="480"/>
+      <w:ind w:hanging="0"/>
       <w:jc w:val="center"/>
     </w:pPr>
     <w:rPr>
       <w:sz w:val="24"/>
     </w:rPr>
   </w:style>
-  <w:style w:type="paragraph" w:customStyle="1" w:styleId="AbstractHeading">
+  <w:style w:type="paragraph" w:styleId="AbstractHeading" w:customStyle="1">
     <w:name w:val="Abstract Heading"/>
     <w:basedOn w:val="Heading"/>
     <w:next w:val="AbstractText"/>
     <w:qFormat/>
-    <w:rsid w:val="007A5360"/>
+    <w:rsid w:val="007a5360"/>
     <w:pPr>
       <w:jc w:val="center"/>
     </w:pPr>
@@ -3657,57 +3558,60 @@
       <w:sz w:val="22"/>
     </w:rPr>
   </w:style>
-  <w:style w:type="paragraph" w:customStyle="1" w:styleId="AbstractText">
+  <w:style w:type="paragraph" w:styleId="AbstractText" w:customStyle="1">
     <w:name w:val="Abstract Text"/>
     <w:basedOn w:val="Normal"/>
     <w:qFormat/>
-    <w:rsid w:val="007A5360"/>
+    <w:rsid w:val="007a5360"/>
+    <w:pPr/>
     <w:rPr>
       <w:i/>
     </w:rPr>
   </w:style>
-  <w:style w:type="paragraph" w:customStyle="1" w:styleId="Reference">
+  <w:style w:type="paragraph" w:styleId="Reference" w:customStyle="1">
     <w:name w:val="Reference"/>
     <w:basedOn w:val="Normal"/>
     <w:qFormat/>
-    <w:rsid w:val="007A5360"/>
+    <w:rsid w:val="007a5360"/>
     <w:pPr>
-      <w:ind w:left="332" w:hanging="332"/>
+      <w:ind w:hanging="332" w:start="332"/>
     </w:pPr>
     <w:rPr>
       <w:sz w:val="18"/>
     </w:rPr>
   </w:style>
-  <w:style w:type="paragraph" w:customStyle="1" w:styleId="AddressforCorrespondence">
+  <w:style w:type="paragraph" w:styleId="AddressforCorrespondence" w:customStyle="1">
     <w:name w:val="Address for Correspondence"/>
     <w:basedOn w:val="Normal"/>
     <w:qFormat/>
-    <w:rsid w:val="007A5360"/>
+    <w:rsid w:val="007a5360"/>
     <w:pPr>
-      <w:ind w:firstLine="0"/>
+      <w:ind w:hanging="0"/>
     </w:pPr>
     <w:rPr>
       <w:sz w:val="18"/>
       <w:lang w:val="en-GB"/>
     </w:rPr>
   </w:style>
-  <w:style w:type="paragraph" w:customStyle="1" w:styleId="Table">
+  <w:style w:type="paragraph" w:styleId="Table" w:customStyle="1">
     <w:name w:val="Table"/>
     <w:basedOn w:val="Normal"/>
     <w:qFormat/>
-    <w:rsid w:val="007A5360"/>
+    <w:rsid w:val="007a5360"/>
     <w:pPr>
-      <w:ind w:firstLine="0"/>
+      <w:ind w:hanging="0"/>
     </w:pPr>
-  </w:style>
-  <w:style w:type="paragraph" w:customStyle="1" w:styleId="Figure">
+    <w:rPr/>
+  </w:style>
+  <w:style w:type="paragraph" w:styleId="Figure" w:customStyle="1">
     <w:name w:val="Figure"/>
     <w:basedOn w:val="Normal"/>
     <w:qFormat/>
-    <w:rsid w:val="007A5360"/>
+    <w:rsid w:val="007a5360"/>
     <w:pPr>
-      <w:ind w:firstLine="0"/>
+      <w:ind w:hanging="0"/>
     </w:pPr>
+    <w:rPr/>
   </w:style>
   <w:style w:type="paragraph" w:styleId="BalloonText">
     <w:name w:val="Balloon Text"/>
@@ -3717,7 +3621,8 @@
     <w:semiHidden/>
     <w:unhideWhenUsed/>
     <w:qFormat/>
-    <w:rsid w:val="008C5C71"/>
+    <w:rsid w:val="008c5c71"/>
+    <w:pPr/>
     <w:rPr>
       <w:rFonts w:ascii="Lucida Grande" w:hAnsi="Lucida Grande"/>
       <w:sz w:val="18"/>
@@ -3731,13 +3636,14 @@
     <w:uiPriority w:val="99"/>
     <w:semiHidden/>
     <w:unhideWhenUsed/>
-    <w:rsid w:val="008C5C71"/>
+    <w:rsid w:val="008c5c71"/>
+    <w:pPr/>
     <w:rPr>
       <w:sz w:val="24"/>
       <w:szCs w:val="24"/>
     </w:rPr>
   </w:style>
-  <w:style w:type="paragraph" w:styleId="CommentSubject">
+  <w:style w:type="paragraph" w:styleId="annotationsubject">
     <w:name w:val="annotation subject"/>
     <w:basedOn w:val="CommentText"/>
     <w:next w:val="CommentText"/>
@@ -3746,7 +3652,8 @@
     <w:semiHidden/>
     <w:unhideWhenUsed/>
     <w:qFormat/>
-    <w:rsid w:val="008C5C71"/>
+    <w:rsid w:val="008c5c71"/>
+    <w:pPr/>
     <w:rPr>
       <w:b/>
       <w:bCs/>
@@ -3754,10 +3661,12 @@
       <w:szCs w:val="20"/>
     </w:rPr>
   </w:style>
-  <w:style w:type="paragraph" w:customStyle="1" w:styleId="HeaderandFooter">
+  <w:style w:type="paragraph" w:styleId="HeaderandFooter" w:customStyle="1">
     <w:name w:val="Header and Footer"/>
     <w:basedOn w:val="Normal"/>
     <w:qFormat/>
+    <w:pPr/>
+    <w:rPr/>
   </w:style>
   <w:style w:type="paragraph" w:styleId="Header">
     <w:name w:val="header"/>
@@ -3768,10 +3677,12 @@
     <w:rsid w:val="00982849"/>
     <w:pPr>
       <w:tabs>
-        <w:tab w:val="center" w:pos="4513"/>
-        <w:tab w:val="right" w:pos="9026"/>
+        <w:tab w:val="clear" w:pos="720"/>
+        <w:tab w:val="center" w:pos="4513" w:leader="none"/>
+        <w:tab w:val="right" w:pos="9026" w:leader="none"/>
       </w:tabs>
     </w:pPr>
+    <w:rPr/>
   </w:style>
   <w:style w:type="paragraph" w:styleId="Footer">
     <w:name w:val="footer"/>
@@ -3782,10 +3693,12 @@
     <w:rsid w:val="00982849"/>
     <w:pPr>
       <w:tabs>
-        <w:tab w:val="center" w:pos="4513"/>
-        <w:tab w:val="right" w:pos="9026"/>
+        <w:tab w:val="clear" w:pos="720"/>
+        <w:tab w:val="center" w:pos="4513" w:leader="none"/>
+        <w:tab w:val="right" w:pos="9026" w:leader="none"/>
       </w:tabs>
     </w:pPr>
+    <w:rPr/>
   </w:style>
   <w:style w:type="paragraph" w:styleId="FootnoteText">
     <w:name w:val="footnote text"/>
@@ -3795,67 +3708,96 @@
     <w:semiHidden/>
     <w:unhideWhenUsed/>
     <w:rsid w:val="00982849"/>
+    <w:pPr/>
+    <w:rPr/>
   </w:style>
   <w:style w:type="paragraph" w:styleId="ListParagraph">
     <w:name w:val="List Paragraph"/>
     <w:basedOn w:val="Normal"/>
     <w:uiPriority w:val="72"/>
     <w:qFormat/>
-    <w:rsid w:val="00D3461A"/>
+    <w:rsid w:val="00d3461a"/>
     <w:pPr>
-      <w:ind w:left="720"/>
+      <w:spacing w:before="0" w:after="0"/>
+      <w:ind w:start="720"/>
       <w:contextualSpacing/>
     </w:pPr>
-  </w:style>
-  <w:style w:type="paragraph" w:customStyle="1" w:styleId="FrameContents">
+    <w:rPr/>
+  </w:style>
+  <w:style w:type="paragraph" w:styleId="FrameContentsuser" w:customStyle="1">
+    <w:name w:val="Frame Contents (user)"/>
+    <w:basedOn w:val="Normal"/>
+    <w:qFormat/>
+    <w:pPr/>
+    <w:rPr/>
+  </w:style>
+  <w:style w:type="paragraph" w:styleId="FrameContents" w:customStyle="1">
     <w:name w:val="Frame Contents"/>
     <w:basedOn w:val="Normal"/>
     <w:qFormat/>
-  </w:style>
-  <w:style w:type="paragraph" w:customStyle="1" w:styleId="FrameContentsuser">
-    <w:name w:val="Frame Contents (user)"/>
-    <w:basedOn w:val="Normal"/>
+    <w:pPr/>
+    <w:rPr/>
+  </w:style>
+  <w:style w:type="numbering" w:styleId="NoList" w:default="1">
+    <w:name w:val="No List"/>
+    <w:uiPriority w:val="99"/>
+    <w:semiHidden/>
+    <w:unhideWhenUsed/>
     <w:qFormat/>
+  </w:style>
+  <w:style w:type="table" w:default="1" w:styleId="TableNormal">
+    <w:name w:val="Normal Table"/>
+    <w:uiPriority w:val="99"/>
+    <w:semiHidden/>
+    <w:unhideWhenUsed/>
+    <w:tblPr>
+      <w:tblCellMar>
+        <w:top w:w="0" w:type="dxa"/>
+        <w:left w:w="108" w:type="dxa"/>
+        <w:bottom w:w="0" w:type="dxa"/>
+        <w:right w:w="108" w:type="dxa"/>
+      </w:tblCellMar>
+    </w:tblPr>
   </w:style>
 </w:styles>
 </file>
 
 <file path=word/theme/theme1.xml><?xml version="1.0" encoding="utf-8"?>
-<a:theme xmlns:a="http://schemas.openxmlformats.org/drawingml/2006/main" name="Office Theme">
+<a:theme xmlns:a="http://schemas.openxmlformats.org/drawingml/2006/main" xmlns:r="http://schemas.openxmlformats.org/officeDocument/2006/relationships" name="Office Theme">
   <a:themeElements>
     <a:clrScheme name="Office">
       <a:dk1>
         <a:srgbClr val="000000"/>
       </a:dk1>
       <a:lt1>
-        <a:srgbClr val="FFFFFF"/>
+        <a:srgbClr val="ffffff"/>
       </a:lt1>
       <a:dk2>
-        <a:srgbClr val="1F497D"/>
+        <a:srgbClr val="1f497d"/>
       </a:dk2>
       <a:lt2>
-        <a:srgbClr val="EEECE1"/>
+        <a:srgbClr val="eeece1"/>
       </a:lt2>
       <a:accent1>
-        <a:srgbClr val="4F81BD"/>
+        <a:srgbClr val="4f81bd"/>
       </a:accent1>
       <a:accent2>
-        <a:srgbClr val="C0504D"/>
+        <a:srgbClr val="c0504d"/>
       </a:accent2>
       <a:accent3>
-        <a:srgbClr val="9BBB59"/>
+        <a:srgbClr val="9bbb59"/>
       </a:accent3>
       <a:accent4>
-        <a:srgbClr val="8064A2"/>
+        <a:srgbClr val="8064a2"/>
       </a:accent4>
       <a:accent5>
-        <a:srgbClr val="4BACC6"/>
+        <a:srgbClr val="4bacc6"/>
       </a:accent5>
       <a:accent6>
-        <a:srgbClr val="F79646"/>
+        <a:srgbClr val="f79646"/>
       </a:accent6>
       <a:hlink>
-        <a:srgbClr val="0000FF"/>
+        <a:srgbClr val="0000ff"/>
       </a:hlink>
       <a:folHlink>
         <a:srgbClr val="800080"/>
@@ -3863,12 +3805,12 @@
     </a:clrScheme>
     <a:fontScheme name="Office">
       <a:majorFont>
-        <a:latin typeface="Calibri"/>
+        <a:latin typeface="Calibri" pitchFamily="0" charset="1"/>
         <a:ea typeface=""/>
         <a:cs typeface=""/>
       </a:majorFont>
       <a:minorFont>
-        <a:latin typeface="Cambria"/>
+        <a:latin typeface="Cambria" pitchFamily="0" charset="1"/>
         <a:ea typeface=""/>
         <a:cs typeface=""/>
       </a:minorFont>
@@ -3897,7 +3839,7 @@
             </a:gs>
           </a:gsLst>
           <a:lin ang="16200000" scaled="1"/>
-          <a:tileRect/>
+          <a:tileRect l="0" t="0" r="0" b="0"/>
         </a:gradFill>
         <a:gradFill>
           <a:gsLst>
@@ -3915,7 +3857,7 @@
             </a:gs>
           </a:gsLst>
           <a:lin ang="16200000" scaled="0"/>
-          <a:tileRect/>
+          <a:tileRect l="0" t="0" r="0" b="0"/>
         </a:gradFill>
       </a:fillStyleLst>
       <a:lnStyleLst>
@@ -3966,7 +3908,7 @@
           <a:path path="circle">
             <a:fillToRect l="50000" t="-80000" r="50000" b="180000"/>
           </a:path>
-          <a:tileRect/>
+          <a:tileRect l="0" t="0" r="0" b="0"/>
         </a:gradFill>
         <a:gradFill>
           <a:gsLst>
@@ -3984,13 +3926,11 @@
           <a:path path="circle">
             <a:fillToRect l="50000" t="50000" r="50000" b="50000"/>
           </a:path>
-          <a:tileRect/>
+          <a:tileRect l="0" t="0" r="0" b="0"/>
         </a:gradFill>
       </a:bgFillStyleLst>
     </a:fmtScheme>
   </a:themeElements>
-  <a:objectDefaults/>
-  <a:extraClrSchemeLst/>
 </a:theme>
 </file>
 

</xml_diff>